<commit_message>
H1A and H1B complete
Removed site random effect
</commit_message>
<xml_diff>
--- a/MA_Report.docx
+++ b/MA_Report.docx
@@ -7,77 +7,258 @@
         <w:pStyle w:val="Title"/>
       </w:pPr>
       <w:r>
-        <w:t xml:space="preserve">NHTSA</w:t>
+        <w:t xml:space="preserve">Meta-Analysis</w:t>
       </w:r>
       <w:r>
         <w:t xml:space="preserve"> </w:t>
       </w:r>
       <w:r>
-        <w:t xml:space="preserve">DSFS</w:t>
+        <w:t xml:space="preserve">of</w:t>
       </w:r>
       <w:r>
         <w:t xml:space="preserve"> </w:t>
       </w:r>
       <w:r>
-        <w:t xml:space="preserve">Meta-Analysis</w:t>
+        <w:t xml:space="preserve">Effectiveness</w:t>
+      </w:r>
+      <w:r>
+        <w:t xml:space="preserve"> </w:t>
+      </w:r>
+      <w:r>
+        <w:t xml:space="preserve">of</w:t>
+      </w:r>
+      <w:r>
+        <w:t xml:space="preserve"> </w:t>
+      </w:r>
+      <w:r>
+        <w:t xml:space="preserve">Dynamic</w:t>
+      </w:r>
+      <w:r>
+        <w:t xml:space="preserve"> </w:t>
+      </w:r>
+      <w:r>
+        <w:t xml:space="preserve">Speed</w:t>
+      </w:r>
+      <w:r>
+        <w:t xml:space="preserve"> </w:t>
+      </w:r>
+      <w:r>
+        <w:t xml:space="preserve">Feedback</w:t>
+      </w:r>
+      <w:r>
+        <w:t xml:space="preserve"> </w:t>
+      </w:r>
+      <w:r>
+        <w:t xml:space="preserve">Signs</w:t>
       </w:r>
     </w:p>
     <w:p>
       <w:pPr>
-        <w:pStyle w:val="Author"/>
-      </w:pPr>
-      <w:r>
-        <w:t xml:space="preserve">Dan</w:t>
+        <w:pStyle w:val="Subtitle"/>
+      </w:pPr>
+      <w:r>
+        <w:t xml:space="preserve">Daniel</w:t>
       </w:r>
       <w:r>
         <w:t xml:space="preserve"> </w:t>
       </w:r>
       <w:r>
-        <w:t xml:space="preserve">Flynn</w:t>
+        <w:t xml:space="preserve">Flynn,</w:t>
+      </w:r>
+      <w:r>
+        <w:t xml:space="preserve"> </w:t>
+      </w:r>
+      <w:r>
+        <w:t xml:space="preserve">Andrew</w:t>
+      </w:r>
+      <w:r>
+        <w:t xml:space="preserve"> </w:t>
+      </w:r>
+      <w:r>
+        <w:t xml:space="preserve">Breck,</w:t>
+      </w:r>
+      <w:r>
+        <w:t xml:space="preserve"> </w:t>
+      </w:r>
+      <w:r>
+        <w:t xml:space="preserve">Olivia</w:t>
+      </w:r>
+      <w:r>
+        <w:t xml:space="preserve"> </w:t>
+      </w:r>
+      <w:r>
+        <w:t xml:space="preserve">Gillham,</w:t>
+      </w:r>
+      <w:r>
+        <w:t xml:space="preserve"> </w:t>
+      </w:r>
+      <w:r>
+        <w:t xml:space="preserve">Donald</w:t>
+      </w:r>
+      <w:r>
+        <w:t xml:space="preserve"> </w:t>
+      </w:r>
+      <w:r>
+        <w:t xml:space="preserve">L.</w:t>
+      </w:r>
+      <w:r>
+        <w:t xml:space="preserve"> </w:t>
+      </w:r>
+      <w:r>
+        <w:t xml:space="preserve">Fisher</w:t>
       </w:r>
     </w:p>
     <w:p>
       <w:pPr>
-        <w:pStyle w:val="Heading1"/>
-      </w:pPr>
-      <w:bookmarkStart w:id="21" w:name="introduction"/>
-      <w:bookmarkEnd w:id="21"/>
-      <w:r>
-        <w:t xml:space="preserve">Introduction</w:t>
+        <w:pStyle w:val="Author"/>
+      </w:pPr>
+      <w:r>
+        <w:t xml:space="preserve">April</w:t>
+      </w:r>
+      <w:r>
+        <w:t xml:space="preserve"> </w:t>
+      </w:r>
+      <w:r>
+        <w:t xml:space="preserve">2017</w:t>
       </w:r>
     </w:p>
     <w:p>
       <w:pPr>
-        <w:pStyle w:val="FirstParagraph"/>
-      </w:pPr>
-      <w:r>
-        <w:t xml:space="preserve">Traffic safety engineers and transportation planners have a high interest in the efficacy of different approaches to reducing driver speeds on critical roadway segments. One of these approaches, in particular monitoring traffic speeds in conjunction with installation of Dynamic Speed Feedback Signs (DSFS), has recently been targeted by the Governors' Highway Safety Association (GHSA). An ongoing review by the Volpe National Transportation Systems Center (Volpe) of the studies conducted to investigate DSFS indicates that the studies have employed similar enough designs and are sufficiently numerous that a meta-analysis to quantitatively summarize the results can be carried out.</w:t>
-      </w:r>
+        <w:pStyle w:val="Date"/>
+      </w:pPr>
+      <w:r>
+        <w:t xml:space="preserve">Volpe</w:t>
+      </w:r>
+      <w:r>
+        <w:t xml:space="preserve"> </w:t>
+      </w:r>
+      <w:r>
+        <w:t xml:space="preserve">National</w:t>
+      </w:r>
+      <w:r>
+        <w:t xml:space="preserve"> </w:t>
+      </w:r>
+      <w:r>
+        <w:t xml:space="preserve">Transportation</w:t>
+      </w:r>
+      <w:r>
+        <w:t xml:space="preserve"> </w:t>
+      </w:r>
+      <w:r>
+        <w:t xml:space="preserve">Systems</w:t>
+      </w:r>
+      <w:r>
+        <w:t xml:space="preserve"> </w:t>
+      </w:r>
+      <w:r>
+        <w:t xml:space="preserve">Center,</w:t>
+      </w:r>
+      <w:r>
+        <w:t xml:space="preserve"> </w:t>
+      </w:r>
+      <w:r>
+        <w:t xml:space="preserve">55</w:t>
+      </w:r>
+      <w:r>
+        <w:t xml:space="preserve"> </w:t>
+      </w:r>
+      <w:r>
+        <w:t xml:space="preserve">Broadway,</w:t>
+      </w:r>
+      <w:r>
+        <w:t xml:space="preserve"> </w:t>
+      </w:r>
+      <w:r>
+        <w:t xml:space="preserve">Cambridge,</w:t>
+      </w:r>
+      <w:r>
+        <w:t xml:space="preserve"> </w:t>
+      </w:r>
+      <w:r>
+        <w:t xml:space="preserve">MA</w:t>
+      </w:r>
+      <w:r>
+        <w:t xml:space="preserve"> </w:t>
+      </w:r>
+      <w:r>
+        <w:t xml:space="preserve">02114</w:t>
+      </w:r>
+    </w:p>
+    <w:sdt>
+      <w:sdtPr>
+        <w:docPartObj>
+          <w:docPartGallery w:val="Table of Contents"/>
+          <w:docPartUnique/>
+        </w:docPartObj>
+      </w:sdtPr>
+      <w:sdtContent>
+        <w:p>
+          <w:pPr>
+            <w:pStyle w:val="TOCHeading"/>
+          </w:pPr>
+          <w:r>
+            <w:t xml:space="preserve">Table of Contents</w:t>
+          </w:r>
+        </w:p>
+        <w:p>
+          <w:r>
+            <w:fldChar w:fldCharType="begin" w:dirty="true"/>
+            <w:instrText xml:space="preserve">TOC \o "1-3" \h \z \u</w:instrText>
+            <w:fldChar w:fldCharType="separate"/>
+            <w:fldChar w:fldCharType="end"/>
+          </w:r>
+        </w:p>
+      </w:sdtContent>
+    </w:sdt>
+    <w:p>
+      <w:pPr>
+        <w:pStyle w:val="Heading6"/>
+      </w:pPr>
+      <w:bookmarkStart w:id="21" w:name="section"/>
+      <w:bookmarkEnd w:id="21"/>
     </w:p>
     <w:p>
       <w:pPr>
-        <w:pStyle w:val="BodyText"/>
-      </w:pPr>
-      <w:r>
-        <w:t xml:space="preserve">Meta-analysis is a statistical technique used to draw general conclusions from a set of related studies focused on similar experimental treatments and responses (Glass 1976). Given sufficiently similar study designs, the size of the treatment effects can be pooled to create a meta-data set, which is then analyzed with appropriate weighting based on the variability and size of each study. This meta-analysis aims to provide decision-makers with a quantitative summary of how much vehicle speed is reduced following installation of a DSFS. Factors such as location, timing, vehicle type, posted speed, safety focus, and others are all considered.</w:t>
+        <w:pStyle w:val="Heading1"/>
+      </w:pPr>
+      <w:bookmarkStart w:id="22" w:name="introduction"/>
+      <w:bookmarkEnd w:id="22"/>
+      <w:r>
+        <w:t xml:space="preserve">Introduction</w:t>
       </w:r>
     </w:p>
     <w:p>
       <w:pPr>
-        <w:pStyle w:val="Heading1"/>
-      </w:pPr>
-      <w:bookmarkStart w:id="22" w:name="methods"/>
-      <w:bookmarkEnd w:id="22"/>
-      <w:r>
-        <w:t xml:space="preserve">Methods</w:t>
+        <w:pStyle w:val="FirstParagraph"/>
+      </w:pPr>
+      <w:r>
+        <w:t xml:space="preserve">Traffic safety engineers and transportation planners have a high interest in the efficacy of different approaches to reducing driver speeds on critical roadway segments. One of these approaches, in particular monitoring traffic speeds in conjunction with installation of Dynamic Speed Feedback Signs (DSFS), has recently been targeted by the Governors' Highway Safety Association (GHSA). An ongoing review by the Volpe National Transportation Systems Center (Volpe) of the studies conducted to investigate DSFS indicates that the studies have employed similar enough designs and are sufficiently numerous that a meta-analysis to quantitatively summarize the results can be carried out.</w:t>
       </w:r>
     </w:p>
     <w:p>
       <w:pPr>
+        <w:pStyle w:val="BodyText"/>
+      </w:pPr>
+      <w:r>
+        <w:t xml:space="preserve">Meta-analysis is a statistical technique used to draw general conclusions from a set of related studies focused on similar experimental treatments and responses (Glass 1976). Given sufficiently similar study designs, the size of the treatment effects can be pooled to create a meta-data set, which is then analyzed with appropriate weighting based on the variability and size of each study. This meta-analysis aims to provide decision-makers with a quantitative summary of how much vehicle speed is reduced following installation of a DSFS. Factors such as location, timing, vehicle type, posted speed, safety focus, and others are all considered.</w:t>
+      </w:r>
+    </w:p>
+    <w:p>
+      <w:pPr>
+        <w:pStyle w:val="Heading1"/>
+      </w:pPr>
+      <w:bookmarkStart w:id="23" w:name="methods"/>
+      <w:bookmarkEnd w:id="23"/>
+      <w:r>
+        <w:t xml:space="preserve">Methods</w:t>
+      </w:r>
+    </w:p>
+    <w:p>
+      <w:pPr>
         <w:pStyle w:val="Heading2"/>
       </w:pPr>
-      <w:bookmarkStart w:id="23" w:name="data-collection"/>
-      <w:bookmarkEnd w:id="23"/>
+      <w:bookmarkStart w:id="24" w:name="data-collection"/>
+      <w:bookmarkEnd w:id="24"/>
       <w:r>
         <w:t xml:space="preserve">Data collection</w:t>
       </w:r>
@@ -132,8 +313,8 @@
       <w:pPr>
         <w:pStyle w:val="Heading2"/>
       </w:pPr>
-      <w:bookmarkStart w:id="24" w:name="calculating-effect-size"/>
-      <w:bookmarkEnd w:id="24"/>
+      <w:bookmarkStart w:id="25" w:name="calculating-effect-size"/>
+      <w:bookmarkEnd w:id="25"/>
       <w:r>
         <w:t xml:space="preserve">Calculating Effect Size</w:t>
       </w:r>
@@ -500,332 +681,7 @@
         <w:pStyle w:val="FirstParagraph"/>
       </w:pPr>
       <w:r>
-        <w:t xml:space="preserve">This effect size calculation is also referred to as the standardized mean difference (Hedges and Olkin 1985). The pooled standard deviation is calculated following standard calculations.</w:t>
-      </w:r>
-    </w:p>
-    <w:p>
-      <w:pPr>
-        <w:pStyle w:val="BodyText"/>
-      </w:pPr>
-      <w:r>
-        <w:t xml:space="preserve">For other hypotheses based on the comparison of two groups, such as comparing the effect of DSFS at two locations, adjacent to the DSFS or upstream of the DSFS (Hypothesis H1C, Table 2), the effect size calculation is similar.</w:t>
-      </w:r>
-    </w:p>
-    <w:p>
-      <w:pPr>
-        <w:pStyle w:val="BodyText"/>
-      </w:pPr>
-      <w:r>
-        <w:t xml:space="preserve">Effect sizes based on normalized "true effects" require a slightly modified calculation, where differences in means rather than means themselves are compared. For example, when the activation effect of the DSFS on vehicle speed is normalized for differences during and before installation, at both the site adjacent to the sign and upstream of the sign, the effect size is calculated as follows:</w:t>
-      </w:r>
-    </w:p>
-    <w:p>
-      <w:pPr>
-        <w:pStyle w:val="BodyText"/>
-      </w:pPr>
-      <m:oMathPara>
-        <m:oMathParaPr>
-          <m:jc m:val="center"/>
-        </m:oMathParaPr>
-        <m:oMath>
-          <m:r>
-            <m:t>E</m:t>
-          </m:r>
-          <m:r>
-            <m:t>S</m:t>
-          </m:r>
-          <m:r>
-            <m:t>=</m:t>
-          </m:r>
-          <m:f>
-            <m:fPr>
-              <m:type m:val="bar"/>
-            </m:fPr>
-            <m:num>
-              <m:r>
-                <m:t>(</m:t>
-              </m:r>
-              <m:sSub>
-                <m:e>
-                  <m:bar>
-                    <m:barPr>
-                      <m:pos m:val="top"/>
-                    </m:barPr>
-                    <m:e>
-                      <m:r>
-                        <m:t>X</m:t>
-                      </m:r>
-                    </m:e>
-                  </m:bar>
-                </m:e>
-                <m:sub>
-                  <m:r>
-                    <m:t>A</m:t>
-                  </m:r>
-                  <m:r>
-                    <m:t>d</m:t>
-                  </m:r>
-                  <m:r>
-                    <m:t>j</m:t>
-                  </m:r>
-                  <m:r>
-                    <m:t>a</m:t>
-                  </m:r>
-                  <m:r>
-                    <m:t>c</m:t>
-                  </m:r>
-                  <m:r>
-                    <m:t>e</m:t>
-                  </m:r>
-                  <m:r>
-                    <m:t>n</m:t>
-                  </m:r>
-                  <m:r>
-                    <m:t>t</m:t>
-                  </m:r>
-                  <m:r>
-                    <m:t>D</m:t>
-                  </m:r>
-                  <m:r>
-                    <m:t>S</m:t>
-                  </m:r>
-                  <m:r>
-                    <m:t>F</m:t>
-                  </m:r>
-                  <m:r>
-                    <m:t>S</m:t>
-                  </m:r>
-                </m:sub>
-              </m:sSub>
-              <m:r>
-                <m:t>−</m:t>
-              </m:r>
-              <m:sSub>
-                <m:e>
-                  <m:bar>
-                    <m:barPr>
-                      <m:pos m:val="top"/>
-                    </m:barPr>
-                    <m:e>
-                      <m:r>
-                        <m:t>X</m:t>
-                      </m:r>
-                    </m:e>
-                  </m:bar>
-                </m:e>
-                <m:sub>
-                  <m:r>
-                    <m:t>A</m:t>
-                  </m:r>
-                  <m:r>
-                    <m:t>d</m:t>
-                  </m:r>
-                  <m:r>
-                    <m:t>j</m:t>
-                  </m:r>
-                  <m:r>
-                    <m:t>a</m:t>
-                  </m:r>
-                  <m:r>
-                    <m:t>c</m:t>
-                  </m:r>
-                  <m:r>
-                    <m:t>e</m:t>
-                  </m:r>
-                  <m:r>
-                    <m:t>n</m:t>
-                  </m:r>
-                  <m:r>
-                    <m:t>t</m:t>
-                  </m:r>
-                  <m:r>
-                    <m:t>B</m:t>
-                  </m:r>
-                  <m:r>
-                    <m:t>e</m:t>
-                  </m:r>
-                  <m:r>
-                    <m:t>f</m:t>
-                  </m:r>
-                  <m:r>
-                    <m:t>o</m:t>
-                  </m:r>
-                  <m:r>
-                    <m:t>r</m:t>
-                  </m:r>
-                  <m:r>
-                    <m:t>e</m:t>
-                  </m:r>
-                </m:sub>
-              </m:sSub>
-              <m:r>
-                <m:t>)</m:t>
-              </m:r>
-              <m:r>
-                <m:t>−</m:t>
-              </m:r>
-              <m:r>
-                <m:t>(</m:t>
-              </m:r>
-              <m:sSub>
-                <m:e>
-                  <m:bar>
-                    <m:barPr>
-                      <m:pos m:val="top"/>
-                    </m:barPr>
-                    <m:e>
-                      <m:r>
-                        <m:t>X</m:t>
-                      </m:r>
-                    </m:e>
-                  </m:bar>
-                </m:e>
-                <m:sub>
-                  <m:r>
-                    <m:t>U</m:t>
-                  </m:r>
-                  <m:r>
-                    <m:t>p</m:t>
-                  </m:r>
-                  <m:r>
-                    <m:t>s</m:t>
-                  </m:r>
-                  <m:r>
-                    <m:t>t</m:t>
-                  </m:r>
-                  <m:r>
-                    <m:t>r</m:t>
-                  </m:r>
-                  <m:r>
-                    <m:t>e</m:t>
-                  </m:r>
-                  <m:r>
-                    <m:t>a</m:t>
-                  </m:r>
-                  <m:r>
-                    <m:t>m</m:t>
-                  </m:r>
-                  <m:r>
-                    <m:t>D</m:t>
-                  </m:r>
-                  <m:r>
-                    <m:t>S</m:t>
-                  </m:r>
-                  <m:r>
-                    <m:t>F</m:t>
-                  </m:r>
-                  <m:r>
-                    <m:t>S</m:t>
-                  </m:r>
-                </m:sub>
-              </m:sSub>
-              <m:r>
-                <m:t>−</m:t>
-              </m:r>
-              <m:sSub>
-                <m:e>
-                  <m:bar>
-                    <m:barPr>
-                      <m:pos m:val="top"/>
-                    </m:barPr>
-                    <m:e>
-                      <m:r>
-                        <m:t>X</m:t>
-                      </m:r>
-                    </m:e>
-                  </m:bar>
-                </m:e>
-                <m:sub>
-                  <m:r>
-                    <m:t>U</m:t>
-                  </m:r>
-                  <m:r>
-                    <m:t>p</m:t>
-                  </m:r>
-                  <m:r>
-                    <m:t>s</m:t>
-                  </m:r>
-                  <m:r>
-                    <m:t>t</m:t>
-                  </m:r>
-                  <m:r>
-                    <m:t>r</m:t>
-                  </m:r>
-                  <m:r>
-                    <m:t>e</m:t>
-                  </m:r>
-                  <m:r>
-                    <m:t>a</m:t>
-                  </m:r>
-                  <m:r>
-                    <m:t>m</m:t>
-                  </m:r>
-                  <m:r>
-                    <m:t>B</m:t>
-                  </m:r>
-                  <m:r>
-                    <m:t>e</m:t>
-                  </m:r>
-                  <m:r>
-                    <m:t>f</m:t>
-                  </m:r>
-                  <m:r>
-                    <m:t>o</m:t>
-                  </m:r>
-                  <m:r>
-                    <m:t>r</m:t>
-                  </m:r>
-                  <m:r>
-                    <m:t>e</m:t>
-                  </m:r>
-                </m:sub>
-              </m:sSub>
-              <m:r>
-                <m:t>)</m:t>
-              </m:r>
-            </m:num>
-            <m:den>
-              <m:r>
-                <m:t>S</m:t>
-              </m:r>
-              <m:sSub>
-                <m:e>
-                  <m:r>
-                    <m:t>D</m:t>
-                  </m:r>
-                </m:e>
-                <m:sub>
-                  <m:r>
-                    <m:t>P</m:t>
-                  </m:r>
-                  <m:r>
-                    <m:t>o</m:t>
-                  </m:r>
-                  <m:r>
-                    <m:t>o</m:t>
-                  </m:r>
-                  <m:r>
-                    <m:t>l</m:t>
-                  </m:r>
-                  <m:r>
-                    <m:t>e</m:t>
-                  </m:r>
-                  <m:r>
-                    <m:t>d</m:t>
-                  </m:r>
-                </m:sub>
-              </m:sSub>
-            </m:den>
-          </m:f>
-        </m:oMath>
-      </m:oMathPara>
-    </w:p>
-    <w:p>
-      <w:pPr>
-        <w:pStyle w:val="FirstParagraph"/>
-      </w:pPr>
-      <w:r>
-        <w:t xml:space="preserve">The pooled standard deviation in this case is computed as follows:</w:t>
+        <w:t xml:space="preserve">Where the pooled standard deviation for this calculation is defined as follows:</w:t>
       </w:r>
     </w:p>
     <w:p>
@@ -892,6 +748,653 @@
                     </m:e>
                     <m:sub>
                       <m:r>
+                        <m:t>D</m:t>
+                      </m:r>
+                      <m:r>
+                        <m:t>S</m:t>
+                      </m:r>
+                      <m:r>
+                        <m:t>F</m:t>
+                      </m:r>
+                      <m:r>
+                        <m:t>S</m:t>
+                      </m:r>
+                    </m:sub>
+                  </m:sSub>
+                  <m:r>
+                    <m:t>−</m:t>
+                  </m:r>
+                  <m:r>
+                    <m:t>1</m:t>
+                  </m:r>
+                  <m:r>
+                    <m:t>)</m:t>
+                  </m:r>
+                  <m:r>
+                    <m:t>S</m:t>
+                  </m:r>
+                  <m:sSub>
+                    <m:e>
+                      <m:r>
+                        <m:t>D</m:t>
+                      </m:r>
+                    </m:e>
+                    <m:sub>
+                      <m:r>
+                        <m:t>D</m:t>
+                      </m:r>
+                      <m:r>
+                        <m:t>S</m:t>
+                      </m:r>
+                      <m:r>
+                        <m:t>F</m:t>
+                      </m:r>
+                      <m:r>
+                        <m:t>S</m:t>
+                      </m:r>
+                    </m:sub>
+                  </m:sSub>
+                </m:num>
+                <m:den>
+                  <m:sSub>
+                    <m:e>
+                      <m:r>
+                        <m:t>N</m:t>
+                      </m:r>
+                    </m:e>
+                    <m:sub>
+                      <m:r>
+                        <m:t>D</m:t>
+                      </m:r>
+                      <m:r>
+                        <m:t>S</m:t>
+                      </m:r>
+                      <m:r>
+                        <m:t>F</m:t>
+                      </m:r>
+                      <m:r>
+                        <m:t>S</m:t>
+                      </m:r>
+                    </m:sub>
+                  </m:sSub>
+                  <m:r>
+                    <m:t>+</m:t>
+                  </m:r>
+                  <m:sSub>
+                    <m:e>
+                      <m:r>
+                        <m:t>N</m:t>
+                      </m:r>
+                    </m:e>
+                    <m:sub>
+                      <m:r>
+                        <m:t>B</m:t>
+                      </m:r>
+                      <m:r>
+                        <m:t>e</m:t>
+                      </m:r>
+                      <m:r>
+                        <m:t>f</m:t>
+                      </m:r>
+                      <m:r>
+                        <m:t>o</m:t>
+                      </m:r>
+                      <m:r>
+                        <m:t>r</m:t>
+                      </m:r>
+                      <m:r>
+                        <m:t>e</m:t>
+                      </m:r>
+                    </m:sub>
+                  </m:sSub>
+                  <m:r>
+                    <m:t>−</m:t>
+                  </m:r>
+                  <m:r>
+                    <m:t>2</m:t>
+                  </m:r>
+                </m:den>
+              </m:f>
+              <m:r>
+                <m:t>+</m:t>
+              </m:r>
+              <m:f>
+                <m:fPr>
+                  <m:type m:val="bar"/>
+                </m:fPr>
+                <m:num>
+                  <m:r>
+                    <m:t>(</m:t>
+                  </m:r>
+                  <m:sSub>
+                    <m:e>
+                      <m:r>
+                        <m:t>N</m:t>
+                      </m:r>
+                    </m:e>
+                    <m:sub>
+                      <m:r>
+                        <m:t>B</m:t>
+                      </m:r>
+                      <m:r>
+                        <m:t>e</m:t>
+                      </m:r>
+                      <m:r>
+                        <m:t>f</m:t>
+                      </m:r>
+                      <m:r>
+                        <m:t>o</m:t>
+                      </m:r>
+                      <m:r>
+                        <m:t>r</m:t>
+                      </m:r>
+                      <m:r>
+                        <m:t>e</m:t>
+                      </m:r>
+                    </m:sub>
+                  </m:sSub>
+                  <m:r>
+                    <m:t>−</m:t>
+                  </m:r>
+                  <m:r>
+                    <m:t>1</m:t>
+                  </m:r>
+                  <m:r>
+                    <m:t>)</m:t>
+                  </m:r>
+                  <m:r>
+                    <m:t>S</m:t>
+                  </m:r>
+                  <m:sSub>
+                    <m:e>
+                      <m:r>
+                        <m:t>D</m:t>
+                      </m:r>
+                    </m:e>
+                    <m:sub>
+                      <m:r>
+                        <m:t>B</m:t>
+                      </m:r>
+                      <m:r>
+                        <m:t>e</m:t>
+                      </m:r>
+                      <m:r>
+                        <m:t>f</m:t>
+                      </m:r>
+                      <m:r>
+                        <m:t>o</m:t>
+                      </m:r>
+                      <m:r>
+                        <m:t>r</m:t>
+                      </m:r>
+                      <m:r>
+                        <m:t>e</m:t>
+                      </m:r>
+                    </m:sub>
+                  </m:sSub>
+                </m:num>
+                <m:den>
+                  <m:sSub>
+                    <m:e>
+                      <m:r>
+                        <m:t>N</m:t>
+                      </m:r>
+                    </m:e>
+                    <m:sub>
+                      <m:r>
+                        <m:t>D</m:t>
+                      </m:r>
+                      <m:r>
+                        <m:t>S</m:t>
+                      </m:r>
+                      <m:r>
+                        <m:t>F</m:t>
+                      </m:r>
+                      <m:r>
+                        <m:t>S</m:t>
+                      </m:r>
+                    </m:sub>
+                  </m:sSub>
+                  <m:r>
+                    <m:t>+</m:t>
+                  </m:r>
+                  <m:sSub>
+                    <m:e>
+                      <m:r>
+                        <m:t>N</m:t>
+                      </m:r>
+                    </m:e>
+                    <m:sub>
+                      <m:r>
+                        <m:t>B</m:t>
+                      </m:r>
+                      <m:r>
+                        <m:t>e</m:t>
+                      </m:r>
+                      <m:r>
+                        <m:t>f</m:t>
+                      </m:r>
+                      <m:r>
+                        <m:t>o</m:t>
+                      </m:r>
+                      <m:r>
+                        <m:t>r</m:t>
+                      </m:r>
+                      <m:r>
+                        <m:t>e</m:t>
+                      </m:r>
+                    </m:sub>
+                  </m:sSub>
+                  <m:r>
+                    <m:t>−</m:t>
+                  </m:r>
+                  <m:r>
+                    <m:t>2</m:t>
+                  </m:r>
+                </m:den>
+              </m:f>
+            </m:e>
+          </m:rad>
+        </m:oMath>
+      </m:oMathPara>
+    </w:p>
+    <w:p>
+      <w:pPr>
+        <w:pStyle w:val="FirstParagraph"/>
+      </w:pPr>
+      <w:r>
+        <w:t xml:space="preserve">This effect size calculation is also referred to as the standardized mean difference (Hedges and Olkin 1985). The pooled standard deviation is calculated following standard calculations.</w:t>
+      </w:r>
+    </w:p>
+    <w:p>
+      <w:pPr>
+        <w:pStyle w:val="BodyText"/>
+      </w:pPr>
+      <w:r>
+        <w:t xml:space="preserve">For other hypotheses based on the comparison of two groups, such as comparing the effect of DSFS at two locations, adjacent to the DSFS or upstream of the DSFS (Hypothesis H1C, Table 2), the effect size calculation is similar.</w:t>
+      </w:r>
+    </w:p>
+    <w:p>
+      <w:pPr>
+        <w:pStyle w:val="BodyText"/>
+      </w:pPr>
+      <w:r>
+        <w:t xml:space="preserve">Effect sizes based on normalized "true effects" require a slightly modified calculation, where differences in means rather than means themselves are compared. For example, when the activation effect of the DSFS on vehicle speed is normalized for differences during and before installation, at both the site adjacent to the sign and upstream of the sign, the effect size is calculated as follows:</w:t>
+      </w:r>
+    </w:p>
+    <w:p>
+      <w:pPr>
+        <w:pStyle w:val="BodyText"/>
+      </w:pPr>
+      <m:oMathPara>
+        <m:oMathParaPr>
+          <m:jc m:val="center"/>
+        </m:oMathParaPr>
+        <m:oMath>
+          <m:r>
+            <m:t>E</m:t>
+          </m:r>
+          <m:r>
+            <m:t>S</m:t>
+          </m:r>
+          <m:r>
+            <m:t>=</m:t>
+          </m:r>
+          <m:f>
+            <m:fPr>
+              <m:type m:val="bar"/>
+            </m:fPr>
+            <m:num>
+              <m:r>
+                <m:t>(</m:t>
+              </m:r>
+              <m:sSub>
+                <m:e>
+                  <m:bar>
+                    <m:barPr>
+                      <m:pos m:val="top"/>
+                    </m:barPr>
+                    <m:e>
+                      <m:r>
+                        <m:t>X</m:t>
+                      </m:r>
+                    </m:e>
+                  </m:bar>
+                </m:e>
+                <m:sub>
+                  <m:r>
+                    <m:t>A</m:t>
+                  </m:r>
+                  <m:r>
+                    <m:t>d</m:t>
+                  </m:r>
+                  <m:r>
+                    <m:t>j</m:t>
+                  </m:r>
+                  <m:r>
+                    <m:t>a</m:t>
+                  </m:r>
+                  <m:r>
+                    <m:t>c</m:t>
+                  </m:r>
+                  <m:r>
+                    <m:t>e</m:t>
+                  </m:r>
+                  <m:r>
+                    <m:t>n</m:t>
+                  </m:r>
+                  <m:r>
+                    <m:t>t</m:t>
+                  </m:r>
+                  <m:r>
+                    <m:t>D</m:t>
+                  </m:r>
+                  <m:r>
+                    <m:t>S</m:t>
+                  </m:r>
+                  <m:r>
+                    <m:t>F</m:t>
+                  </m:r>
+                  <m:r>
+                    <m:t>S</m:t>
+                  </m:r>
+                </m:sub>
+              </m:sSub>
+              <m:r>
+                <m:t>−</m:t>
+              </m:r>
+              <m:sSub>
+                <m:e>
+                  <m:bar>
+                    <m:barPr>
+                      <m:pos m:val="top"/>
+                    </m:barPr>
+                    <m:e>
+                      <m:r>
+                        <m:t>X</m:t>
+                      </m:r>
+                    </m:e>
+                  </m:bar>
+                </m:e>
+                <m:sub>
+                  <m:r>
+                    <m:t>A</m:t>
+                  </m:r>
+                  <m:r>
+                    <m:t>d</m:t>
+                  </m:r>
+                  <m:r>
+                    <m:t>j</m:t>
+                  </m:r>
+                  <m:r>
+                    <m:t>a</m:t>
+                  </m:r>
+                  <m:r>
+                    <m:t>c</m:t>
+                  </m:r>
+                  <m:r>
+                    <m:t>e</m:t>
+                  </m:r>
+                  <m:r>
+                    <m:t>n</m:t>
+                  </m:r>
+                  <m:r>
+                    <m:t>t</m:t>
+                  </m:r>
+                  <m:r>
+                    <m:t>B</m:t>
+                  </m:r>
+                  <m:r>
+                    <m:t>e</m:t>
+                  </m:r>
+                  <m:r>
+                    <m:t>f</m:t>
+                  </m:r>
+                  <m:r>
+                    <m:t>o</m:t>
+                  </m:r>
+                  <m:r>
+                    <m:t>r</m:t>
+                  </m:r>
+                  <m:r>
+                    <m:t>e</m:t>
+                  </m:r>
+                </m:sub>
+              </m:sSub>
+              <m:r>
+                <m:t>)</m:t>
+              </m:r>
+              <m:r>
+                <m:t>−</m:t>
+              </m:r>
+              <m:r>
+                <m:t>(</m:t>
+              </m:r>
+              <m:sSub>
+                <m:e>
+                  <m:bar>
+                    <m:barPr>
+                      <m:pos m:val="top"/>
+                    </m:barPr>
+                    <m:e>
+                      <m:r>
+                        <m:t>X</m:t>
+                      </m:r>
+                    </m:e>
+                  </m:bar>
+                </m:e>
+                <m:sub>
+                  <m:r>
+                    <m:t>U</m:t>
+                  </m:r>
+                  <m:r>
+                    <m:t>p</m:t>
+                  </m:r>
+                  <m:r>
+                    <m:t>s</m:t>
+                  </m:r>
+                  <m:r>
+                    <m:t>t</m:t>
+                  </m:r>
+                  <m:r>
+                    <m:t>r</m:t>
+                  </m:r>
+                  <m:r>
+                    <m:t>e</m:t>
+                  </m:r>
+                  <m:r>
+                    <m:t>a</m:t>
+                  </m:r>
+                  <m:r>
+                    <m:t>m</m:t>
+                  </m:r>
+                  <m:r>
+                    <m:t>D</m:t>
+                  </m:r>
+                  <m:r>
+                    <m:t>S</m:t>
+                  </m:r>
+                  <m:r>
+                    <m:t>F</m:t>
+                  </m:r>
+                  <m:r>
+                    <m:t>S</m:t>
+                  </m:r>
+                </m:sub>
+              </m:sSub>
+              <m:r>
+                <m:t>−</m:t>
+              </m:r>
+              <m:sSub>
+                <m:e>
+                  <m:bar>
+                    <m:barPr>
+                      <m:pos m:val="top"/>
+                    </m:barPr>
+                    <m:e>
+                      <m:r>
+                        <m:t>X</m:t>
+                      </m:r>
+                    </m:e>
+                  </m:bar>
+                </m:e>
+                <m:sub>
+                  <m:r>
+                    <m:t>U</m:t>
+                  </m:r>
+                  <m:r>
+                    <m:t>p</m:t>
+                  </m:r>
+                  <m:r>
+                    <m:t>s</m:t>
+                  </m:r>
+                  <m:r>
+                    <m:t>t</m:t>
+                  </m:r>
+                  <m:r>
+                    <m:t>r</m:t>
+                  </m:r>
+                  <m:r>
+                    <m:t>e</m:t>
+                  </m:r>
+                  <m:r>
+                    <m:t>a</m:t>
+                  </m:r>
+                  <m:r>
+                    <m:t>m</m:t>
+                  </m:r>
+                  <m:r>
+                    <m:t>B</m:t>
+                  </m:r>
+                  <m:r>
+                    <m:t>e</m:t>
+                  </m:r>
+                  <m:r>
+                    <m:t>f</m:t>
+                  </m:r>
+                  <m:r>
+                    <m:t>o</m:t>
+                  </m:r>
+                  <m:r>
+                    <m:t>r</m:t>
+                  </m:r>
+                  <m:r>
+                    <m:t>e</m:t>
+                  </m:r>
+                </m:sub>
+              </m:sSub>
+              <m:r>
+                <m:t>)</m:t>
+              </m:r>
+            </m:num>
+            <m:den>
+              <m:r>
+                <m:t>S</m:t>
+              </m:r>
+              <m:sSub>
+                <m:e>
+                  <m:r>
+                    <m:t>D</m:t>
+                  </m:r>
+                </m:e>
+                <m:sub>
+                  <m:r>
+                    <m:t>P</m:t>
+                  </m:r>
+                  <m:r>
+                    <m:t>o</m:t>
+                  </m:r>
+                  <m:r>
+                    <m:t>o</m:t>
+                  </m:r>
+                  <m:r>
+                    <m:t>l</m:t>
+                  </m:r>
+                  <m:r>
+                    <m:t>e</m:t>
+                  </m:r>
+                  <m:r>
+                    <m:t>d</m:t>
+                  </m:r>
+                </m:sub>
+              </m:sSub>
+            </m:den>
+          </m:f>
+        </m:oMath>
+      </m:oMathPara>
+    </w:p>
+    <w:p>
+      <w:pPr>
+        <w:pStyle w:val="FirstParagraph"/>
+      </w:pPr>
+      <w:r>
+        <w:t xml:space="preserve">The pooled standard deviation in this case is computed as follows:</w:t>
+      </w:r>
+    </w:p>
+    <w:p>
+      <w:pPr>
+        <w:pStyle w:val="BodyText"/>
+      </w:pPr>
+      <m:oMathPara>
+        <m:oMathParaPr>
+          <m:jc m:val="center"/>
+        </m:oMathParaPr>
+        <m:oMath>
+          <m:r>
+            <m:t>S</m:t>
+          </m:r>
+          <m:sSub>
+            <m:e>
+              <m:r>
+                <m:t>D</m:t>
+              </m:r>
+            </m:e>
+            <m:sub>
+              <m:r>
+                <m:t>P</m:t>
+              </m:r>
+              <m:r>
+                <m:t>o</m:t>
+              </m:r>
+              <m:r>
+                <m:t>o</m:t>
+              </m:r>
+              <m:r>
+                <m:t>l</m:t>
+              </m:r>
+              <m:r>
+                <m:t>e</m:t>
+              </m:r>
+              <m:r>
+                <m:t>d</m:t>
+              </m:r>
+            </m:sub>
+          </m:sSub>
+          <m:r>
+            <m:t>=</m:t>
+          </m:r>
+          <m:rad>
+            <m:radPr>
+              <m:degHide m:val="1"/>
+            </m:radPr>
+            <m:deg/>
+            <m:e>
+              <m:f>
+                <m:fPr>
+                  <m:type m:val="bar"/>
+                </m:fPr>
+                <m:num>
+                  <m:r>
+                    <m:t>(</m:t>
+                  </m:r>
+                  <m:sSub>
+                    <m:e>
+                      <m:r>
+                        <m:t>N</m:t>
+                      </m:r>
+                    </m:e>
+                    <m:sub>
+                      <m:r>
                         <m:t>1</m:t>
                       </m:r>
                     </m:sub>
@@ -1129,7 +1632,7 @@
         <w:t xml:space="preserve"> </w:t>
       </w:r>
       <w:r>
-        <w:t xml:space="preserve">Table 2 provides general speed reduction formulas for each of the 13 possible combinations of timing and location of vehicle speeds in response to DSFS installation. The specific calculations follow the two forms above, for either the direct or normalized measurement of effect size.</w:t>
+        <w:t xml:space="preserve">Figures 4-7 in the Literature Review provide the detailed speed reduction formulas for each of the 13 possible combinations of timing and location of vehicle speeds in response to DSFS installation. The specific calculations follow the two forms above, for either the direct or normalized measurement of effect size.</w:t>
       </w:r>
     </w:p>
     <w:p>
@@ -1227,8 +1730,8 @@
       <w:pPr>
         <w:pStyle w:val="Heading2"/>
       </w:pPr>
-      <w:bookmarkStart w:id="25" w:name="hypothesis-testing"/>
-      <w:bookmarkEnd w:id="25"/>
+      <w:bookmarkStart w:id="26" w:name="hypothesis-testing"/>
+      <w:bookmarkEnd w:id="26"/>
       <w:r>
         <w:t xml:space="preserve">Hypothesis testing</w:t>
       </w:r>
@@ -1826,8 +2329,8 @@
       <w:pPr>
         <w:pStyle w:val="Heading1"/>
       </w:pPr>
-      <w:bookmarkStart w:id="26" w:name="results"/>
-      <w:bookmarkEnd w:id="26"/>
+      <w:bookmarkStart w:id="27" w:name="results"/>
+      <w:bookmarkEnd w:id="27"/>
       <w:r>
         <w:t xml:space="preserve">Results</w:t>
       </w:r>
@@ -1836,8 +2339,8 @@
       <w:pPr>
         <w:pStyle w:val="Heading2"/>
       </w:pPr>
-      <w:bookmarkStart w:id="27" w:name="summary-of-data"/>
-      <w:bookmarkEnd w:id="27"/>
+      <w:bookmarkStart w:id="28" w:name="summary-of-data"/>
+      <w:bookmarkEnd w:id="28"/>
       <w:r>
         <w:t xml:space="preserve">Summary of data</w:t>
       </w:r>
@@ -2566,8 +3069,8 @@
       <w:pPr>
         <w:pStyle w:val="Heading2"/>
       </w:pPr>
-      <w:bookmarkStart w:id="28" w:name="activation-hypothesis-h1"/>
-      <w:bookmarkEnd w:id="28"/>
+      <w:bookmarkStart w:id="29" w:name="activation-hypothesis-h1"/>
+      <w:bookmarkEnd w:id="29"/>
       <w:r>
         <w:t xml:space="preserve">Activation hypothesis: H1</w:t>
       </w:r>
@@ -2584,8 +3087,8 @@
       <w:pPr>
         <w:pStyle w:val="Heading3"/>
       </w:pPr>
-      <w:bookmarkStart w:id="29" w:name="h1a-activation-normalized"/>
-      <w:bookmarkEnd w:id="29"/>
+      <w:bookmarkStart w:id="30" w:name="h1a-activation-normalized"/>
+      <w:bookmarkEnd w:id="30"/>
       <w:r>
         <w:t xml:space="preserve">H1A: Activation normalized</w:t>
       </w:r>
@@ -2595,7 +3098,7 @@
         <w:pStyle w:val="FirstParagraph"/>
       </w:pPr>
       <w:r>
-        <w:t xml:space="preserve">Examining the mean effect sizes across vehicle types, without carrying out any statiticaly modeling, it is clear that the largest decreases in speed were observed for passenger cars.</w:t>
+        <w:t xml:space="preserve">Examining the mean effect sizes across vehicle types, without carrying out any statitical modeling, it is clear that the largest decreases in speed were observed for passenger cars. This summary shows that normalized speeds were reduced across all vehicle types, providing strong evidence of the effectiveness of DSFS, even when accounting for the expected reductions in speed between locations upstream and adjacent to the site of the DSFS installation.</w:t>
       </w:r>
     </w:p>
     <w:p>
@@ -2706,18 +3209,18 @@
               <w:jc w:val="right"/>
             </w:pPr>
             <w:r>
-              <w:t xml:space="preserve">-2.729</w:t>
-            </w:r>
-          </w:p>
-        </w:tc>
-        <w:tc>
-          <w:p>
-            <w:pPr>
-              <w:pStyle w:val="Compact"/>
-              <w:jc w:val="right"/>
-            </w:pPr>
-            <w:r>
-              <w:t xml:space="preserve">0.278</w:t>
+              <w:t xml:space="preserve">-2.73</w:t>
+            </w:r>
+          </w:p>
+        </w:tc>
+        <w:tc>
+          <w:p>
+            <w:pPr>
+              <w:pStyle w:val="Compact"/>
+              <w:jc w:val="right"/>
+            </w:pPr>
+            <w:r>
+              <w:t xml:space="preserve">0.28</w:t>
             </w:r>
           </w:p>
         </w:tc>
@@ -2752,18 +3255,18 @@
               <w:jc w:val="right"/>
             </w:pPr>
             <w:r>
-              <w:t xml:space="preserve">-3.905</w:t>
-            </w:r>
-          </w:p>
-        </w:tc>
-        <w:tc>
-          <w:p>
-            <w:pPr>
-              <w:pStyle w:val="Compact"/>
-              <w:jc w:val="right"/>
-            </w:pPr>
-            <w:r>
-              <w:t xml:space="preserve">1.035</w:t>
+              <w:t xml:space="preserve">-3.90</w:t>
+            </w:r>
+          </w:p>
+        </w:tc>
+        <w:tc>
+          <w:p>
+            <w:pPr>
+              <w:pStyle w:val="Compact"/>
+              <w:jc w:val="right"/>
+            </w:pPr>
+            <w:r>
+              <w:t xml:space="preserve">1.04</w:t>
             </w:r>
           </w:p>
         </w:tc>
@@ -2798,18 +3301,18 @@
               <w:jc w:val="right"/>
             </w:pPr>
             <w:r>
-              <w:t xml:space="preserve">-1.973</w:t>
-            </w:r>
-          </w:p>
-        </w:tc>
-        <w:tc>
-          <w:p>
-            <w:pPr>
-              <w:pStyle w:val="Compact"/>
-              <w:jc w:val="right"/>
-            </w:pPr>
-            <w:r>
-              <w:t xml:space="preserve">4.401</w:t>
+              <w:t xml:space="preserve">-1.97</w:t>
+            </w:r>
+          </w:p>
+        </w:tc>
+        <w:tc>
+          <w:p>
+            <w:pPr>
+              <w:pStyle w:val="Compact"/>
+              <w:jc w:val="right"/>
+            </w:pPr>
+            <w:r>
+              <w:t xml:space="preserve">4.40</w:t>
             </w:r>
           </w:p>
         </w:tc>
@@ -2826,6 +3329,14 @@
         </w:tc>
       </w:tr>
     </w:tbl>
+    <w:p>
+      <w:pPr>
+        <w:pStyle w:val="BodyText"/>
+      </w:pPr>
+      <w:r>
+        <w:t xml:space="preserve">Overall, the decrease in speed attributed to DSFS, normalized by upstream location, is -2.70 mph. Of the different grouping variables, vehicle type has the greatest influence, with cars showing an addtional -0.25 mph decrease. Trucks showed a smaller effect, with the decrease being smaller by 0.30 mph. When carrying out the statistical analysis of these effect sizes, 72 sites were available. After accounting for the variation attributed to publication, study, and site, partitioning effects by safety focus was not possible for this analysis. Partitioning of the effects by site and vehicle type were possible.</w:t>
+      </w:r>
+    </w:p>
     <w:p>
       <w:pPr>
         <w:pStyle w:val="TableCaption"/>
@@ -2867,7 +3378,7 @@
           <w:p>
             <w:pPr>
               <w:pStyle w:val="Compact"/>
-              <w:jc w:val="right"/>
+              <w:jc w:val="left"/>
             </w:pPr>
             <w:r>
               <w:t xml:space="preserve">Estimate</w:t>
@@ -2884,7 +3395,7 @@
           <w:p>
             <w:pPr>
               <w:pStyle w:val="Compact"/>
-              <w:jc w:val="right"/>
+              <w:jc w:val="left"/>
             </w:pPr>
             <w:r>
               <w:t xml:space="preserve">Std. Error</w:t>
@@ -2901,7 +3412,7 @@
           <w:p>
             <w:pPr>
               <w:pStyle w:val="Compact"/>
-              <w:jc w:val="right"/>
+              <w:jc w:val="left"/>
             </w:pPr>
             <w:r>
               <w:t xml:space="preserve">t value</w:t>
@@ -2917,40 +3428,40 @@
               <w:jc w:val="left"/>
             </w:pPr>
             <w:r>
-              <w:t xml:space="preserve">(Intercept)</w:t>
-            </w:r>
-          </w:p>
-        </w:tc>
-        <w:tc>
-          <w:p>
-            <w:pPr>
-              <w:pStyle w:val="Compact"/>
-              <w:jc w:val="right"/>
-            </w:pPr>
-            <w:r>
-              <w:t xml:space="preserve">-2.703</w:t>
-            </w:r>
-          </w:p>
-        </w:tc>
-        <w:tc>
-          <w:p>
-            <w:pPr>
-              <w:pStyle w:val="Compact"/>
-              <w:jc w:val="right"/>
-            </w:pPr>
-            <w:r>
-              <w:t xml:space="preserve">0.817</w:t>
-            </w:r>
-          </w:p>
-        </w:tc>
-        <w:tc>
-          <w:p>
-            <w:pPr>
-              <w:pStyle w:val="Compact"/>
-              <w:jc w:val="right"/>
-            </w:pPr>
-            <w:r>
-              <w:t xml:space="preserve">-3.309</w:t>
+              <w:t xml:space="preserve">Overall Effect</w:t>
+            </w:r>
+          </w:p>
+        </w:tc>
+        <w:tc>
+          <w:p>
+            <w:pPr>
+              <w:pStyle w:val="Compact"/>
+              <w:jc w:val="left"/>
+            </w:pPr>
+            <w:r>
+              <w:t xml:space="preserve">-2.843</w:t>
+            </w:r>
+          </w:p>
+        </w:tc>
+        <w:tc>
+          <w:p>
+            <w:pPr>
+              <w:pStyle w:val="Compact"/>
+              <w:jc w:val="left"/>
+            </w:pPr>
+            <w:r>
+              <w:t xml:space="preserve">0.991</w:t>
+            </w:r>
+          </w:p>
+        </w:tc>
+        <w:tc>
+          <w:p>
+            <w:pPr>
+              <w:pStyle w:val="Compact"/>
+              <w:jc w:val="left"/>
+            </w:pPr>
+            <w:r>
+              <w:t xml:space="preserve">-2.869</w:t>
             </w:r>
           </w:p>
         </w:tc>
@@ -2963,41 +3474,357 @@
               <w:jc w:val="left"/>
             </w:pPr>
             <w:r>
-              <w:t xml:space="preserve">Overall, the d</w:t>
-            </w:r>
-          </w:p>
-        </w:tc>
-        <w:tc>
-          <w:p>
-            <w:pPr>
-              <w:pStyle w:val="Compact"/>
-              <w:jc w:val="right"/>
-            </w:pPr>
-            <w:r>
-              <w:t xml:space="preserve">ecrease in</w:t>
-            </w:r>
-          </w:p>
-        </w:tc>
-        <w:tc>
-          <w:p>
-            <w:pPr>
-              <w:pStyle w:val="Compact"/>
-              <w:jc w:val="right"/>
-            </w:pPr>
-            <w:r>
-              <w:t xml:space="preserve">speed attribu</w:t>
-            </w:r>
-          </w:p>
-        </w:tc>
-        <w:tc>
-          <w:p>
-            <w:pPr>
-              <w:pStyle w:val="Compact"/>
-              <w:jc w:val="right"/>
-            </w:pPr>
-            <w:r>
-              <w:t xml:space="preserve">ted to DSFS, normalized by upstream location, is -5.7 mph. Of the different grouping variables, vehicle type has the greatest influence, with cars showing an addtional -0.25 mph decrease. Trucks showed a smaller effect, with the decrease being smaller by 0.30 mph. Only 28 sites were available for this test.</w:t>
-            </w:r>
+              <w:t xml:space="preserve">Vehicle Type Effects:</w:t>
+            </w:r>
+          </w:p>
+        </w:tc>
+        <w:tc>
+          <w:p>
+            <w:pStyle w:val="Compact"/>
+          </w:p>
+        </w:tc>
+        <w:tc>
+          <w:p>
+            <w:pStyle w:val="Compact"/>
+          </w:p>
+        </w:tc>
+        <w:tc>
+          <w:p>
+            <w:pStyle w:val="Compact"/>
+          </w:p>
+        </w:tc>
+      </w:tr>
+      <w:tr>
+        <w:tc>
+          <w:p>
+            <w:pPr>
+              <w:pStyle w:val="Compact"/>
+              <w:jc w:val="left"/>
+            </w:pPr>
+            <w:r>
+              <w:t xml:space="preserve">Unspecified</w:t>
+            </w:r>
+          </w:p>
+        </w:tc>
+        <w:tc>
+          <w:p>
+            <w:pPr>
+              <w:pStyle w:val="Compact"/>
+              <w:jc w:val="left"/>
+            </w:pPr>
+            <w:r>
+              <w:t xml:space="preserve">-2.9</w:t>
+            </w:r>
+          </w:p>
+        </w:tc>
+        <w:tc>
+          <w:p>
+            <w:pStyle w:val="Compact"/>
+          </w:p>
+        </w:tc>
+        <w:tc>
+          <w:p>
+            <w:pStyle w:val="Compact"/>
+          </w:p>
+        </w:tc>
+      </w:tr>
+      <w:tr>
+        <w:tc>
+          <w:p>
+            <w:pPr>
+              <w:pStyle w:val="Compact"/>
+              <w:jc w:val="left"/>
+            </w:pPr>
+            <w:r>
+              <w:t xml:space="preserve">Car</w:t>
+            </w:r>
+          </w:p>
+        </w:tc>
+        <w:tc>
+          <w:p>
+            <w:pPr>
+              <w:pStyle w:val="Compact"/>
+              <w:jc w:val="left"/>
+            </w:pPr>
+            <w:r>
+              <w:t xml:space="preserve">-2.95</w:t>
+            </w:r>
+          </w:p>
+        </w:tc>
+        <w:tc>
+          <w:p>
+            <w:pStyle w:val="Compact"/>
+          </w:p>
+        </w:tc>
+        <w:tc>
+          <w:p>
+            <w:pStyle w:val="Compact"/>
+          </w:p>
+        </w:tc>
+      </w:tr>
+      <w:tr>
+        <w:tc>
+          <w:p>
+            <w:pPr>
+              <w:pStyle w:val="Compact"/>
+              <w:jc w:val="left"/>
+            </w:pPr>
+            <w:r>
+              <w:t xml:space="preserve">Truck</w:t>
+            </w:r>
+          </w:p>
+        </w:tc>
+        <w:tc>
+          <w:p>
+            <w:pPr>
+              <w:pStyle w:val="Compact"/>
+              <w:jc w:val="left"/>
+            </w:pPr>
+            <w:r>
+              <w:t xml:space="preserve">-2.68</w:t>
+            </w:r>
+          </w:p>
+        </w:tc>
+        <w:tc>
+          <w:p>
+            <w:pStyle w:val="Compact"/>
+          </w:p>
+        </w:tc>
+        <w:tc>
+          <w:p>
+            <w:pStyle w:val="Compact"/>
+          </w:p>
+        </w:tc>
+      </w:tr>
+      <w:tr>
+        <w:tc>
+          <w:p>
+            <w:pPr>
+              <w:pStyle w:val="Compact"/>
+              <w:jc w:val="left"/>
+            </w:pPr>
+            <w:r>
+              <w:t xml:space="preserve">Safety Focus Effects:</w:t>
+            </w:r>
+          </w:p>
+        </w:tc>
+        <w:tc>
+          <w:p>
+            <w:pStyle w:val="Compact"/>
+          </w:p>
+        </w:tc>
+        <w:tc>
+          <w:p>
+            <w:pStyle w:val="Compact"/>
+          </w:p>
+        </w:tc>
+        <w:tc>
+          <w:p>
+            <w:pStyle w:val="Compact"/>
+          </w:p>
+        </w:tc>
+      </w:tr>
+      <w:tr>
+        <w:tc>
+          <w:p>
+            <w:pPr>
+              <w:pStyle w:val="Compact"/>
+              <w:jc w:val="left"/>
+            </w:pPr>
+            <w:r>
+              <w:t xml:space="preserve">Unspecified</w:t>
+            </w:r>
+          </w:p>
+        </w:tc>
+        <w:tc>
+          <w:p>
+            <w:pPr>
+              <w:pStyle w:val="Compact"/>
+              <w:jc w:val="left"/>
+            </w:pPr>
+            <w:r>
+              <w:t xml:space="preserve">-3.16</w:t>
+            </w:r>
+          </w:p>
+        </w:tc>
+        <w:tc>
+          <w:p>
+            <w:pStyle w:val="Compact"/>
+          </w:p>
+        </w:tc>
+        <w:tc>
+          <w:p>
+            <w:pStyle w:val="Compact"/>
+          </w:p>
+        </w:tc>
+      </w:tr>
+      <w:tr>
+        <w:tc>
+          <w:p>
+            <w:pPr>
+              <w:pStyle w:val="Compact"/>
+              <w:jc w:val="left"/>
+            </w:pPr>
+            <w:r>
+              <w:t xml:space="preserve">Curved Section</w:t>
+            </w:r>
+          </w:p>
+        </w:tc>
+        <w:tc>
+          <w:p>
+            <w:pPr>
+              <w:pStyle w:val="Compact"/>
+              <w:jc w:val="left"/>
+            </w:pPr>
+            <w:r>
+              <w:t xml:space="preserve">-2.27</w:t>
+            </w:r>
+          </w:p>
+        </w:tc>
+        <w:tc>
+          <w:p>
+            <w:pStyle w:val="Compact"/>
+          </w:p>
+        </w:tc>
+        <w:tc>
+          <w:p>
+            <w:pStyle w:val="Compact"/>
+          </w:p>
+        </w:tc>
+      </w:tr>
+      <w:tr>
+        <w:tc>
+          <w:p>
+            <w:pPr>
+              <w:pStyle w:val="Compact"/>
+              <w:jc w:val="left"/>
+            </w:pPr>
+            <w:r>
+              <w:t xml:space="preserve">School Zone</w:t>
+            </w:r>
+          </w:p>
+        </w:tc>
+        <w:tc>
+          <w:p>
+            <w:pPr>
+              <w:pStyle w:val="Compact"/>
+              <w:jc w:val="left"/>
+            </w:pPr>
+            <w:r>
+              <w:t xml:space="preserve">-3.21</w:t>
+            </w:r>
+          </w:p>
+        </w:tc>
+        <w:tc>
+          <w:p>
+            <w:pStyle w:val="Compact"/>
+          </w:p>
+        </w:tc>
+        <w:tc>
+          <w:p>
+            <w:pStyle w:val="Compact"/>
+          </w:p>
+        </w:tc>
+      </w:tr>
+      <w:tr>
+        <w:tc>
+          <w:p>
+            <w:pPr>
+              <w:pStyle w:val="Compact"/>
+              <w:jc w:val="left"/>
+            </w:pPr>
+            <w:r>
+              <w:t xml:space="preserve">Signalized Interserction</w:t>
+            </w:r>
+          </w:p>
+        </w:tc>
+        <w:tc>
+          <w:p>
+            <w:pPr>
+              <w:pStyle w:val="Compact"/>
+              <w:jc w:val="left"/>
+            </w:pPr>
+            <w:r>
+              <w:t xml:space="preserve">-2.9</w:t>
+            </w:r>
+          </w:p>
+        </w:tc>
+        <w:tc>
+          <w:p>
+            <w:pStyle w:val="Compact"/>
+          </w:p>
+        </w:tc>
+        <w:tc>
+          <w:p>
+            <w:pStyle w:val="Compact"/>
+          </w:p>
+        </w:tc>
+      </w:tr>
+      <w:tr>
+        <w:tc>
+          <w:p>
+            <w:pPr>
+              <w:pStyle w:val="Compact"/>
+              <w:jc w:val="left"/>
+            </w:pPr>
+            <w:r>
+              <w:t xml:space="preserve">Transition Zone</w:t>
+            </w:r>
+          </w:p>
+        </w:tc>
+        <w:tc>
+          <w:p>
+            <w:pPr>
+              <w:pStyle w:val="Compact"/>
+              <w:jc w:val="left"/>
+            </w:pPr>
+            <w:r>
+              <w:t xml:space="preserve">-2.79</w:t>
+            </w:r>
+          </w:p>
+        </w:tc>
+        <w:tc>
+          <w:p>
+            <w:pStyle w:val="Compact"/>
+          </w:p>
+        </w:tc>
+        <w:tc>
+          <w:p>
+            <w:pStyle w:val="Compact"/>
+          </w:p>
+        </w:tc>
+      </w:tr>
+      <w:tr>
+        <w:tc>
+          <w:p>
+            <w:pPr>
+              <w:pStyle w:val="Compact"/>
+              <w:jc w:val="left"/>
+            </w:pPr>
+            <w:r>
+              <w:t xml:space="preserve">Work Zone</w:t>
+            </w:r>
+          </w:p>
+        </w:tc>
+        <w:tc>
+          <w:p>
+            <w:pPr>
+              <w:pStyle w:val="Compact"/>
+              <w:jc w:val="left"/>
+            </w:pPr>
+            <w:r>
+              <w:t xml:space="preserve">-2.73</w:t>
+            </w:r>
+          </w:p>
+        </w:tc>
+        <w:tc>
+          <w:p>
+            <w:pStyle w:val="Compact"/>
+          </w:p>
+        </w:tc>
+        <w:tc>
+          <w:p>
+            <w:pStyle w:val="Compact"/>
           </w:p>
         </w:tc>
       </w:tr>
@@ -3006,8 +3833,8 @@
       <w:pPr>
         <w:pStyle w:val="Heading2"/>
       </w:pPr>
-      <w:bookmarkStart w:id="30" w:name="h1b"/>
-      <w:bookmarkEnd w:id="30"/>
+      <w:bookmarkStart w:id="31" w:name="h1b"/>
+      <w:bookmarkEnd w:id="31"/>
       <w:r>
         <w:t xml:space="preserve">H1B</w:t>
       </w:r>
@@ -3017,7 +3844,7 @@
         <w:pStyle w:val="FirstParagraph"/>
       </w:pPr>
       <w:r>
-        <w:t xml:space="preserve">Calculations of effect sizes for H1B, the decrease in speed at the site of the DSFS, show decreasese in speed across all vehicle types and locations. The largest raw effect size was observed for passenger cars, where speeds were on average reduced by -4.52 mph.</w:t>
+        <w:t xml:space="preserve">Calculations of effect sizes for H1B, the decrease in speed at the site of the DSFS, show decreases in speed across all vehicle types and locations. The largest raw effect size was observed for passenger cars, where speeds were on average reduced by -4.52 mph.</w:t>
       </w:r>
     </w:p>
     <w:p>
@@ -3087,7 +3914,7 @@
               <w:jc w:val="right"/>
             </w:pPr>
             <w:r>
-              <w:t xml:space="preserve">Effect size yi</w:t>
+              <w:t xml:space="preserve">Effect size</w:t>
             </w:r>
           </w:p>
         </w:tc>
@@ -3104,7 +3931,7 @@
               <w:jc w:val="right"/>
             </w:pPr>
             <w:r>
-              <w:t xml:space="preserve">Variance vi</w:t>
+              <w:t xml:space="preserve">Variance</w:t>
             </w:r>
           </w:p>
         </w:tc>
@@ -3134,7 +3961,7 @@
               <w:jc w:val="left"/>
             </w:pPr>
             <w:r>
-              <w:t xml:space="preserve">1 upstream</w:t>
+              <w:t xml:space="preserve">Upstream</w:t>
             </w:r>
           </w:p>
         </w:tc>
@@ -3156,18 +3983,18 @@
               <w:jc w:val="right"/>
             </w:pPr>
             <w:r>
-              <w:t xml:space="preserve">-0.232</w:t>
-            </w:r>
-          </w:p>
-        </w:tc>
-        <w:tc>
-          <w:p>
-            <w:pPr>
-              <w:pStyle w:val="Compact"/>
-              <w:jc w:val="right"/>
-            </w:pPr>
-            <w:r>
-              <w:t xml:space="preserve">0.153</w:t>
+              <w:t xml:space="preserve">-0.23</w:t>
+            </w:r>
+          </w:p>
+        </w:tc>
+        <w:tc>
+          <w:p>
+            <w:pPr>
+              <w:pStyle w:val="Compact"/>
+              <w:jc w:val="right"/>
+            </w:pPr>
+            <w:r>
+              <w:t xml:space="preserve">0.15</w:t>
             </w:r>
           </w:p>
         </w:tc>
@@ -3191,7 +4018,7 @@
               <w:jc w:val="left"/>
             </w:pPr>
             <w:r>
-              <w:t xml:space="preserve">2 adjacent</w:t>
+              <w:t xml:space="preserve">Adjacent</w:t>
             </w:r>
           </w:p>
         </w:tc>
@@ -3213,18 +4040,18 @@
               <w:jc w:val="right"/>
             </w:pPr>
             <w:r>
-              <w:t xml:space="preserve">-2.687</w:t>
-            </w:r>
-          </w:p>
-        </w:tc>
-        <w:tc>
-          <w:p>
-            <w:pPr>
-              <w:pStyle w:val="Compact"/>
-              <w:jc w:val="right"/>
-            </w:pPr>
-            <w:r>
-              <w:t xml:space="preserve">0.136</w:t>
+              <w:t xml:space="preserve">-2.69</w:t>
+            </w:r>
+          </w:p>
+        </w:tc>
+        <w:tc>
+          <w:p>
+            <w:pPr>
+              <w:pStyle w:val="Compact"/>
+              <w:jc w:val="right"/>
+            </w:pPr>
+            <w:r>
+              <w:t xml:space="preserve">0.14</w:t>
             </w:r>
           </w:p>
         </w:tc>
@@ -3248,7 +4075,7 @@
               <w:jc w:val="left"/>
             </w:pPr>
             <w:r>
-              <w:t xml:space="preserve">3 downstream</w:t>
+              <w:t xml:space="preserve">Downstream</w:t>
             </w:r>
           </w:p>
         </w:tc>
@@ -3270,18 +4097,18 @@
               <w:jc w:val="right"/>
             </w:pPr>
             <w:r>
-              <w:t xml:space="preserve">-3.072</w:t>
-            </w:r>
-          </w:p>
-        </w:tc>
-        <w:tc>
-          <w:p>
-            <w:pPr>
-              <w:pStyle w:val="Compact"/>
-              <w:jc w:val="right"/>
-            </w:pPr>
-            <w:r>
-              <w:t xml:space="preserve">0.195</w:t>
+              <w:t xml:space="preserve">-3.07</w:t>
+            </w:r>
+          </w:p>
+        </w:tc>
+        <w:tc>
+          <w:p>
+            <w:pPr>
+              <w:pStyle w:val="Compact"/>
+              <w:jc w:val="right"/>
+            </w:pPr>
+            <w:r>
+              <w:t xml:space="preserve">0.19</w:t>
             </w:r>
           </w:p>
         </w:tc>
@@ -3305,7 +4132,7 @@
               <w:jc w:val="left"/>
             </w:pPr>
             <w:r>
-              <w:t xml:space="preserve">1 upstream</w:t>
+              <w:t xml:space="preserve">Upstream</w:t>
             </w:r>
           </w:p>
         </w:tc>
@@ -3327,18 +4154,18 @@
               <w:jc w:val="right"/>
             </w:pPr>
             <w:r>
-              <w:t xml:space="preserve">-0.476</w:t>
-            </w:r>
-          </w:p>
-        </w:tc>
-        <w:tc>
-          <w:p>
-            <w:pPr>
-              <w:pStyle w:val="Compact"/>
-              <w:jc w:val="right"/>
-            </w:pPr>
-            <w:r>
-              <w:t xml:space="preserve">0.470</w:t>
+              <w:t xml:space="preserve">-0.48</w:t>
+            </w:r>
+          </w:p>
+        </w:tc>
+        <w:tc>
+          <w:p>
+            <w:pPr>
+              <w:pStyle w:val="Compact"/>
+              <w:jc w:val="right"/>
+            </w:pPr>
+            <w:r>
+              <w:t xml:space="preserve">0.47</w:t>
             </w:r>
           </w:p>
         </w:tc>
@@ -3362,7 +4189,7 @@
               <w:jc w:val="left"/>
             </w:pPr>
             <w:r>
-              <w:t xml:space="preserve">2 adjacent</w:t>
+              <w:t xml:space="preserve">Adjacent</w:t>
             </w:r>
           </w:p>
         </w:tc>
@@ -3384,18 +4211,18 @@
               <w:jc w:val="right"/>
             </w:pPr>
             <w:r>
-              <w:t xml:space="preserve">-4.521</w:t>
-            </w:r>
-          </w:p>
-        </w:tc>
-        <w:tc>
-          <w:p>
-            <w:pPr>
-              <w:pStyle w:val="Compact"/>
-              <w:jc w:val="right"/>
-            </w:pPr>
-            <w:r>
-              <w:t xml:space="preserve">0.601</w:t>
+              <w:t xml:space="preserve">-4.52</w:t>
+            </w:r>
+          </w:p>
+        </w:tc>
+        <w:tc>
+          <w:p>
+            <w:pPr>
+              <w:pStyle w:val="Compact"/>
+              <w:jc w:val="right"/>
+            </w:pPr>
+            <w:r>
+              <w:t xml:space="preserve">0.60</w:t>
             </w:r>
           </w:p>
         </w:tc>
@@ -3419,7 +4246,7 @@
               <w:jc w:val="left"/>
             </w:pPr>
             <w:r>
-              <w:t xml:space="preserve">3 downstream</w:t>
+              <w:t xml:space="preserve">Downstream</w:t>
             </w:r>
           </w:p>
         </w:tc>
@@ -3441,18 +4268,18 @@
               <w:jc w:val="right"/>
             </w:pPr>
             <w:r>
-              <w:t xml:space="preserve">-2.725</w:t>
-            </w:r>
-          </w:p>
-        </w:tc>
-        <w:tc>
-          <w:p>
-            <w:pPr>
-              <w:pStyle w:val="Compact"/>
-              <w:jc w:val="right"/>
-            </w:pPr>
-            <w:r>
-              <w:t xml:space="preserve">0.411</w:t>
+              <w:t xml:space="preserve">-2.73</w:t>
+            </w:r>
+          </w:p>
+        </w:tc>
+        <w:tc>
+          <w:p>
+            <w:pPr>
+              <w:pStyle w:val="Compact"/>
+              <w:jc w:val="right"/>
+            </w:pPr>
+            <w:r>
+              <w:t xml:space="preserve">0.41</w:t>
             </w:r>
           </w:p>
         </w:tc>
@@ -3476,7 +4303,7 @@
               <w:jc w:val="left"/>
             </w:pPr>
             <w:r>
-              <w:t xml:space="preserve">1 upstream</w:t>
+              <w:t xml:space="preserve">Upstream</w:t>
             </w:r>
           </w:p>
         </w:tc>
@@ -3498,18 +4325,18 @@
               <w:jc w:val="right"/>
             </w:pPr>
             <w:r>
-              <w:t xml:space="preserve">0.394</w:t>
-            </w:r>
-          </w:p>
-        </w:tc>
-        <w:tc>
-          <w:p>
-            <w:pPr>
-              <w:pStyle w:val="Compact"/>
-              <w:jc w:val="right"/>
-            </w:pPr>
-            <w:r>
-              <w:t xml:space="preserve">2.167</w:t>
+              <w:t xml:space="preserve">0.39</w:t>
+            </w:r>
+          </w:p>
+        </w:tc>
+        <w:tc>
+          <w:p>
+            <w:pPr>
+              <w:pStyle w:val="Compact"/>
+              <w:jc w:val="right"/>
+            </w:pPr>
+            <w:r>
+              <w:t xml:space="preserve">2.17</w:t>
             </w:r>
           </w:p>
         </w:tc>
@@ -3533,7 +4360,7 @@
               <w:jc w:val="left"/>
             </w:pPr>
             <w:r>
-              <w:t xml:space="preserve">2 adjacent</w:t>
+              <w:t xml:space="preserve">Adjacent</w:t>
             </w:r>
           </w:p>
         </w:tc>
@@ -3555,18 +4382,18 @@
               <w:jc w:val="right"/>
             </w:pPr>
             <w:r>
-              <w:t xml:space="preserve">-2.129</w:t>
-            </w:r>
-          </w:p>
-        </w:tc>
-        <w:tc>
-          <w:p>
-            <w:pPr>
-              <w:pStyle w:val="Compact"/>
-              <w:jc w:val="right"/>
-            </w:pPr>
-            <w:r>
-              <w:t xml:space="preserve">1.717</w:t>
+              <w:t xml:space="preserve">-2.13</w:t>
+            </w:r>
+          </w:p>
+        </w:tc>
+        <w:tc>
+          <w:p>
+            <w:pPr>
+              <w:pStyle w:val="Compact"/>
+              <w:jc w:val="right"/>
+            </w:pPr>
+            <w:r>
+              <w:t xml:space="preserve">1.72</w:t>
             </w:r>
           </w:p>
         </w:tc>
@@ -3590,7 +4417,7 @@
               <w:jc w:val="left"/>
             </w:pPr>
             <w:r>
-              <w:t xml:space="preserve">3 downstream</w:t>
+              <w:t xml:space="preserve">Downstream</w:t>
             </w:r>
           </w:p>
         </w:tc>
@@ -3612,18 +4439,18 @@
               <w:jc w:val="right"/>
             </w:pPr>
             <w:r>
-              <w:t xml:space="preserve">-2.207</w:t>
-            </w:r>
-          </w:p>
-        </w:tc>
-        <w:tc>
-          <w:p>
-            <w:pPr>
-              <w:pStyle w:val="Compact"/>
-              <w:jc w:val="right"/>
-            </w:pPr>
-            <w:r>
-              <w:t xml:space="preserve">0.879</w:t>
+              <w:t xml:space="preserve">-2.21</w:t>
+            </w:r>
+          </w:p>
+        </w:tc>
+        <w:tc>
+          <w:p>
+            <w:pPr>
+              <w:pStyle w:val="Compact"/>
+              <w:jc w:val="right"/>
+            </w:pPr>
+            <w:r>
+              <w:t xml:space="preserve">0.88</w:t>
             </w:r>
           </w:p>
         </w:tc>
@@ -3645,7 +4472,7 @@
         <w:pStyle w:val="BodyText"/>
       </w:pPr>
       <w:r>
-        <w:t xml:space="preserve">Statistical test of H1B, which takes into account the variation at each level of site, study, and publication, as well as different vehicle types and safety foci, shows a significant decrease in speeds of -3.42 mph at the location adjacent to the sign. Within passenger cars, this decrease is even more pronounced with an estiamted additional decrease of -0.55 mph. Thus, approximately 4 mph decrease is expected for passenger cars at DSFS locations.</w:t>
+        <w:t xml:space="preserve">The statistical analysis of hypothesis H1B, which takes into account the variation at each level of site, study, and publication, as well as different vehicle types and safety foci, shows a significant decrease in speeds of -3.42 mph at the location adjacent to the sign. Within passenger cars, this decrease is even more pronounced with an estiamted additional decrease of -0.55 mph. Thus, approximately 4 mph decrease is expected for passenger cars at DSFS locations.</w:t>
       </w:r>
     </w:p>
     <w:p>
@@ -3758,7 +4585,7 @@
               <w:jc w:val="right"/>
             </w:pPr>
             <w:r>
-              <w:t xml:space="preserve">-0.578</w:t>
+              <w:t xml:space="preserve">-0.584</w:t>
             </w:r>
           </w:p>
         </w:tc>
@@ -3780,7 +4607,7 @@
               <w:jc w:val="right"/>
             </w:pPr>
             <w:r>
-              <w:t xml:space="preserve">-1.030</w:t>
+              <w:t xml:space="preserve">-1.038</w:t>
             </w:r>
           </w:p>
         </w:tc>
@@ -3804,29 +4631,29 @@
               <w:jc w:val="right"/>
             </w:pPr>
             <w:r>
-              <w:t xml:space="preserve">-2.844</w:t>
-            </w:r>
-          </w:p>
-        </w:tc>
-        <w:tc>
-          <w:p>
-            <w:pPr>
-              <w:pStyle w:val="Compact"/>
-              <w:jc w:val="right"/>
-            </w:pPr>
-            <w:r>
-              <w:t xml:space="preserve">0.399</w:t>
-            </w:r>
-          </w:p>
-        </w:tc>
-        <w:tc>
-          <w:p>
-            <w:pPr>
-              <w:pStyle w:val="Compact"/>
-              <w:jc w:val="right"/>
-            </w:pPr>
-            <w:r>
-              <w:t xml:space="preserve">-7.128</w:t>
+              <w:t xml:space="preserve">-2.862</w:t>
+            </w:r>
+          </w:p>
+        </w:tc>
+        <w:tc>
+          <w:p>
+            <w:pPr>
+              <w:pStyle w:val="Compact"/>
+              <w:jc w:val="right"/>
+            </w:pPr>
+            <w:r>
+              <w:t xml:space="preserve">0.406</w:t>
+            </w:r>
+          </w:p>
+        </w:tc>
+        <w:tc>
+          <w:p>
+            <w:pPr>
+              <w:pStyle w:val="Compact"/>
+              <w:jc w:val="right"/>
+            </w:pPr>
+            <w:r>
+              <w:t xml:space="preserve">-7.046</w:t>
             </w:r>
           </w:p>
         </w:tc>
@@ -3845,25 +4672,25 @@
     </w:p>
     <w:p>
       <w:pPr>
-        <w:pStyle w:val="FirstParagraph"/>
+        <w:pStyle w:val="FigureWithCaption"/>
       </w:pPr>
       <w:r>
         <w:drawing>
           <wp:inline>
             <wp:extent cx="3696101" cy="2772075"/>
             <wp:effectExtent b="0" l="0" r="0" t="0"/>
-            <wp:docPr descr="" id="1" name="Picture"/>
+            <wp:docPr descr="Plot of effect sizes for hypothesis H1B, effect of DSFS adjacent to sign site." id="1" name="Picture"/>
             <a:graphic>
               <a:graphicData uri="http://schemas.openxmlformats.org/drawingml/2006/picture">
                 <pic:pic>
                   <pic:nvPicPr>
-                    <pic:cNvPr descr="MA_Report_files/figure-docx/unnamed-chunk-4-1.png" id="0" name="Picture"/>
+                    <pic:cNvPr descr="MA_Report_files/figure-docx/unnamed-chunk-5-1.png" id="0" name="Picture"/>
                     <pic:cNvPicPr>
                       <a:picLocks noChangeArrowheads="1" noChangeAspect="1"/>
                     </pic:cNvPicPr>
                   </pic:nvPicPr>
                   <pic:blipFill>
-                    <a:blip r:embed="rId31"/>
+                    <a:blip r:embed="rId32"/>
                     <a:stretch>
                       <a:fillRect/>
                     </a:stretch>
@@ -3892,10 +4719,18 @@
     </w:p>
     <w:p>
       <w:pPr>
+        <w:pStyle w:val="ImageCaption"/>
+      </w:pPr>
+      <w:r>
+        <w:t xml:space="preserve">Plot of effect sizes for hypothesis H1B, effect of DSFS adjacent to sign site.</w:t>
+      </w:r>
+    </w:p>
+    <w:p>
+      <w:pPr>
         <w:pStyle w:val="Heading2"/>
       </w:pPr>
-      <w:bookmarkStart w:id="32" w:name="h1c"/>
-      <w:bookmarkEnd w:id="32"/>
+      <w:bookmarkStart w:id="33" w:name="h1c"/>
+      <w:bookmarkEnd w:id="33"/>
       <w:r>
         <w:t xml:space="preserve">H1C</w:t>
       </w:r>
@@ -4291,13 +5126,13 @@
               <a:graphicData uri="http://schemas.openxmlformats.org/drawingml/2006/picture">
                 <pic:pic>
                   <pic:nvPicPr>
-                    <pic:cNvPr descr="MA_Report_files/figure-docx/unnamed-chunk-6-1.png" id="0" name="Picture"/>
+                    <pic:cNvPr descr="MA_Report_files/figure-docx/unnamed-chunk-7-1.png" id="0" name="Picture"/>
                     <pic:cNvPicPr>
                       <a:picLocks noChangeArrowheads="1" noChangeAspect="1"/>
                     </pic:cNvPicPr>
                   </pic:nvPicPr>
                   <pic:blipFill>
-                    <a:blip r:embed="rId33"/>
+                    <a:blip r:embed="rId34"/>
                     <a:stretch>
                       <a:fillRect/>
                     </a:stretch>
@@ -4549,7 +5384,7 @@
   <w:abstractNum w:abstractNumId="2" w15:restartNumberingAfterBreak="0">
     <w:nsid w:val="FFFFFF7C"/>
     <w:multiLevelType w:val="singleLevel"/>
-    <w:tmpl w:val="9F5C3B20"/>
+    <w:tmpl w:val="1B04BA44"/>
     <w:lvl w:ilvl="0">
       <w:start w:val="1"/>
       <w:numFmt w:val="decimal"/>
@@ -4566,7 +5401,7 @@
   <w:abstractNum w:abstractNumId="3" w15:restartNumberingAfterBreak="0">
     <w:nsid w:val="FFFFFF7D"/>
     <w:multiLevelType w:val="singleLevel"/>
-    <w:tmpl w:val="E462193E"/>
+    <w:tmpl w:val="DFF68F46"/>
     <w:lvl w:ilvl="0">
       <w:start w:val="1"/>
       <w:numFmt w:val="decimal"/>
@@ -4583,7 +5418,7 @@
   <w:abstractNum w:abstractNumId="4" w15:restartNumberingAfterBreak="0">
     <w:nsid w:val="FFFFFF7E"/>
     <w:multiLevelType w:val="singleLevel"/>
-    <w:tmpl w:val="3E2C9A8C"/>
+    <w:tmpl w:val="EEB6548C"/>
     <w:lvl w:ilvl="0">
       <w:start w:val="1"/>
       <w:numFmt w:val="decimal"/>
@@ -4600,7 +5435,7 @@
   <w:abstractNum w:abstractNumId="5" w15:restartNumberingAfterBreak="0">
     <w:nsid w:val="FFFFFF7F"/>
     <w:multiLevelType w:val="singleLevel"/>
-    <w:tmpl w:val="6994CF6E"/>
+    <w:tmpl w:val="41EA2CB4"/>
     <w:lvl w:ilvl="0">
       <w:start w:val="1"/>
       <w:numFmt w:val="decimal"/>
@@ -4617,7 +5452,7 @@
   <w:abstractNum w:abstractNumId="6" w15:restartNumberingAfterBreak="0">
     <w:nsid w:val="FFFFFF80"/>
     <w:multiLevelType w:val="singleLevel"/>
-    <w:tmpl w:val="9B545606"/>
+    <w:tmpl w:val="86E21CFE"/>
     <w:lvl w:ilvl="0">
       <w:start w:val="1"/>
       <w:numFmt w:val="bullet"/>
@@ -4637,7 +5472,7 @@
   <w:abstractNum w:abstractNumId="7" w15:restartNumberingAfterBreak="0">
     <w:nsid w:val="FFFFFF81"/>
     <w:multiLevelType w:val="singleLevel"/>
-    <w:tmpl w:val="4172022C"/>
+    <w:tmpl w:val="B66AB34C"/>
     <w:lvl w:ilvl="0">
       <w:start w:val="1"/>
       <w:numFmt w:val="bullet"/>
@@ -4657,7 +5492,7 @@
   <w:abstractNum w:abstractNumId="8" w15:restartNumberingAfterBreak="0">
     <w:nsid w:val="FFFFFF82"/>
     <w:multiLevelType w:val="singleLevel"/>
-    <w:tmpl w:val="43BE3142"/>
+    <w:tmpl w:val="7ABA929C"/>
     <w:lvl w:ilvl="0">
       <w:start w:val="1"/>
       <w:numFmt w:val="bullet"/>
@@ -4677,7 +5512,7 @@
   <w:abstractNum w:abstractNumId="9" w15:restartNumberingAfterBreak="0">
     <w:nsid w:val="FFFFFF83"/>
     <w:multiLevelType w:val="singleLevel"/>
-    <w:tmpl w:val="19C4F56E"/>
+    <w:tmpl w:val="869CB566"/>
     <w:lvl w:ilvl="0">
       <w:start w:val="1"/>
       <w:numFmt w:val="bullet"/>
@@ -4697,7 +5532,7 @@
   <w:abstractNum w:abstractNumId="10" w15:restartNumberingAfterBreak="0">
     <w:nsid w:val="FFFFFF88"/>
     <w:multiLevelType w:val="singleLevel"/>
-    <w:tmpl w:val="AED6D622"/>
+    <w:tmpl w:val="482C22E4"/>
     <w:lvl w:ilvl="0">
       <w:start w:val="1"/>
       <w:numFmt w:val="decimal"/>
@@ -4714,7 +5549,7 @@
   <w:abstractNum w:abstractNumId="11" w15:restartNumberingAfterBreak="0">
     <w:nsid w:val="FFFFFF89"/>
     <w:multiLevelType w:val="singleLevel"/>
-    <w:tmpl w:val="844827CC"/>
+    <w:tmpl w:val="50B45EBE"/>
     <w:lvl w:ilvl="0">
       <w:start w:val="1"/>
       <w:numFmt w:val="bullet"/>
@@ -4732,6 +5567,92 @@
     </w:lvl>
   </w:abstractNum>
   <w:abstractNum w:abstractNumId="12" w15:restartNumberingAfterBreak="0">
+    <w:nsid w:val="3D9D736B"/>
+    <w:multiLevelType w:val="multilevel"/>
+    <w:tmpl w:val="7EFAA55C"/>
+    <w:lvl w:ilvl="0">
+      <w:start w:val="1"/>
+      <w:numFmt w:val="decimal"/>
+      <w:lvlText w:val="%1."/>
+      <w:lvlJc w:val="left"/>
+      <w:pPr>
+        <w:ind w:left="360" w:hanging="360"/>
+      </w:pPr>
+    </w:lvl>
+    <w:lvl w:ilvl="1">
+      <w:start w:val="1"/>
+      <w:numFmt w:val="decimal"/>
+      <w:lvlText w:val="%1.%2."/>
+      <w:lvlJc w:val="left"/>
+      <w:pPr>
+        <w:ind w:left="792" w:hanging="432"/>
+      </w:pPr>
+    </w:lvl>
+    <w:lvl w:ilvl="2">
+      <w:start w:val="1"/>
+      <w:numFmt w:val="decimal"/>
+      <w:lvlText w:val="%1.%2.%3."/>
+      <w:lvlJc w:val="left"/>
+      <w:pPr>
+        <w:ind w:left="1224" w:hanging="504"/>
+      </w:pPr>
+    </w:lvl>
+    <w:lvl w:ilvl="3">
+      <w:start w:val="1"/>
+      <w:numFmt w:val="decimal"/>
+      <w:lvlText w:val="%1.%2.%3.%4."/>
+      <w:lvlJc w:val="left"/>
+      <w:pPr>
+        <w:ind w:left="1728" w:hanging="648"/>
+      </w:pPr>
+    </w:lvl>
+    <w:lvl w:ilvl="4">
+      <w:start w:val="1"/>
+      <w:numFmt w:val="decimal"/>
+      <w:lvlText w:val="%1.%2.%3.%4.%5."/>
+      <w:lvlJc w:val="left"/>
+      <w:pPr>
+        <w:ind w:left="2232" w:hanging="792"/>
+      </w:pPr>
+    </w:lvl>
+    <w:lvl w:ilvl="5">
+      <w:start w:val="1"/>
+      <w:numFmt w:val="decimal"/>
+      <w:lvlText w:val="%1.%2.%3.%4.%5.%6."/>
+      <w:lvlJc w:val="left"/>
+      <w:pPr>
+        <w:ind w:left="2736" w:hanging="936"/>
+      </w:pPr>
+    </w:lvl>
+    <w:lvl w:ilvl="6">
+      <w:start w:val="1"/>
+      <w:numFmt w:val="decimal"/>
+      <w:lvlText w:val="%1.%2.%3.%4.%5.%6.%7."/>
+      <w:lvlJc w:val="left"/>
+      <w:pPr>
+        <w:ind w:left="3240" w:hanging="1080"/>
+      </w:pPr>
+    </w:lvl>
+    <w:lvl w:ilvl="7">
+      <w:start w:val="1"/>
+      <w:numFmt w:val="decimal"/>
+      <w:lvlText w:val="%1.%2.%3.%4.%5.%6.%7.%8."/>
+      <w:lvlJc w:val="left"/>
+      <w:pPr>
+        <w:ind w:left="3744" w:hanging="1224"/>
+      </w:pPr>
+    </w:lvl>
+    <w:lvl w:ilvl="8">
+      <w:start w:val="1"/>
+      <w:numFmt w:val="decimal"/>
+      <w:lvlText w:val="%1.%2.%3.%4.%5.%6.%7.%8.%9."/>
+      <w:lvlJc w:val="left"/>
+      <w:pPr>
+        <w:ind w:left="4320" w:hanging="1440"/>
+      </w:pPr>
+    </w:lvl>
+  </w:abstractNum>
+  <w:abstractNum w:abstractNumId="13" w15:restartNumberingAfterBreak="0">
     <w:nsid w:val="7085F9C9"/>
     <w:multiLevelType w:val="multilevel"/>
     <w:tmpl w:val="9F9492D2"/>
@@ -4823,8 +5744,186 @@
       <w:lvlJc w:val="left"/>
     </w:lvl>
   </w:abstractNum>
+  <w:abstractNum w:abstractNumId="14" w15:restartNumberingAfterBreak="0">
+    <w:nsid w:val="79492AE0"/>
+    <w:multiLevelType w:val="multilevel"/>
+    <w:tmpl w:val="199E3E90"/>
+    <w:lvl w:ilvl="0">
+      <w:start w:val="1"/>
+      <w:numFmt w:val="decimal"/>
+      <w:pStyle w:val="Heading1"/>
+      <w:lvlText w:val="%1."/>
+      <w:lvlJc w:val="left"/>
+      <w:pPr>
+        <w:ind w:left="360" w:hanging="360"/>
+      </w:pPr>
+    </w:lvl>
+    <w:lvl w:ilvl="1">
+      <w:start w:val="1"/>
+      <w:numFmt w:val="decimal"/>
+      <w:pStyle w:val="Heading2"/>
+      <w:lvlText w:val="%1.%2."/>
+      <w:lvlJc w:val="left"/>
+      <w:pPr>
+        <w:ind w:left="792" w:hanging="432"/>
+      </w:pPr>
+    </w:lvl>
+    <w:lvl w:ilvl="2">
+      <w:start w:val="1"/>
+      <w:numFmt w:val="decimal"/>
+      <w:pStyle w:val="Heading3"/>
+      <w:lvlText w:val="%1.%2.%3."/>
+      <w:lvlJc w:val="left"/>
+      <w:pPr>
+        <w:ind w:left="1224" w:hanging="504"/>
+      </w:pPr>
+    </w:lvl>
+    <w:lvl w:ilvl="3">
+      <w:start w:val="1"/>
+      <w:numFmt w:val="decimal"/>
+      <w:lvlText w:val="%1.%2.%3.%4."/>
+      <w:lvlJc w:val="left"/>
+      <w:pPr>
+        <w:ind w:left="1728" w:hanging="648"/>
+      </w:pPr>
+    </w:lvl>
+    <w:lvl w:ilvl="4">
+      <w:start w:val="1"/>
+      <w:numFmt w:val="decimal"/>
+      <w:lvlText w:val="%1.%2.%3.%4.%5."/>
+      <w:lvlJc w:val="left"/>
+      <w:pPr>
+        <w:ind w:left="2232" w:hanging="792"/>
+      </w:pPr>
+    </w:lvl>
+    <w:lvl w:ilvl="5">
+      <w:start w:val="1"/>
+      <w:numFmt w:val="decimal"/>
+      <w:lvlText w:val="%1.%2.%3.%4.%5.%6."/>
+      <w:lvlJc w:val="left"/>
+      <w:pPr>
+        <w:ind w:left="2736" w:hanging="936"/>
+      </w:pPr>
+    </w:lvl>
+    <w:lvl w:ilvl="6">
+      <w:start w:val="1"/>
+      <w:numFmt w:val="decimal"/>
+      <w:lvlText w:val="%1.%2.%3.%4.%5.%6.%7."/>
+      <w:lvlJc w:val="left"/>
+      <w:pPr>
+        <w:ind w:left="3240" w:hanging="1080"/>
+      </w:pPr>
+    </w:lvl>
+    <w:lvl w:ilvl="7">
+      <w:start w:val="1"/>
+      <w:numFmt w:val="decimal"/>
+      <w:lvlText w:val="%1.%2.%3.%4.%5.%6.%7.%8."/>
+      <w:lvlJc w:val="left"/>
+      <w:pPr>
+        <w:ind w:left="3744" w:hanging="1224"/>
+      </w:pPr>
+    </w:lvl>
+    <w:lvl w:ilvl="8">
+      <w:start w:val="1"/>
+      <w:numFmt w:val="decimal"/>
+      <w:lvlText w:val="%1.%2.%3.%4.%5.%6.%7.%8.%9."/>
+      <w:lvlJc w:val="left"/>
+      <w:pPr>
+        <w:ind w:left="4320" w:hanging="1440"/>
+      </w:pPr>
+    </w:lvl>
+  </w:abstractNum>
+  <w:abstractNum w:abstractNumId="15" w15:restartNumberingAfterBreak="0">
+    <w:nsid w:val="7FF946E0"/>
+    <w:multiLevelType w:val="multilevel"/>
+    <w:tmpl w:val="3DBE1954"/>
+    <w:lvl w:ilvl="0">
+      <w:start w:val="1"/>
+      <w:numFmt w:val="decimal"/>
+      <w:lvlText w:val="%1."/>
+      <w:lvlJc w:val="left"/>
+      <w:pPr>
+        <w:ind w:left="360" w:hanging="360"/>
+      </w:pPr>
+    </w:lvl>
+    <w:lvl w:ilvl="1">
+      <w:start w:val="1"/>
+      <w:numFmt w:val="decimal"/>
+      <w:lvlText w:val="%1.%2."/>
+      <w:lvlJc w:val="left"/>
+      <w:pPr>
+        <w:ind w:left="792" w:hanging="432"/>
+      </w:pPr>
+      <w:rPr>
+        <w:rFonts w:hint="default"/>
+      </w:rPr>
+    </w:lvl>
+    <w:lvl w:ilvl="2">
+      <w:start w:val="1"/>
+      <w:numFmt w:val="decimal"/>
+      <w:lvlText w:val="%1.%2.%3."/>
+      <w:lvlJc w:val="left"/>
+      <w:pPr>
+        <w:ind w:left="1224" w:hanging="504"/>
+      </w:pPr>
+    </w:lvl>
+    <w:lvl w:ilvl="3">
+      <w:start w:val="1"/>
+      <w:numFmt w:val="decimal"/>
+      <w:lvlText w:val="%1.%2.%3.%4."/>
+      <w:lvlJc w:val="left"/>
+      <w:pPr>
+        <w:ind w:left="1728" w:hanging="648"/>
+      </w:pPr>
+    </w:lvl>
+    <w:lvl w:ilvl="4">
+      <w:start w:val="1"/>
+      <w:numFmt w:val="decimal"/>
+      <w:lvlText w:val="%1.%2.%3.%4.%5."/>
+      <w:lvlJc w:val="left"/>
+      <w:pPr>
+        <w:ind w:left="2232" w:hanging="792"/>
+      </w:pPr>
+    </w:lvl>
+    <w:lvl w:ilvl="5">
+      <w:start w:val="1"/>
+      <w:numFmt w:val="decimal"/>
+      <w:lvlText w:val="%1.%2.%3.%4.%5.%6."/>
+      <w:lvlJc w:val="left"/>
+      <w:pPr>
+        <w:ind w:left="2736" w:hanging="936"/>
+      </w:pPr>
+    </w:lvl>
+    <w:lvl w:ilvl="6">
+      <w:start w:val="1"/>
+      <w:numFmt w:val="decimal"/>
+      <w:lvlText w:val="%1.%2.%3.%4.%5.%6.%7."/>
+      <w:lvlJc w:val="left"/>
+      <w:pPr>
+        <w:ind w:left="3240" w:hanging="1080"/>
+      </w:pPr>
+    </w:lvl>
+    <w:lvl w:ilvl="7">
+      <w:start w:val="1"/>
+      <w:numFmt w:val="decimal"/>
+      <w:lvlText w:val="%1.%2.%3.%4.%5.%6.%7.%8."/>
+      <w:lvlJc w:val="left"/>
+      <w:pPr>
+        <w:ind w:left="3744" w:hanging="1224"/>
+      </w:pPr>
+    </w:lvl>
+    <w:lvl w:ilvl="8">
+      <w:start w:val="1"/>
+      <w:numFmt w:val="decimal"/>
+      <w:lvlText w:val="%1.%2.%3.%4.%5.%6.%7.%8.%9."/>
+      <w:lvlJc w:val="left"/>
+      <w:pPr>
+        <w:ind w:left="4320" w:hanging="1440"/>
+      </w:pPr>
+    </w:lvl>
+  </w:abstractNum>
   <w:abstractNum w:abstractNumId="990">
-    <w:nsid w:val="e1e25e01"/>
+    <w:nsid w:val="aec76738"/>
     <w:multiLevelType w:val="multilevel"/>
     <w:lvl w:ilvl="0">
       <w:numFmt w:val="bullet"/>
@@ -4905,7 +6004,7 @@
     </w:lvl>
   </w:abstractNum>
   <w:abstractNum w:abstractNumId="99731">
-    <w:nsid w:val="406387fc"/>
+    <w:nsid w:val="7a1c10de"/>
     <w:multiLevelType w:val="multilevel"/>
     <w:lvl w:ilvl="0">
       <w:start w:val="1"/>
@@ -4993,7 +6092,7 @@
     </w:lvl>
   </w:abstractNum>
   <w:abstractNum w:abstractNumId="99411">
-    <w:nsid w:val="f627fc47"/>
+    <w:nsid w:val="1f4671c4"/>
     <w:multiLevelType w:val="multilevel"/>
     <w:lvl w:ilvl="0">
       <w:start w:val="1"/>
@@ -5081,7 +6180,7 @@
     </w:lvl>
   </w:abstractNum>
   <w:abstractNum w:abstractNumId="99711">
-    <w:nsid w:val="44494e6e"/>
+    <w:nsid w:val="d21a52b7"/>
     <w:multiLevelType w:val="multilevel"/>
     <w:lvl w:ilvl="0">
       <w:start w:val="1"/>
@@ -5172,7 +6271,7 @@
     <w:abstractNumId w:val="0"/>
   </w:num>
   <w:num w:numId="2">
-    <w:abstractNumId w:val="12"/>
+    <w:abstractNumId w:val="13"/>
   </w:num>
   <w:num w:numId="3">
     <w:abstractNumId w:val="1"/>
@@ -5227,6 +6326,15 @@
   </w:num>
   <w:num w:numId="13">
     <w:abstractNumId w:val="2"/>
+  </w:num>
+  <w:num w:numId="14">
+    <w:abstractNumId w:val="15"/>
+  </w:num>
+  <w:num w:numId="15">
+    <w:abstractNumId w:val="12"/>
+  </w:num>
+  <w:num w:numId="16">
+    <w:abstractNumId w:val="14"/>
   </w:num>
   <w:num w:numId="1000">
     <w:abstractNumId w:val="990"/>
@@ -5352,9 +6460,9 @@
     <w:lsdException w:name="index 7" w:semiHidden="1" w:unhideWhenUsed="1"/>
     <w:lsdException w:name="index 8" w:semiHidden="1" w:unhideWhenUsed="1"/>
     <w:lsdException w:name="index 9" w:semiHidden="1" w:unhideWhenUsed="1"/>
-    <w:lsdException w:name="toc 1" w:semiHidden="1" w:unhideWhenUsed="1"/>
-    <w:lsdException w:name="toc 2" w:semiHidden="1" w:unhideWhenUsed="1"/>
-    <w:lsdException w:name="toc 3" w:semiHidden="1" w:unhideWhenUsed="1"/>
+    <w:lsdException w:name="toc 1" w:semiHidden="1" w:uiPriority="39" w:unhideWhenUsed="1"/>
+    <w:lsdException w:name="toc 2" w:semiHidden="1" w:uiPriority="39" w:unhideWhenUsed="1"/>
+    <w:lsdException w:name="toc 3" w:semiHidden="1" w:uiPriority="39" w:unhideWhenUsed="1"/>
     <w:lsdException w:name="toc 4" w:semiHidden="1" w:unhideWhenUsed="1"/>
     <w:lsdException w:name="toc 5" w:semiHidden="1" w:unhideWhenUsed="1"/>
     <w:lsdException w:name="toc 6" w:semiHidden="1" w:unhideWhenUsed="1"/>
@@ -5412,6 +6520,7 @@
     <w:lsdException w:name="Body Text 2" w:semiHidden="1" w:unhideWhenUsed="1"/>
     <w:lsdException w:name="Body Text 3" w:semiHidden="1" w:unhideWhenUsed="1"/>
     <w:lsdException w:name="Body Text Indent 2" w:semiHidden="1" w:unhideWhenUsed="1"/>
+    <w:lsdException w:name="Hyperlink" w:uiPriority="99"/>
     <w:lsdException w:name="Document Map" w:semiHidden="1" w:unhideWhenUsed="1"/>
     <w:lsdException w:name="Plain Text" w:semiHidden="1" w:unhideWhenUsed="1"/>
     <w:lsdException w:name="E-mail Signature" w:semiHidden="1" w:unhideWhenUsed="1"/>
@@ -5579,7 +6688,7 @@
     <w:lsdException w:name="Colorful List Accent 6"/>
     <w:lsdException w:name="Colorful Grid Accent 6"/>
     <w:lsdException w:name="Bibliography" w:semiHidden="1" w:unhideWhenUsed="1"/>
-    <w:lsdException w:name="TOC Heading" w:semiHidden="1" w:unhideWhenUsed="1"/>
+    <w:lsdException w:name="TOC Heading" w:semiHidden="1" w:uiPriority="39" w:unhideWhenUsed="1" w:qFormat="1"/>
     <w:lsdException w:name="Grid Table 4" w:uiPriority="49"/>
     <w:lsdException w:name="Grid Table 5 Dark" w:uiPriority="50"/>
     <w:lsdException w:name="Grid Table 6 Colorful" w:uiPriority="51"/>
@@ -5679,75 +6788,71 @@
   <w:style w:type="paragraph" w:default="1" w:styleId="Normal">
     <w:name w:val="Normal"/>
     <w:qFormat/>
-    <w:rsid w:val="001E1662"/>
+    <w:rsid w:val="00692E43"/>
     <w:rPr>
-      <w:rFonts w:ascii="Calibri" w:hAnsi="Calibri"/>
-      <w:sz w:val="22"/>
+      <w:rFonts w:ascii="Times New Roman" w:hAnsi="Times New Roman" w:cs="Times New Roman"/>
     </w:rPr>
   </w:style>
   <w:style w:type="paragraph" w:styleId="Heading1">
     <w:name w:val="heading 1"/>
-    <w:basedOn w:val="Normal"/>
+    <w:basedOn w:val="BodyText"/>
     <w:next w:val="BodyText"/>
     <w:uiPriority w:val="9"/>
     <w:qFormat/>
-    <w:rsid w:val="001420C2"/>
+    <w:rsid w:val="007C15FC"/>
     <w:pPr>
-      <w:keepNext/>
-      <w:keepLines/>
-      <w:spacing w:before="480" w:after="0"/>
+      <w:numPr>
+        <w:numId w:val="16"/>
+      </w:numPr>
+      <w:ind w:left="720" w:hanging="720"/>
+      <w:jc w:val="center"/>
       <w:outlineLvl w:val="0"/>
     </w:pPr>
     <w:rPr>
-      <w:rFonts w:ascii="Calibri Light" w:eastAsiaTheme="majorEastAsia" w:hAnsi="Calibri Light" w:cstheme="majorBidi"/>
-      <w:bCs/>
-      <w:color w:val="365F91" w:themeColor="accent1" w:themeShade="BF"/>
-      <w:sz w:val="32"/>
-      <w:szCs w:val="32"/>
+      <w:rFonts w:ascii="Times New Roman Bold" w:hAnsi="Times New Roman Bold"/>
+      <w:b/>
+      <w:smallCaps/>
+      <w:sz w:val="28"/>
     </w:rPr>
   </w:style>
   <w:style w:type="paragraph" w:styleId="Heading2">
     <w:name w:val="heading 2"/>
-    <w:basedOn w:val="Normal"/>
+    <w:basedOn w:val="BodyText"/>
     <w:next w:val="BodyText"/>
     <w:uiPriority w:val="9"/>
     <w:unhideWhenUsed/>
     <w:qFormat/>
-    <w:rsid w:val="001E1662"/>
+    <w:rsid w:val="00BA46C4"/>
     <w:pPr>
-      <w:keepNext/>
-      <w:keepLines/>
-      <w:spacing w:before="200" w:after="0"/>
+      <w:numPr>
+        <w:ilvl w:val="1"/>
+        <w:numId w:val="16"/>
+      </w:numPr>
+      <w:ind w:left="720" w:hanging="720"/>
       <w:outlineLvl w:val="1"/>
     </w:pPr>
     <w:rPr>
-      <w:rFonts w:ascii="Calibri Light" w:eastAsiaTheme="majorEastAsia" w:hAnsi="Calibri Light" w:cstheme="majorBidi"/>
-      <w:bCs/>
-      <w:color w:val="4F81BD" w:themeColor="accent1"/>
-      <w:sz w:val="26"/>
-      <w:szCs w:val="32"/>
+      <w:b/>
     </w:rPr>
   </w:style>
   <w:style w:type="paragraph" w:styleId="Heading3">
     <w:name w:val="heading 3"/>
-    <w:basedOn w:val="Normal"/>
+    <w:basedOn w:val="BodyText"/>
     <w:next w:val="BodyText"/>
     <w:uiPriority w:val="9"/>
     <w:unhideWhenUsed/>
     <w:qFormat/>
-    <w:rsid w:val="00AA291A"/>
+    <w:rsid w:val="00BA46C4"/>
     <w:pPr>
-      <w:keepNext/>
-      <w:keepLines/>
-      <w:spacing w:before="200" w:after="0"/>
+      <w:numPr>
+        <w:ilvl w:val="2"/>
+        <w:numId w:val="16"/>
+      </w:numPr>
+      <w:ind w:left="360" w:hanging="360"/>
       <w:outlineLvl w:val="2"/>
     </w:pPr>
     <w:rPr>
-      <w:rFonts w:ascii="Calibri Light" w:eastAsiaTheme="majorEastAsia" w:hAnsi="Calibri Light" w:cstheme="majorBidi"/>
-      <w:bCs/>
-      <w:color w:val="000000" w:themeColor="text1"/>
-      <w:sz w:val="24"/>
-      <w:szCs w:val="28"/>
+      <w:b/>
     </w:rPr>
   </w:style>
   <w:style w:type="paragraph" w:styleId="Heading4">
@@ -5768,7 +6873,6 @@
       <w:b/>
       <w:bCs/>
       <w:color w:val="4F81BD" w:themeColor="accent1"/>
-      <w:sz w:val="24"/>
     </w:rPr>
   </w:style>
   <w:style w:type="paragraph" w:styleId="Heading5">
@@ -5789,7 +6893,6 @@
       <w:i/>
       <w:iCs/>
       <w:color w:val="4F81BD" w:themeColor="accent1"/>
-      <w:sz w:val="24"/>
     </w:rPr>
   </w:style>
   <w:style w:type="paragraph" w:styleId="Heading6">
@@ -5799,16 +6902,17 @@
     <w:uiPriority w:val="9"/>
     <w:unhideWhenUsed/>
     <w:qFormat/>
+    <w:rsid w:val="000A6317"/>
     <w:pPr>
       <w:keepNext/>
       <w:keepLines/>
-      <w:spacing w:before="200" w:after="0"/>
+      <w:pageBreakBefore/>
+      <w:spacing w:before="200" w:after="0" w:line="20" w:lineRule="exact"/>
       <w:outlineLvl w:val="5"/>
     </w:pPr>
     <w:rPr>
       <w:rFonts w:asciiTheme="majorHAnsi" w:eastAsiaTheme="majorEastAsia" w:hAnsiTheme="majorHAnsi" w:cstheme="majorBidi"/>
       <w:color w:val="4F81BD" w:themeColor="accent1"/>
-      <w:sz w:val="24"/>
     </w:rPr>
   </w:style>
   <w:style w:type="character" w:default="1" w:styleId="DefaultParagraphFont">
@@ -5857,7 +6961,7 @@
     <w:name w:val="Compact"/>
     <w:basedOn w:val="Normal"/>
     <w:qFormat/>
-    <w:rsid w:val="00004639"/>
+    <w:rsid w:val="007F69CC"/>
     <w:pPr>
       <w:spacing w:after="0"/>
     </w:pPr>
@@ -5867,7 +6971,7 @@
     <w:basedOn w:val="Normal"/>
     <w:next w:val="BodyText"/>
     <w:qFormat/>
-    <w:rsid w:val="00EC3164"/>
+    <w:rsid w:val="00692E43"/>
     <w:pPr>
       <w:keepNext/>
       <w:keepLines/>
@@ -5876,8 +6980,8 @@
     </w:pPr>
     <w:rPr>
       <w:rFonts w:ascii="Calibri Light" w:eastAsiaTheme="majorEastAsia" w:hAnsi="Calibri Light" w:cstheme="majorBidi"/>
+      <w:b/>
       <w:bCs/>
-      <w:color w:val="345A8A" w:themeColor="accent1" w:themeShade="B5"/>
       <w:sz w:val="36"/>
       <w:szCs w:val="36"/>
     </w:rPr>
@@ -5887,33 +6991,45 @@
     <w:basedOn w:val="Title"/>
     <w:next w:val="BodyText"/>
     <w:qFormat/>
+    <w:rsid w:val="00753316"/>
     <w:pPr>
-      <w:spacing w:before="240"/>
+      <w:spacing w:after="480"/>
     </w:pPr>
     <w:rPr>
-      <w:sz w:val="30"/>
-      <w:szCs w:val="30"/>
+      <w:rFonts w:ascii="Times New Roman" w:hAnsi="Times New Roman" w:cs="Times New Roman"/>
+      <w:sz w:val="24"/>
+      <w:szCs w:val="24"/>
     </w:rPr>
   </w:style>
   <w:style w:type="paragraph" w:customStyle="1" w:styleId="Author">
     <w:name w:val="Author"/>
     <w:next w:val="BodyText"/>
     <w:qFormat/>
+    <w:rsid w:val="006523FE"/>
     <w:pPr>
       <w:keepNext/>
       <w:keepLines/>
+      <w:spacing w:before="720" w:after="720"/>
       <w:jc w:val="center"/>
     </w:pPr>
+    <w:rPr>
+      <w:rFonts w:ascii="Times New Roman" w:hAnsi="Times New Roman" w:cs="Times New Roman"/>
+      <w:b/>
+    </w:rPr>
   </w:style>
   <w:style w:type="paragraph" w:styleId="Date">
     <w:name w:val="Date"/>
+    <w:basedOn w:val="BodyText"/>
     <w:next w:val="BodyText"/>
     <w:qFormat/>
+    <w:rsid w:val="006523FE"/>
     <w:pPr>
-      <w:keepNext/>
-      <w:keepLines/>
+      <w:spacing w:before="360" w:after="720"/>
       <w:jc w:val="center"/>
     </w:pPr>
+    <w:rPr>
+      <w:b/>
+    </w:rPr>
   </w:style>
   <w:style w:type="paragraph" w:customStyle="1" w:styleId="Abstract">
     <w:name w:val="Abstract"/>
@@ -6033,6 +7149,7 @@
   <w:style w:type="character" w:styleId="Hyperlink">
     <w:name w:val="Hyperlink"/>
     <w:basedOn w:val="CaptionChar"/>
+    <w:uiPriority w:val="99"/>
     <w:rPr>
       <w:color w:val="4F81BD" w:themeColor="accent1"/>
     </w:rPr>
@@ -6044,14 +7161,17 @@
     <w:uiPriority w:val="39"/>
     <w:unhideWhenUsed/>
     <w:qFormat/>
+    <w:rsid w:val="0069254A"/>
     <w:pPr>
+      <w:pageBreakBefore/>
+      <w:numPr>
+        <w:numId w:val="0"/>
+      </w:numPr>
       <w:spacing w:before="240" w:line="259" w:lineRule="auto"/>
       <w:outlineLvl w:val="9"/>
     </w:pPr>
     <w:rPr>
-      <w:rFonts w:asciiTheme="majorHAnsi" w:hAnsiTheme="majorHAnsi"/>
-      <w:b/>
-      <w:bCs w:val="0"/>
+      <w:bCs/>
     </w:rPr>
   </w:style>
   <w:style w:type="paragraph" w:customStyle="1" w:styleId="SourceCode">
@@ -6435,6 +7555,72 @@
       </w:tcPr>
     </w:tblStylePr>
   </w:style>
+  <w:style w:type="paragraph" w:styleId="BalloonText">
+    <w:name w:val="Balloon Text"/>
+    <w:basedOn w:val="Normal"/>
+    <w:link w:val="BalloonTextChar"/>
+    <w:semiHidden/>
+    <w:unhideWhenUsed/>
+    <w:rsid w:val="00692E43"/>
+    <w:pPr>
+      <w:spacing w:after="0"/>
+    </w:pPr>
+    <w:rPr>
+      <w:rFonts w:ascii="Segoe UI" w:hAnsi="Segoe UI" w:cs="Segoe UI"/>
+      <w:sz w:val="18"/>
+      <w:szCs w:val="18"/>
+    </w:rPr>
+  </w:style>
+  <w:style w:type="character" w:customStyle="1" w:styleId="BalloonTextChar">
+    <w:name w:val="Balloon Text Char"/>
+    <w:basedOn w:val="DefaultParagraphFont"/>
+    <w:link w:val="BalloonText"/>
+    <w:semiHidden/>
+    <w:rsid w:val="00692E43"/>
+    <w:rPr>
+      <w:rFonts w:ascii="Segoe UI" w:hAnsi="Segoe UI" w:cs="Segoe UI"/>
+      <w:sz w:val="18"/>
+      <w:szCs w:val="18"/>
+    </w:rPr>
+  </w:style>
+  <w:style w:type="paragraph" w:styleId="TOC1">
+    <w:name w:val="toc 1"/>
+    <w:basedOn w:val="Normal"/>
+    <w:next w:val="Normal"/>
+    <w:autoRedefine/>
+    <w:uiPriority w:val="39"/>
+    <w:unhideWhenUsed/>
+    <w:rsid w:val="000F4EDA"/>
+    <w:pPr>
+      <w:spacing w:after="100"/>
+    </w:pPr>
+  </w:style>
+  <w:style w:type="paragraph" w:styleId="TOC2">
+    <w:name w:val="toc 2"/>
+    <w:basedOn w:val="Normal"/>
+    <w:next w:val="Normal"/>
+    <w:autoRedefine/>
+    <w:uiPriority w:val="39"/>
+    <w:unhideWhenUsed/>
+    <w:rsid w:val="000F4EDA"/>
+    <w:pPr>
+      <w:spacing w:after="100"/>
+      <w:ind w:left="240"/>
+    </w:pPr>
+  </w:style>
+  <w:style w:type="paragraph" w:styleId="TOC3">
+    <w:name w:val="toc 3"/>
+    <w:basedOn w:val="Normal"/>
+    <w:next w:val="Normal"/>
+    <w:autoRedefine/>
+    <w:uiPriority w:val="39"/>
+    <w:unhideWhenUsed/>
+    <w:rsid w:val="000F4EDA"/>
+    <w:pPr>
+      <w:spacing w:after="100"/>
+      <w:ind w:left="480"/>
+    </w:pPr>
+  </w:style>
 </w:styles>
 </file>
 

</xml_diff>

<commit_message>
Mid-day edits to text and code
</commit_message>
<xml_diff>
--- a/MA_Report.docx
+++ b/MA_Report.docx
@@ -3831,12 +3831,12 @@
     </w:tbl>
     <w:p>
       <w:pPr>
-        <w:pStyle w:val="Heading2"/>
-      </w:pPr>
-      <w:bookmarkStart w:id="31" w:name="h1b"/>
+        <w:pStyle w:val="Heading3"/>
+      </w:pPr>
+      <w:bookmarkStart w:id="31" w:name="h1b-activation-at-site-of-dsfs"/>
       <w:bookmarkEnd w:id="31"/>
       <w:r>
-        <w:t xml:space="preserve">H1B</w:t>
+        <w:t xml:space="preserve">H1B: Activation at site of DSFS</w:t>
       </w:r>
     </w:p>
     <w:p>
@@ -4524,7 +4524,7 @@
           <w:p>
             <w:pPr>
               <w:pStyle w:val="Compact"/>
-              <w:jc w:val="right"/>
+              <w:jc w:val="left"/>
             </w:pPr>
             <w:r>
               <w:t xml:space="preserve">Estimate</w:t>
@@ -4541,7 +4541,7 @@
           <w:p>
             <w:pPr>
               <w:pStyle w:val="Compact"/>
-              <w:jc w:val="right"/>
+              <w:jc w:val="left"/>
             </w:pPr>
             <w:r>
               <w:t xml:space="preserve">Std. Error</w:t>
@@ -4558,7 +4558,7 @@
           <w:p>
             <w:pPr>
               <w:pStyle w:val="Compact"/>
-              <w:jc w:val="right"/>
+              <w:jc w:val="left"/>
             </w:pPr>
             <w:r>
               <w:t xml:space="preserve">t value</w:t>
@@ -4574,15 +4574,15 @@
               <w:jc w:val="left"/>
             </w:pPr>
             <w:r>
-              <w:t xml:space="preserve">(Intercept)</w:t>
-            </w:r>
-          </w:p>
-        </w:tc>
-        <w:tc>
-          <w:p>
-            <w:pPr>
-              <w:pStyle w:val="Compact"/>
-              <w:jc w:val="right"/>
+              <w:t xml:space="preserve">Overall Effect</w:t>
+            </w:r>
+          </w:p>
+        </w:tc>
+        <w:tc>
+          <w:p>
+            <w:pPr>
+              <w:pStyle w:val="Compact"/>
+              <w:jc w:val="left"/>
             </w:pPr>
             <w:r>
               <w:t xml:space="preserve">-0.584</w:t>
@@ -4593,7 +4593,7 @@
           <w:p>
             <w:pPr>
               <w:pStyle w:val="Compact"/>
-              <w:jc w:val="right"/>
+              <w:jc w:val="left"/>
             </w:pPr>
             <w:r>
               <w:t xml:space="preserve">0.562</w:t>
@@ -4604,7 +4604,7 @@
           <w:p>
             <w:pPr>
               <w:pStyle w:val="Compact"/>
-              <w:jc w:val="right"/>
+              <w:jc w:val="left"/>
             </w:pPr>
             <w:r>
               <w:t xml:space="preserve">-1.038</w:t>
@@ -4628,7 +4628,7 @@
           <w:p>
             <w:pPr>
               <w:pStyle w:val="Compact"/>
-              <w:jc w:val="right"/>
+              <w:jc w:val="left"/>
             </w:pPr>
             <w:r>
               <w:t xml:space="preserve">-2.862</w:t>
@@ -4639,7 +4639,7 @@
           <w:p>
             <w:pPr>
               <w:pStyle w:val="Compact"/>
-              <w:jc w:val="right"/>
+              <w:jc w:val="left"/>
             </w:pPr>
             <w:r>
               <w:t xml:space="preserve">0.406</w:t>
@@ -4650,29 +4650,156 @@
           <w:p>
             <w:pPr>
               <w:pStyle w:val="Compact"/>
-              <w:jc w:val="right"/>
+              <w:jc w:val="left"/>
             </w:pPr>
             <w:r>
               <w:t xml:space="preserve">-7.046</w:t>
             </w:r>
+          </w:p>
+        </w:tc>
+      </w:tr>
+      <w:tr>
+        <w:tc>
+          <w:p>
+            <w:pPr>
+              <w:pStyle w:val="Compact"/>
+              <w:jc w:val="left"/>
+            </w:pPr>
+            <w:r>
+              <w:t xml:space="preserve">Vehicle Type Effects:</w:t>
+            </w:r>
+          </w:p>
+        </w:tc>
+        <w:tc>
+          <w:p>
+            <w:pStyle w:val="Compact"/>
+          </w:p>
+        </w:tc>
+        <w:tc>
+          <w:p>
+            <w:pStyle w:val="Compact"/>
+          </w:p>
+        </w:tc>
+        <w:tc>
+          <w:p>
+            <w:pStyle w:val="Compact"/>
+          </w:p>
+        </w:tc>
+      </w:tr>
+      <w:tr>
+        <w:tc>
+          <w:p>
+            <w:pPr>
+              <w:pStyle w:val="Compact"/>
+              <w:jc w:val="left"/>
+            </w:pPr>
+            <w:r>
+              <w:t xml:space="preserve">Unspecified</w:t>
+            </w:r>
+          </w:p>
+        </w:tc>
+        <w:tc>
+          <w:p>
+            <w:pPr>
+              <w:pStyle w:val="Compact"/>
+              <w:jc w:val="left"/>
+            </w:pPr>
+            <w:r>
+              <w:t xml:space="preserve">-0.54</w:t>
+            </w:r>
+          </w:p>
+        </w:tc>
+        <w:tc>
+          <w:p>
+            <w:pStyle w:val="Compact"/>
+          </w:p>
+        </w:tc>
+        <w:tc>
+          <w:p>
+            <w:pStyle w:val="Compact"/>
+          </w:p>
+        </w:tc>
+      </w:tr>
+      <w:tr>
+        <w:tc>
+          <w:p>
+            <w:pPr>
+              <w:pStyle w:val="Compact"/>
+              <w:jc w:val="left"/>
+            </w:pPr>
+            <w:r>
+              <w:t xml:space="preserve">Car</w:t>
+            </w:r>
+          </w:p>
+        </w:tc>
+        <w:tc>
+          <w:p>
+            <w:pPr>
+              <w:pStyle w:val="Compact"/>
+              <w:jc w:val="left"/>
+            </w:pPr>
+            <w:r>
+              <w:t xml:space="preserve">-1.1</w:t>
+            </w:r>
+          </w:p>
+        </w:tc>
+        <w:tc>
+          <w:p>
+            <w:pStyle w:val="Compact"/>
+          </w:p>
+        </w:tc>
+        <w:tc>
+          <w:p>
+            <w:pStyle w:val="Compact"/>
+          </w:p>
+        </w:tc>
+      </w:tr>
+      <w:tr>
+        <w:tc>
+          <w:p>
+            <w:pPr>
+              <w:pStyle w:val="Compact"/>
+              <w:jc w:val="left"/>
+            </w:pPr>
+            <w:r>
+              <w:t xml:space="preserve">Truck</w:t>
+            </w:r>
+          </w:p>
+        </w:tc>
+        <w:tc>
+          <w:p>
+            <w:pPr>
+              <w:pStyle w:val="Compact"/>
+              <w:jc w:val="left"/>
+            </w:pPr>
+            <w:r>
+              <w:t xml:space="preserve">-0.11</w:t>
+            </w:r>
+          </w:p>
+        </w:tc>
+        <w:tc>
+          <w:p>
+            <w:pStyle w:val="Compact"/>
+          </w:p>
+        </w:tc>
+        <w:tc>
+          <w:p>
+            <w:pStyle w:val="Compact"/>
           </w:p>
         </w:tc>
       </w:tr>
     </w:tbl>
     <w:p>
       <w:pPr>
-        <w:pStyle w:val="SourceCode"/>
-      </w:pPr>
-      <w:r>
-        <w:rPr>
-          <w:rStyle w:val="VerbatimChar"/>
-        </w:rPr>
-        <w:t xml:space="preserve">## Computing p-values via Kenward-Roger approximation. Use `p.kr = FALSE` if computation takes too long.</w:t>
+        <w:pStyle w:val="BodyText"/>
+      </w:pPr>
+      <w:r>
+        <w:t xml:space="preserve">Visual</w:t>
       </w:r>
     </w:p>
     <w:p>
       <w:pPr>
-        <w:pStyle w:val="FigureWithCaption"/>
+        <w:pStyle w:val="BodyText"/>
       </w:pPr>
       <w:r>
         <w:drawing>
@@ -4716,417 +4843,59 @@
           </wp:inline>
         </w:drawing>
       </w:r>
-    </w:p>
-    <w:p>
-      <w:pPr>
-        <w:pStyle w:val="ImageCaption"/>
-      </w:pPr>
-      <w:r>
-        <w:t xml:space="preserve">Plot of effect sizes for hypothesis H1B, effect of DSFS adjacent to sign site.</w:t>
-      </w:r>
-    </w:p>
-    <w:p>
-      <w:pPr>
-        <w:pStyle w:val="Heading2"/>
-      </w:pPr>
-      <w:bookmarkStart w:id="33" w:name="h1c"/>
-      <w:bookmarkEnd w:id="33"/>
-      <w:r>
-        <w:t xml:space="preserve">H1C</w:t>
-      </w:r>
-    </w:p>
-    <w:p>
-      <w:pPr>
-        <w:pStyle w:val="FirstParagraph"/>
-      </w:pPr>
-      <w:r>
-        <w:t xml:space="preserve">The difference between speeds upstream and adjacent to DSFS were surprisingly large, with large decreases in speed detected in several studies which did not differentiate by vehicle type (Hallmark et al. 2007, Reddy et al. 2008, and Roberts et al. 2012). The mean upstream-adjacent effect size for DSFS activation across all studies was -2.73 mph.</w:t>
-      </w:r>
-    </w:p>
-    <w:p>
-      <w:pPr>
-        <w:pStyle w:val="TableCaption"/>
-      </w:pPr>
-      <w:r>
-        <w:t xml:space="preserve">Decreases in speed for Hypothesis H1C, activation effect of DSFS downstream, by vehicle type.</w:t>
-      </w:r>
-    </w:p>
-    <w:tbl>
-      <w:tblPr>
-        <w:tblStyle w:val="TableNormal"/>
-        <w:tblW w:type="pct" w:w="0.0"/>
-        <w:tblLook w:firstRow="1"/>
-        <w:tblCaption w:val="Decreases in speed for Hypothesis H1C, activation effect of DSFS downstream, by vehicle type."/>
-      </w:tblPr>
-      <w:tblGrid/>
-      <w:tr>
-        <w:trPr>
-          <w:cnfStyle w:firstRow="1"/>
-        </w:trPr>
-        <w:tc>
-          <w:tcPr>
-            <w:tcBorders>
-              <w:bottom w:val="single"/>
-            </w:tcBorders>
-            <w:vAlign w:val="bottom"/>
-          </w:tcPr>
-          <w:p>
-            <w:pPr>
-              <w:pStyle w:val="Compact"/>
-              <w:jc w:val="left"/>
-            </w:pPr>
-            <w:r>
-              <w:t xml:space="preserve">Vehicle Type</w:t>
-            </w:r>
-          </w:p>
-        </w:tc>
-        <w:tc>
-          <w:tcPr>
-            <w:tcBorders>
-              <w:bottom w:val="single"/>
-            </w:tcBorders>
-            <w:vAlign w:val="bottom"/>
-          </w:tcPr>
-          <w:p>
-            <w:pPr>
-              <w:pStyle w:val="Compact"/>
-              <w:jc w:val="right"/>
-            </w:pPr>
-            <w:r>
-              <w:t xml:space="preserve">Effect size yi</w:t>
-            </w:r>
-          </w:p>
-        </w:tc>
-        <w:tc>
-          <w:tcPr>
-            <w:tcBorders>
-              <w:bottom w:val="single"/>
-            </w:tcBorders>
-            <w:vAlign w:val="bottom"/>
-          </w:tcPr>
-          <w:p>
-            <w:pPr>
-              <w:pStyle w:val="Compact"/>
-              <w:jc w:val="right"/>
-            </w:pPr>
-            <w:r>
-              <w:t xml:space="preserve">Variance vi</w:t>
-            </w:r>
-          </w:p>
-        </w:tc>
-        <w:tc>
-          <w:tcPr>
-            <w:tcBorders>
-              <w:bottom w:val="single"/>
-            </w:tcBorders>
-            <w:vAlign w:val="bottom"/>
-          </w:tcPr>
-          <w:p>
-            <w:pPr>
-              <w:pStyle w:val="Compact"/>
-              <w:jc w:val="right"/>
-            </w:pPr>
-            <w:r>
-              <w:t xml:space="preserve">N</w:t>
-            </w:r>
-          </w:p>
-        </w:tc>
-      </w:tr>
-      <w:tr>
-        <w:tc>
-          <w:p>
-            <w:pPr>
-              <w:pStyle w:val="Compact"/>
-              <w:jc w:val="left"/>
-            </w:pPr>
-            <w:r>
-              <w:t xml:space="preserve">Unspecified</w:t>
-            </w:r>
-          </w:p>
-        </w:tc>
-        <w:tc>
-          <w:p>
-            <w:pPr>
-              <w:pStyle w:val="Compact"/>
-              <w:jc w:val="right"/>
-            </w:pPr>
-            <w:r>
-              <w:t xml:space="preserve">-11.128</w:t>
-            </w:r>
-          </w:p>
-        </w:tc>
-        <w:tc>
-          <w:p>
-            <w:pPr>
-              <w:pStyle w:val="Compact"/>
-              <w:jc w:val="right"/>
-            </w:pPr>
-            <w:r>
-              <w:t xml:space="preserve">0.070</w:t>
-            </w:r>
-          </w:p>
-        </w:tc>
-        <w:tc>
-          <w:p>
-            <w:pPr>
-              <w:pStyle w:val="Compact"/>
-              <w:jc w:val="right"/>
-            </w:pPr>
-            <w:r>
-              <w:t xml:space="preserve">31</w:t>
-            </w:r>
-          </w:p>
-        </w:tc>
-      </w:tr>
-      <w:tr>
-        <w:tc>
-          <w:p>
-            <w:pPr>
-              <w:pStyle w:val="Compact"/>
-              <w:jc w:val="left"/>
-            </w:pPr>
-            <w:r>
-              <w:t xml:space="preserve">Passenger</w:t>
-            </w:r>
-          </w:p>
-        </w:tc>
-        <w:tc>
-          <w:p>
-            <w:pPr>
-              <w:pStyle w:val="Compact"/>
-              <w:jc w:val="right"/>
-            </w:pPr>
-            <w:r>
-              <w:t xml:space="preserve">-1.704</w:t>
-            </w:r>
-          </w:p>
-        </w:tc>
-        <w:tc>
-          <w:p>
-            <w:pPr>
-              <w:pStyle w:val="Compact"/>
-              <w:jc w:val="right"/>
-            </w:pPr>
-            <w:r>
-              <w:t xml:space="preserve">1.585</w:t>
-            </w:r>
-          </w:p>
-        </w:tc>
-        <w:tc>
-          <w:p>
-            <w:pPr>
-              <w:pStyle w:val="Compact"/>
-              <w:jc w:val="right"/>
-            </w:pPr>
-            <w:r>
-              <w:t xml:space="preserve">16</w:t>
-            </w:r>
-          </w:p>
-        </w:tc>
-      </w:tr>
-      <w:tr>
-        <w:tc>
-          <w:p>
-            <w:pPr>
-              <w:pStyle w:val="Compact"/>
-              <w:jc w:val="left"/>
-            </w:pPr>
-            <w:r>
-              <w:t xml:space="preserve">Truck</w:t>
-            </w:r>
-          </w:p>
-        </w:tc>
-        <w:tc>
-          <w:p>
-            <w:pPr>
-              <w:pStyle w:val="Compact"/>
-              <w:jc w:val="right"/>
-            </w:pPr>
-            <w:r>
-              <w:t xml:space="preserve">-1.424</w:t>
-            </w:r>
-          </w:p>
-        </w:tc>
-        <w:tc>
-          <w:p>
-            <w:pPr>
-              <w:pStyle w:val="Compact"/>
-              <w:jc w:val="right"/>
-            </w:pPr>
-            <w:r>
-              <w:t xml:space="preserve">2.920</w:t>
-            </w:r>
-          </w:p>
-        </w:tc>
-        <w:tc>
-          <w:p>
-            <w:pPr>
-              <w:pStyle w:val="Compact"/>
-              <w:jc w:val="right"/>
-            </w:pPr>
-            <w:r>
-              <w:t xml:space="preserve">25</w:t>
-            </w:r>
-          </w:p>
-        </w:tc>
-      </w:tr>
-    </w:tbl>
-    <w:p>
-      <w:pPr>
-        <w:pStyle w:val="TableCaption"/>
-      </w:pPr>
-      <w:r>
-        <w:t xml:space="preserve">Summary of mixed effect model of hypothesis H1C, difference in speeds between DSFS upstream and adjacent to the sign.</w:t>
-      </w:r>
-    </w:p>
-    <w:tbl>
-      <w:tblPr>
-        <w:tblStyle w:val="TableNormal"/>
-        <w:tblW w:type="pct" w:w="0.0"/>
-        <w:tblLook w:firstRow="1"/>
-        <w:tblCaption w:val="Summary of mixed effect model of hypothesis H1C, difference in speeds between DSFS upstream and adjacent to the sign."/>
-      </w:tblPr>
-      <w:tblGrid/>
-      <w:tr>
-        <w:trPr>
-          <w:cnfStyle w:firstRow="1"/>
-        </w:trPr>
-        <w:tc>
-          <w:tcPr>
-            <w:tcBorders>
-              <w:bottom w:val="single"/>
-            </w:tcBorders>
-            <w:vAlign w:val="bottom"/>
-          </w:tcPr>
-          <w:p>
-            <w:pStyle w:val="Compact"/>
-          </w:p>
-        </w:tc>
-        <w:tc>
-          <w:tcPr>
-            <w:tcBorders>
-              <w:bottom w:val="single"/>
-            </w:tcBorders>
-            <w:vAlign w:val="bottom"/>
-          </w:tcPr>
-          <w:p>
-            <w:pPr>
-              <w:pStyle w:val="Compact"/>
-              <w:jc w:val="right"/>
-            </w:pPr>
-            <w:r>
-              <w:t xml:space="preserve">Estimate</w:t>
-            </w:r>
-          </w:p>
-        </w:tc>
-        <w:tc>
-          <w:tcPr>
-            <w:tcBorders>
-              <w:bottom w:val="single"/>
-            </w:tcBorders>
-            <w:vAlign w:val="bottom"/>
-          </w:tcPr>
-          <w:p>
-            <w:pPr>
-              <w:pStyle w:val="Compact"/>
-              <w:jc w:val="right"/>
-            </w:pPr>
-            <w:r>
-              <w:t xml:space="preserve">Std. Error</w:t>
-            </w:r>
-          </w:p>
-        </w:tc>
-        <w:tc>
-          <w:tcPr>
-            <w:tcBorders>
-              <w:bottom w:val="single"/>
-            </w:tcBorders>
-            <w:vAlign w:val="bottom"/>
-          </w:tcPr>
-          <w:p>
-            <w:pPr>
-              <w:pStyle w:val="Compact"/>
-              <w:jc w:val="right"/>
-            </w:pPr>
-            <w:r>
-              <w:t xml:space="preserve">t value</w:t>
-            </w:r>
-          </w:p>
-        </w:tc>
-      </w:tr>
-      <w:tr>
-        <w:tc>
-          <w:p>
-            <w:pPr>
-              <w:pStyle w:val="Compact"/>
-              <w:jc w:val="left"/>
-            </w:pPr>
-            <w:r>
-              <w:t xml:space="preserve">(Intercept)</w:t>
-            </w:r>
-          </w:p>
-        </w:tc>
-        <w:tc>
-          <w:p>
-            <w:pPr>
-              <w:pStyle w:val="Compact"/>
-              <w:jc w:val="right"/>
-            </w:pPr>
-            <w:r>
-              <w:t xml:space="preserve">-8.615</w:t>
-            </w:r>
-          </w:p>
-        </w:tc>
-        <w:tc>
-          <w:p>
-            <w:pPr>
-              <w:pStyle w:val="Compact"/>
-              <w:jc w:val="right"/>
-            </w:pPr>
-            <w:r>
-              <w:t xml:space="preserve">3.254</w:t>
-            </w:r>
-          </w:p>
-        </w:tc>
-        <w:tc>
-          <w:p>
-            <w:pPr>
-              <w:pStyle w:val="Compact"/>
-              <w:jc w:val="right"/>
-            </w:pPr>
-            <w:r>
-              <w:t xml:space="preserve">-2.647</w:t>
-            </w:r>
-          </w:p>
-        </w:tc>
-      </w:tr>
-    </w:tbl>
-    <w:p>
-      <w:pPr>
-        <w:pStyle w:val="SourceCode"/>
-      </w:pPr>
-      <w:r>
-        <w:rPr>
-          <w:rStyle w:val="VerbatimChar"/>
-        </w:rPr>
-        <w:t xml:space="preserve">## Computing p-values via Kenward-Roger approximation. Use `p.kr = FALSE` if computation takes too long.</w:t>
-      </w:r>
-    </w:p>
-    <w:p>
-      <w:pPr>
-        <w:pStyle w:val="FirstParagraph"/>
-      </w:pPr>
       <w:r>
         <w:drawing>
           <wp:inline>
             <wp:extent cx="3696101" cy="2772075"/>
             <wp:effectExtent b="0" l="0" r="0" t="0"/>
-            <wp:docPr descr="" id="1" name="Picture"/>
+            <wp:docPr descr="Plot of effect sizes for hypothesis H1B, effect of DSFS adjacent to sign site." id="1" name="Picture"/>
             <a:graphic>
               <a:graphicData uri="http://schemas.openxmlformats.org/drawingml/2006/picture">
                 <pic:pic>
                   <pic:nvPicPr>
-                    <pic:cNvPr descr="MA_Report_files/figure-docx/unnamed-chunk-7-1.png" id="0" name="Picture"/>
+                    <pic:cNvPr descr="MA_Report_files/figure-docx/unnamed-chunk-5-2.png" id="0" name="Picture"/>
+                    <pic:cNvPicPr>
+                      <a:picLocks noChangeArrowheads="1" noChangeAspect="1"/>
+                    </pic:cNvPicPr>
+                  </pic:nvPicPr>
+                  <pic:blipFill>
+                    <a:blip r:embed="rId33"/>
+                    <a:stretch>
+                      <a:fillRect/>
+                    </a:stretch>
+                  </pic:blipFill>
+                  <pic:spPr bwMode="auto">
+                    <a:xfrm>
+                      <a:off x="0" y="0"/>
+                      <a:ext cx="3696101" cy="2772075"/>
+                    </a:xfrm>
+                    <a:prstGeom prst="rect">
+                      <a:avLst/>
+                    </a:prstGeom>
+                    <a:noFill/>
+                    <a:ln w="9525">
+                      <a:noFill/>
+                      <a:headEnd/>
+                      <a:tailEnd/>
+                    </a:ln>
+                  </pic:spPr>
+                </pic:pic>
+              </a:graphicData>
+            </a:graphic>
+          </wp:inline>
+        </w:drawing>
+      </w:r>
+      <w:r>
+        <w:drawing>
+          <wp:inline>
+            <wp:extent cx="3696101" cy="2772075"/>
+            <wp:effectExtent b="0" l="0" r="0" t="0"/>
+            <wp:docPr descr="Plot of effect sizes for hypothesis H1B, effect of DSFS adjacent to sign site." id="1" name="Picture"/>
+            <a:graphic>
+              <a:graphicData uri="http://schemas.openxmlformats.org/drawingml/2006/picture">
+                <pic:pic>
+                  <pic:nvPicPr>
+                    <pic:cNvPr descr="MA_Report_files/figure-docx/unnamed-chunk-5-3.png" id="0" name="Picture"/>
                     <pic:cNvPicPr>
                       <a:picLocks noChangeArrowheads="1" noChangeAspect="1"/>
                     </pic:cNvPicPr>
@@ -5158,6 +4927,524 @@
           </wp:inline>
         </w:drawing>
       </w:r>
+      <w:r>
+        <w:drawing>
+          <wp:inline>
+            <wp:extent cx="3696101" cy="2772075"/>
+            <wp:effectExtent b="0" l="0" r="0" t="0"/>
+            <wp:docPr descr="Plot of effect sizes for hypothesis H1B, effect of DSFS adjacent to sign site." id="1" name="Picture"/>
+            <a:graphic>
+              <a:graphicData uri="http://schemas.openxmlformats.org/drawingml/2006/picture">
+                <pic:pic>
+                  <pic:nvPicPr>
+                    <pic:cNvPr descr="MA_Report_files/figure-docx/unnamed-chunk-5-4.png" id="0" name="Picture"/>
+                    <pic:cNvPicPr>
+                      <a:picLocks noChangeArrowheads="1" noChangeAspect="1"/>
+                    </pic:cNvPicPr>
+                  </pic:nvPicPr>
+                  <pic:blipFill>
+                    <a:blip r:embed="rId35"/>
+                    <a:stretch>
+                      <a:fillRect/>
+                    </a:stretch>
+                  </pic:blipFill>
+                  <pic:spPr bwMode="auto">
+                    <a:xfrm>
+                      <a:off x="0" y="0"/>
+                      <a:ext cx="3696101" cy="2772075"/>
+                    </a:xfrm>
+                    <a:prstGeom prst="rect">
+                      <a:avLst/>
+                    </a:prstGeom>
+                    <a:noFill/>
+                    <a:ln w="9525">
+                      <a:noFill/>
+                      <a:headEnd/>
+                      <a:tailEnd/>
+                    </a:ln>
+                  </pic:spPr>
+                </pic:pic>
+              </a:graphicData>
+            </a:graphic>
+          </wp:inline>
+        </w:drawing>
+      </w:r>
+      <w:r>
+        <w:drawing>
+          <wp:inline>
+            <wp:extent cx="3696101" cy="2772075"/>
+            <wp:effectExtent b="0" l="0" r="0" t="0"/>
+            <wp:docPr descr="Plot of effect sizes for hypothesis H1B, effect of DSFS adjacent to sign site." id="1" name="Picture"/>
+            <a:graphic>
+              <a:graphicData uri="http://schemas.openxmlformats.org/drawingml/2006/picture">
+                <pic:pic>
+                  <pic:nvPicPr>
+                    <pic:cNvPr descr="MA_Report_files/figure-docx/unnamed-chunk-5-5.png" id="0" name="Picture"/>
+                    <pic:cNvPicPr>
+                      <a:picLocks noChangeArrowheads="1" noChangeAspect="1"/>
+                    </pic:cNvPicPr>
+                  </pic:nvPicPr>
+                  <pic:blipFill>
+                    <a:blip r:embed="rId36"/>
+                    <a:stretch>
+                      <a:fillRect/>
+                    </a:stretch>
+                  </pic:blipFill>
+                  <pic:spPr bwMode="auto">
+                    <a:xfrm>
+                      <a:off x="0" y="0"/>
+                      <a:ext cx="3696101" cy="2772075"/>
+                    </a:xfrm>
+                    <a:prstGeom prst="rect">
+                      <a:avLst/>
+                    </a:prstGeom>
+                    <a:noFill/>
+                    <a:ln w="9525">
+                      <a:noFill/>
+                      <a:headEnd/>
+                      <a:tailEnd/>
+                    </a:ln>
+                  </pic:spPr>
+                </pic:pic>
+              </a:graphicData>
+            </a:graphic>
+          </wp:inline>
+        </w:drawing>
+      </w:r>
+    </w:p>
+    <w:p>
+      <w:pPr>
+        <w:pStyle w:val="Heading2"/>
+      </w:pPr>
+      <w:bookmarkStart w:id="37" w:name="h1c"/>
+      <w:bookmarkEnd w:id="37"/>
+      <w:r>
+        <w:t xml:space="preserve">H1C</w:t>
+      </w:r>
+    </w:p>
+    <w:p>
+      <w:pPr>
+        <w:pStyle w:val="FirstParagraph"/>
+      </w:pPr>
+      <w:r>
+        <w:t xml:space="preserve">The difference between speeds upstream and adjacent to DSFS were surprisingly large, with large decreases in speed detected in several studies which did not differentiate by vehicle type (Hallmark et al. 2007, Reddy et al. 2008, and Roberts et al. 2012). The mean upstream-adjacent effect size for DSFS activation across all studies was -2.73 mph.</w:t>
+      </w:r>
+    </w:p>
+    <w:p>
+      <w:pPr>
+        <w:pStyle w:val="TableCaption"/>
+      </w:pPr>
+      <w:r>
+        <w:t xml:space="preserve">Decreases in speed for Hypothesis H1C, activation effect of DSFS downstream, by vehicle type.</w:t>
+      </w:r>
+    </w:p>
+    <w:tbl>
+      <w:tblPr>
+        <w:tblStyle w:val="TableNormal"/>
+        <w:tblW w:type="pct" w:w="0.0"/>
+        <w:tblLook w:firstRow="1"/>
+        <w:tblCaption w:val="Decreases in speed for Hypothesis H1C, activation effect of DSFS downstream, by vehicle type."/>
+      </w:tblPr>
+      <w:tblGrid/>
+      <w:tr>
+        <w:trPr>
+          <w:cnfStyle w:firstRow="1"/>
+        </w:trPr>
+        <w:tc>
+          <w:tcPr>
+            <w:tcBorders>
+              <w:bottom w:val="single"/>
+            </w:tcBorders>
+            <w:vAlign w:val="bottom"/>
+          </w:tcPr>
+          <w:p>
+            <w:pPr>
+              <w:pStyle w:val="Compact"/>
+              <w:jc w:val="left"/>
+            </w:pPr>
+            <w:r>
+              <w:t xml:space="preserve">Vehicle Type</w:t>
+            </w:r>
+          </w:p>
+        </w:tc>
+        <w:tc>
+          <w:tcPr>
+            <w:tcBorders>
+              <w:bottom w:val="single"/>
+            </w:tcBorders>
+            <w:vAlign w:val="bottom"/>
+          </w:tcPr>
+          <w:p>
+            <w:pPr>
+              <w:pStyle w:val="Compact"/>
+              <w:jc w:val="right"/>
+            </w:pPr>
+            <w:r>
+              <w:t xml:space="preserve">Effect size yi</w:t>
+            </w:r>
+          </w:p>
+        </w:tc>
+        <w:tc>
+          <w:tcPr>
+            <w:tcBorders>
+              <w:bottom w:val="single"/>
+            </w:tcBorders>
+            <w:vAlign w:val="bottom"/>
+          </w:tcPr>
+          <w:p>
+            <w:pPr>
+              <w:pStyle w:val="Compact"/>
+              <w:jc w:val="right"/>
+            </w:pPr>
+            <w:r>
+              <w:t xml:space="preserve">Variance vi</w:t>
+            </w:r>
+          </w:p>
+        </w:tc>
+        <w:tc>
+          <w:tcPr>
+            <w:tcBorders>
+              <w:bottom w:val="single"/>
+            </w:tcBorders>
+            <w:vAlign w:val="bottom"/>
+          </w:tcPr>
+          <w:p>
+            <w:pPr>
+              <w:pStyle w:val="Compact"/>
+              <w:jc w:val="right"/>
+            </w:pPr>
+            <w:r>
+              <w:t xml:space="preserve">N</w:t>
+            </w:r>
+          </w:p>
+        </w:tc>
+      </w:tr>
+      <w:tr>
+        <w:tc>
+          <w:p>
+            <w:pPr>
+              <w:pStyle w:val="Compact"/>
+              <w:jc w:val="left"/>
+            </w:pPr>
+            <w:r>
+              <w:t xml:space="preserve">Unspecified</w:t>
+            </w:r>
+          </w:p>
+        </w:tc>
+        <w:tc>
+          <w:p>
+            <w:pPr>
+              <w:pStyle w:val="Compact"/>
+              <w:jc w:val="right"/>
+            </w:pPr>
+            <w:r>
+              <w:t xml:space="preserve">-11.128</w:t>
+            </w:r>
+          </w:p>
+        </w:tc>
+        <w:tc>
+          <w:p>
+            <w:pPr>
+              <w:pStyle w:val="Compact"/>
+              <w:jc w:val="right"/>
+            </w:pPr>
+            <w:r>
+              <w:t xml:space="preserve">0.070</w:t>
+            </w:r>
+          </w:p>
+        </w:tc>
+        <w:tc>
+          <w:p>
+            <w:pPr>
+              <w:pStyle w:val="Compact"/>
+              <w:jc w:val="right"/>
+            </w:pPr>
+            <w:r>
+              <w:t xml:space="preserve">31</w:t>
+            </w:r>
+          </w:p>
+        </w:tc>
+      </w:tr>
+      <w:tr>
+        <w:tc>
+          <w:p>
+            <w:pPr>
+              <w:pStyle w:val="Compact"/>
+              <w:jc w:val="left"/>
+            </w:pPr>
+            <w:r>
+              <w:t xml:space="preserve">Passenger</w:t>
+            </w:r>
+          </w:p>
+        </w:tc>
+        <w:tc>
+          <w:p>
+            <w:pPr>
+              <w:pStyle w:val="Compact"/>
+              <w:jc w:val="right"/>
+            </w:pPr>
+            <w:r>
+              <w:t xml:space="preserve">-1.704</w:t>
+            </w:r>
+          </w:p>
+        </w:tc>
+        <w:tc>
+          <w:p>
+            <w:pPr>
+              <w:pStyle w:val="Compact"/>
+              <w:jc w:val="right"/>
+            </w:pPr>
+            <w:r>
+              <w:t xml:space="preserve">1.585</w:t>
+            </w:r>
+          </w:p>
+        </w:tc>
+        <w:tc>
+          <w:p>
+            <w:pPr>
+              <w:pStyle w:val="Compact"/>
+              <w:jc w:val="right"/>
+            </w:pPr>
+            <w:r>
+              <w:t xml:space="preserve">16</w:t>
+            </w:r>
+          </w:p>
+        </w:tc>
+      </w:tr>
+      <w:tr>
+        <w:tc>
+          <w:p>
+            <w:pPr>
+              <w:pStyle w:val="Compact"/>
+              <w:jc w:val="left"/>
+            </w:pPr>
+            <w:r>
+              <w:t xml:space="preserve">Truck</w:t>
+            </w:r>
+          </w:p>
+        </w:tc>
+        <w:tc>
+          <w:p>
+            <w:pPr>
+              <w:pStyle w:val="Compact"/>
+              <w:jc w:val="right"/>
+            </w:pPr>
+            <w:r>
+              <w:t xml:space="preserve">-1.424</w:t>
+            </w:r>
+          </w:p>
+        </w:tc>
+        <w:tc>
+          <w:p>
+            <w:pPr>
+              <w:pStyle w:val="Compact"/>
+              <w:jc w:val="right"/>
+            </w:pPr>
+            <w:r>
+              <w:t xml:space="preserve">2.920</w:t>
+            </w:r>
+          </w:p>
+        </w:tc>
+        <w:tc>
+          <w:p>
+            <w:pPr>
+              <w:pStyle w:val="Compact"/>
+              <w:jc w:val="right"/>
+            </w:pPr>
+            <w:r>
+              <w:t xml:space="preserve">25</w:t>
+            </w:r>
+          </w:p>
+        </w:tc>
+      </w:tr>
+    </w:tbl>
+    <w:p>
+      <w:pPr>
+        <w:pStyle w:val="TableCaption"/>
+      </w:pPr>
+      <w:r>
+        <w:t xml:space="preserve">Summary of mixed effect model of hypothesis H1C, difference in speeds between DSFS upstream and adjacent to the sign.</w:t>
+      </w:r>
+    </w:p>
+    <w:tbl>
+      <w:tblPr>
+        <w:tblStyle w:val="TableNormal"/>
+        <w:tblW w:type="pct" w:w="0.0"/>
+        <w:tblLook w:firstRow="1"/>
+        <w:tblCaption w:val="Summary of mixed effect model of hypothesis H1C, difference in speeds between DSFS upstream and adjacent to the sign."/>
+      </w:tblPr>
+      <w:tblGrid/>
+      <w:tr>
+        <w:trPr>
+          <w:cnfStyle w:firstRow="1"/>
+        </w:trPr>
+        <w:tc>
+          <w:tcPr>
+            <w:tcBorders>
+              <w:bottom w:val="single"/>
+            </w:tcBorders>
+            <w:vAlign w:val="bottom"/>
+          </w:tcPr>
+          <w:p>
+            <w:pStyle w:val="Compact"/>
+          </w:p>
+        </w:tc>
+        <w:tc>
+          <w:tcPr>
+            <w:tcBorders>
+              <w:bottom w:val="single"/>
+            </w:tcBorders>
+            <w:vAlign w:val="bottom"/>
+          </w:tcPr>
+          <w:p>
+            <w:pPr>
+              <w:pStyle w:val="Compact"/>
+              <w:jc w:val="right"/>
+            </w:pPr>
+            <w:r>
+              <w:t xml:space="preserve">Estimate</w:t>
+            </w:r>
+          </w:p>
+        </w:tc>
+        <w:tc>
+          <w:tcPr>
+            <w:tcBorders>
+              <w:bottom w:val="single"/>
+            </w:tcBorders>
+            <w:vAlign w:val="bottom"/>
+          </w:tcPr>
+          <w:p>
+            <w:pPr>
+              <w:pStyle w:val="Compact"/>
+              <w:jc w:val="right"/>
+            </w:pPr>
+            <w:r>
+              <w:t xml:space="preserve">Std. Error</w:t>
+            </w:r>
+          </w:p>
+        </w:tc>
+        <w:tc>
+          <w:tcPr>
+            <w:tcBorders>
+              <w:bottom w:val="single"/>
+            </w:tcBorders>
+            <w:vAlign w:val="bottom"/>
+          </w:tcPr>
+          <w:p>
+            <w:pPr>
+              <w:pStyle w:val="Compact"/>
+              <w:jc w:val="right"/>
+            </w:pPr>
+            <w:r>
+              <w:t xml:space="preserve">t value</w:t>
+            </w:r>
+          </w:p>
+        </w:tc>
+      </w:tr>
+      <w:tr>
+        <w:tc>
+          <w:p>
+            <w:pPr>
+              <w:pStyle w:val="Compact"/>
+              <w:jc w:val="left"/>
+            </w:pPr>
+            <w:r>
+              <w:t xml:space="preserve">(Intercept)</w:t>
+            </w:r>
+          </w:p>
+        </w:tc>
+        <w:tc>
+          <w:p>
+            <w:pPr>
+              <w:pStyle w:val="Compact"/>
+              <w:jc w:val="right"/>
+            </w:pPr>
+            <w:r>
+              <w:t xml:space="preserve">-8.615</w:t>
+            </w:r>
+          </w:p>
+        </w:tc>
+        <w:tc>
+          <w:p>
+            <w:pPr>
+              <w:pStyle w:val="Compact"/>
+              <w:jc w:val="right"/>
+            </w:pPr>
+            <w:r>
+              <w:t xml:space="preserve">3.254</w:t>
+            </w:r>
+          </w:p>
+        </w:tc>
+        <w:tc>
+          <w:p>
+            <w:pPr>
+              <w:pStyle w:val="Compact"/>
+              <w:jc w:val="right"/>
+            </w:pPr>
+            <w:r>
+              <w:t xml:space="preserve">-2.647</w:t>
+            </w:r>
+          </w:p>
+        </w:tc>
+      </w:tr>
+    </w:tbl>
+    <w:p>
+      <w:pPr>
+        <w:pStyle w:val="SourceCode"/>
+      </w:pPr>
+      <w:r>
+        <w:rPr>
+          <w:rStyle w:val="VerbatimChar"/>
+        </w:rPr>
+        <w:t xml:space="preserve">## Computing p-values via Kenward-Roger approximation. Use `p.kr = FALSE` if computation takes too long.</w:t>
+      </w:r>
+    </w:p>
+    <w:p>
+      <w:pPr>
+        <w:pStyle w:val="FirstParagraph"/>
+      </w:pPr>
+      <w:r>
+        <w:drawing>
+          <wp:inline>
+            <wp:extent cx="3696101" cy="2772075"/>
+            <wp:effectExtent b="0" l="0" r="0" t="0"/>
+            <wp:docPr descr="" id="1" name="Picture"/>
+            <a:graphic>
+              <a:graphicData uri="http://schemas.openxmlformats.org/drawingml/2006/picture">
+                <pic:pic>
+                  <pic:nvPicPr>
+                    <pic:cNvPr descr="MA_Report_files/figure-docx/unnamed-chunk-7-1.png" id="0" name="Picture"/>
+                    <pic:cNvPicPr>
+                      <a:picLocks noChangeArrowheads="1" noChangeAspect="1"/>
+                    </pic:cNvPicPr>
+                  </pic:nvPicPr>
+                  <pic:blipFill>
+                    <a:blip r:embed="rId38"/>
+                    <a:stretch>
+                      <a:fillRect/>
+                    </a:stretch>
+                  </pic:blipFill>
+                  <pic:spPr bwMode="auto">
+                    <a:xfrm>
+                      <a:off x="0" y="0"/>
+                      <a:ext cx="3696101" cy="2772075"/>
+                    </a:xfrm>
+                    <a:prstGeom prst="rect">
+                      <a:avLst/>
+                    </a:prstGeom>
+                    <a:noFill/>
+                    <a:ln w="9525">
+                      <a:noFill/>
+                      <a:headEnd/>
+                      <a:tailEnd/>
+                    </a:ln>
+                  </pic:spPr>
+                </pic:pic>
+              </a:graphicData>
+            </a:graphic>
+          </wp:inline>
+        </w:drawing>
+      </w:r>
     </w:p>
     <w:sectPr>
       <w:pgSz w:w="12240" w:h="15840"/>
@@ -5923,7 +6210,7 @@
     </w:lvl>
   </w:abstractNum>
   <w:abstractNum w:abstractNumId="990">
-    <w:nsid w:val="aec76738"/>
+    <w:nsid w:val="31abe380"/>
     <w:multiLevelType w:val="multilevel"/>
     <w:lvl w:ilvl="0">
       <w:numFmt w:val="bullet"/>
@@ -6004,7 +6291,7 @@
     </w:lvl>
   </w:abstractNum>
   <w:abstractNum w:abstractNumId="99731">
-    <w:nsid w:val="7a1c10de"/>
+    <w:nsid w:val="cc3daf9b"/>
     <w:multiLevelType w:val="multilevel"/>
     <w:lvl w:ilvl="0">
       <w:start w:val="1"/>
@@ -6092,7 +6379,7 @@
     </w:lvl>
   </w:abstractNum>
   <w:abstractNum w:abstractNumId="99411">
-    <w:nsid w:val="1f4671c4"/>
+    <w:nsid w:val="cc62e4b7"/>
     <w:multiLevelType w:val="multilevel"/>
     <w:lvl w:ilvl="0">
       <w:start w:val="1"/>
@@ -6180,7 +6467,7 @@
     </w:lvl>
   </w:abstractNum>
   <w:abstractNum w:abstractNumId="99711">
-    <w:nsid w:val="d21a52b7"/>
+    <w:nsid w:val="269ccee5"/>
     <w:multiLevelType w:val="multilevel"/>
     <w:lvl w:ilvl="0">
       <w:start w:val="1"/>

</xml_diff>

<commit_message>
Edits to H1B code
</commit_message>
<xml_diff>
--- a/MA_Report.docx
+++ b/MA_Report.docx
@@ -3069,10 +3069,10 @@
       <w:pPr>
         <w:pStyle w:val="Heading2"/>
       </w:pPr>
-      <w:bookmarkStart w:id="29" w:name="activation-hypothesis-h1"/>
+      <w:bookmarkStart w:id="29" w:name="h1-activation-hypothesis"/>
       <w:bookmarkEnd w:id="29"/>
       <w:r>
-        <w:t xml:space="preserve">Activation hypothesis: H1</w:t>
+        <w:t xml:space="preserve">H1: Activation hypothesis</w:t>
       </w:r>
     </w:p>
     <w:p>
@@ -3880,7 +3880,7 @@
               <w:jc w:val="left"/>
             </w:pPr>
             <w:r>
-              <w:t xml:space="preserve">Location</w:t>
+              <w:t xml:space="preserve">Vehicle Type</w:t>
             </w:r>
           </w:p>
         </w:tc>
@@ -3894,10 +3894,10 @@
           <w:p>
             <w:pPr>
               <w:pStyle w:val="Compact"/>
-              <w:jc w:val="left"/>
-            </w:pPr>
-            <w:r>
-              <w:t xml:space="preserve">Vehicle Type</w:t>
+              <w:jc w:val="right"/>
+            </w:pPr>
+            <w:r>
+              <w:t xml:space="preserve">Effect size</w:t>
             </w:r>
           </w:p>
         </w:tc>
@@ -3914,7 +3914,7 @@
               <w:jc w:val="right"/>
             </w:pPr>
             <w:r>
-              <w:t xml:space="preserve">Effect size</w:t>
+              <w:t xml:space="preserve">Variance</w:t>
             </w:r>
           </w:p>
         </w:tc>
@@ -3931,23 +3931,6 @@
               <w:jc w:val="right"/>
             </w:pPr>
             <w:r>
-              <w:t xml:space="preserve">Variance</w:t>
-            </w:r>
-          </w:p>
-        </w:tc>
-        <w:tc>
-          <w:tcPr>
-            <w:tcBorders>
-              <w:bottom w:val="single"/>
-            </w:tcBorders>
-            <w:vAlign w:val="bottom"/>
-          </w:tcPr>
-          <w:p>
-            <w:pPr>
-              <w:pStyle w:val="Compact"/>
-              <w:jc w:val="right"/>
-            </w:pPr>
-            <w:r>
               <w:t xml:space="preserve">N</w:t>
             </w:r>
           </w:p>
@@ -3969,21 +3952,10 @@
           <w:p>
             <w:pPr>
               <w:pStyle w:val="Compact"/>
-              <w:jc w:val="left"/>
-            </w:pPr>
-            <w:r>
-              <w:t xml:space="preserve">Unspecified</w:t>
-            </w:r>
-          </w:p>
-        </w:tc>
-        <w:tc>
-          <w:p>
-            <w:pPr>
-              <w:pStyle w:val="Compact"/>
-              <w:jc w:val="right"/>
-            </w:pPr>
-            <w:r>
-              <w:t xml:space="preserve">-0.23</w:t>
+              <w:jc w:val="right"/>
+            </w:pPr>
+            <w:r>
+              <w:t xml:space="preserve">-2.04</w:t>
             </w:r>
           </w:p>
         </w:tc>
@@ -4005,7 +3977,7 @@
               <w:jc w:val="right"/>
             </w:pPr>
             <w:r>
-              <w:t xml:space="preserve">52</w:t>
+              <w:t xml:space="preserve">210</w:t>
             </w:r>
           </w:p>
         </w:tc>
@@ -4026,43 +3998,32 @@
           <w:p>
             <w:pPr>
               <w:pStyle w:val="Compact"/>
-              <w:jc w:val="left"/>
-            </w:pPr>
-            <w:r>
-              <w:t xml:space="preserve">Unspecified</w:t>
-            </w:r>
-          </w:p>
-        </w:tc>
-        <w:tc>
-          <w:p>
-            <w:pPr>
-              <w:pStyle w:val="Compact"/>
-              <w:jc w:val="right"/>
-            </w:pPr>
-            <w:r>
-              <w:t xml:space="preserve">-2.69</w:t>
-            </w:r>
-          </w:p>
-        </w:tc>
-        <w:tc>
-          <w:p>
-            <w:pPr>
-              <w:pStyle w:val="Compact"/>
-              <w:jc w:val="right"/>
-            </w:pPr>
-            <w:r>
-              <w:t xml:space="preserve">0.14</w:t>
-            </w:r>
-          </w:p>
-        </w:tc>
-        <w:tc>
-          <w:p>
-            <w:pPr>
-              <w:pStyle w:val="Compact"/>
-              <w:jc w:val="right"/>
-            </w:pPr>
-            <w:r>
-              <w:t xml:space="preserve">130</w:t>
+              <w:jc w:val="right"/>
+            </w:pPr>
+            <w:r>
+              <w:t xml:space="preserve">-2.92</w:t>
+            </w:r>
+          </w:p>
+        </w:tc>
+        <w:tc>
+          <w:p>
+            <w:pPr>
+              <w:pStyle w:val="Compact"/>
+              <w:jc w:val="right"/>
+            </w:pPr>
+            <w:r>
+              <w:t xml:space="preserve">0.50</w:t>
+            </w:r>
+          </w:p>
+        </w:tc>
+        <w:tc>
+          <w:p>
+            <w:pPr>
+              <w:pStyle w:val="Compact"/>
+              <w:jc w:val="right"/>
+            </w:pPr>
+            <w:r>
+              <w:t xml:space="preserve">228</w:t>
             </w:r>
           </w:p>
         </w:tc>
@@ -4083,385 +4044,32 @@
           <w:p>
             <w:pPr>
               <w:pStyle w:val="Compact"/>
-              <w:jc w:val="left"/>
-            </w:pPr>
-            <w:r>
-              <w:t xml:space="preserve">Unspecified</w:t>
-            </w:r>
-          </w:p>
-        </w:tc>
-        <w:tc>
-          <w:p>
-            <w:pPr>
-              <w:pStyle w:val="Compact"/>
-              <w:jc w:val="right"/>
-            </w:pPr>
-            <w:r>
-              <w:t xml:space="preserve">-3.07</w:t>
-            </w:r>
-          </w:p>
-        </w:tc>
-        <w:tc>
-          <w:p>
-            <w:pPr>
-              <w:pStyle w:val="Compact"/>
-              <w:jc w:val="right"/>
-            </w:pPr>
-            <w:r>
-              <w:t xml:space="preserve">0.19</w:t>
-            </w:r>
-          </w:p>
-        </w:tc>
-        <w:tc>
-          <w:p>
-            <w:pPr>
-              <w:pStyle w:val="Compact"/>
-              <w:jc w:val="right"/>
-            </w:pPr>
-            <w:r>
-              <w:t xml:space="preserve">28</w:t>
-            </w:r>
-          </w:p>
-        </w:tc>
-      </w:tr>
-      <w:tr>
-        <w:tc>
-          <w:p>
-            <w:pPr>
-              <w:pStyle w:val="Compact"/>
-              <w:jc w:val="left"/>
-            </w:pPr>
-            <w:r>
-              <w:t xml:space="preserve">Upstream</w:t>
-            </w:r>
-          </w:p>
-        </w:tc>
-        <w:tc>
-          <w:p>
-            <w:pPr>
-              <w:pStyle w:val="Compact"/>
-              <w:jc w:val="left"/>
-            </w:pPr>
-            <w:r>
-              <w:t xml:space="preserve">Passenger</w:t>
-            </w:r>
-          </w:p>
-        </w:tc>
-        <w:tc>
-          <w:p>
-            <w:pPr>
-              <w:pStyle w:val="Compact"/>
-              <w:jc w:val="right"/>
-            </w:pPr>
-            <w:r>
-              <w:t xml:space="preserve">-0.48</w:t>
-            </w:r>
-          </w:p>
-        </w:tc>
-        <w:tc>
-          <w:p>
-            <w:pPr>
-              <w:pStyle w:val="Compact"/>
-              <w:jc w:val="right"/>
-            </w:pPr>
-            <w:r>
-              <w:t xml:space="preserve">0.47</w:t>
-            </w:r>
-          </w:p>
-        </w:tc>
-        <w:tc>
-          <w:p>
-            <w:pPr>
-              <w:pStyle w:val="Compact"/>
-              <w:jc w:val="right"/>
-            </w:pPr>
-            <w:r>
-              <w:t xml:space="preserve">59</w:t>
-            </w:r>
-          </w:p>
-        </w:tc>
-      </w:tr>
-      <w:tr>
-        <w:tc>
-          <w:p>
-            <w:pPr>
-              <w:pStyle w:val="Compact"/>
-              <w:jc w:val="left"/>
-            </w:pPr>
-            <w:r>
-              <w:t xml:space="preserve">Adjacent</w:t>
-            </w:r>
-          </w:p>
-        </w:tc>
-        <w:tc>
-          <w:p>
-            <w:pPr>
-              <w:pStyle w:val="Compact"/>
-              <w:jc w:val="left"/>
-            </w:pPr>
-            <w:r>
-              <w:t xml:space="preserve">Passenger</w:t>
-            </w:r>
-          </w:p>
-        </w:tc>
-        <w:tc>
-          <w:p>
-            <w:pPr>
-              <w:pStyle w:val="Compact"/>
-              <w:jc w:val="right"/>
-            </w:pPr>
-            <w:r>
-              <w:t xml:space="preserve">-4.52</w:t>
-            </w:r>
-          </w:p>
-        </w:tc>
-        <w:tc>
-          <w:p>
-            <w:pPr>
-              <w:pStyle w:val="Compact"/>
-              <w:jc w:val="right"/>
-            </w:pPr>
-            <w:r>
-              <w:t xml:space="preserve">0.60</w:t>
-            </w:r>
-          </w:p>
-        </w:tc>
-        <w:tc>
-          <w:p>
-            <w:pPr>
-              <w:pStyle w:val="Compact"/>
-              <w:jc w:val="right"/>
-            </w:pPr>
-            <w:r>
-              <w:t xml:space="preserve">97</w:t>
-            </w:r>
-          </w:p>
-        </w:tc>
-      </w:tr>
-      <w:tr>
-        <w:tc>
-          <w:p>
-            <w:pPr>
-              <w:pStyle w:val="Compact"/>
-              <w:jc w:val="left"/>
-            </w:pPr>
-            <w:r>
-              <w:t xml:space="preserve">Downstream</w:t>
-            </w:r>
-          </w:p>
-        </w:tc>
-        <w:tc>
-          <w:p>
-            <w:pPr>
-              <w:pStyle w:val="Compact"/>
-              <w:jc w:val="left"/>
-            </w:pPr>
-            <w:r>
-              <w:t xml:space="preserve">Passenger</w:t>
-            </w:r>
-          </w:p>
-        </w:tc>
-        <w:tc>
-          <w:p>
-            <w:pPr>
-              <w:pStyle w:val="Compact"/>
-              <w:jc w:val="right"/>
-            </w:pPr>
-            <w:r>
-              <w:t xml:space="preserve">-2.73</w:t>
-            </w:r>
-          </w:p>
-        </w:tc>
-        <w:tc>
-          <w:p>
-            <w:pPr>
-              <w:pStyle w:val="Compact"/>
-              <w:jc w:val="right"/>
-            </w:pPr>
-            <w:r>
-              <w:t xml:space="preserve">0.41</w:t>
-            </w:r>
-          </w:p>
-        </w:tc>
-        <w:tc>
-          <w:p>
-            <w:pPr>
-              <w:pStyle w:val="Compact"/>
-              <w:jc w:val="right"/>
-            </w:pPr>
-            <w:r>
-              <w:t xml:space="preserve">72</w:t>
-            </w:r>
-          </w:p>
-        </w:tc>
-      </w:tr>
-      <w:tr>
-        <w:tc>
-          <w:p>
-            <w:pPr>
-              <w:pStyle w:val="Compact"/>
-              <w:jc w:val="left"/>
-            </w:pPr>
-            <w:r>
-              <w:t xml:space="preserve">Upstream</w:t>
-            </w:r>
-          </w:p>
-        </w:tc>
-        <w:tc>
-          <w:p>
-            <w:pPr>
-              <w:pStyle w:val="Compact"/>
-              <w:jc w:val="left"/>
-            </w:pPr>
-            <w:r>
-              <w:t xml:space="preserve">Truck</w:t>
-            </w:r>
-          </w:p>
-        </w:tc>
-        <w:tc>
-          <w:p>
-            <w:pPr>
-              <w:pStyle w:val="Compact"/>
-              <w:jc w:val="right"/>
-            </w:pPr>
-            <w:r>
-              <w:t xml:space="preserve">0.39</w:t>
-            </w:r>
-          </w:p>
-        </w:tc>
-        <w:tc>
-          <w:p>
-            <w:pPr>
-              <w:pStyle w:val="Compact"/>
-              <w:jc w:val="right"/>
-            </w:pPr>
-            <w:r>
-              <w:t xml:space="preserve">2.17</w:t>
-            </w:r>
-          </w:p>
-        </w:tc>
-        <w:tc>
-          <w:p>
-            <w:pPr>
-              <w:pStyle w:val="Compact"/>
-              <w:jc w:val="right"/>
-            </w:pPr>
-            <w:r>
-              <w:t xml:space="preserve">92</w:t>
-            </w:r>
-          </w:p>
-        </w:tc>
-      </w:tr>
-      <w:tr>
-        <w:tc>
-          <w:p>
-            <w:pPr>
-              <w:pStyle w:val="Compact"/>
-              <w:jc w:val="left"/>
-            </w:pPr>
-            <w:r>
-              <w:t xml:space="preserve">Adjacent</w:t>
-            </w:r>
-          </w:p>
-        </w:tc>
-        <w:tc>
-          <w:p>
-            <w:pPr>
-              <w:pStyle w:val="Compact"/>
-              <w:jc w:val="left"/>
-            </w:pPr>
-            <w:r>
-              <w:t xml:space="preserve">Truck</w:t>
-            </w:r>
-          </w:p>
-        </w:tc>
-        <w:tc>
-          <w:p>
-            <w:pPr>
-              <w:pStyle w:val="Compact"/>
-              <w:jc w:val="right"/>
-            </w:pPr>
-            <w:r>
-              <w:t xml:space="preserve">-2.13</w:t>
-            </w:r>
-          </w:p>
-        </w:tc>
-        <w:tc>
-          <w:p>
-            <w:pPr>
-              <w:pStyle w:val="Compact"/>
-              <w:jc w:val="right"/>
-            </w:pPr>
-            <w:r>
-              <w:t xml:space="preserve">1.72</w:t>
-            </w:r>
-          </w:p>
-        </w:tc>
-        <w:tc>
-          <w:p>
-            <w:pPr>
-              <w:pStyle w:val="Compact"/>
-              <w:jc w:val="right"/>
-            </w:pPr>
-            <w:r>
-              <w:t xml:space="preserve">121</w:t>
-            </w:r>
-          </w:p>
-        </w:tc>
-      </w:tr>
-      <w:tr>
-        <w:tc>
-          <w:p>
-            <w:pPr>
-              <w:pStyle w:val="Compact"/>
-              <w:jc w:val="left"/>
-            </w:pPr>
-            <w:r>
-              <w:t xml:space="preserve">Downstream</w:t>
-            </w:r>
-          </w:p>
-        </w:tc>
-        <w:tc>
-          <w:p>
-            <w:pPr>
-              <w:pStyle w:val="Compact"/>
-              <w:jc w:val="left"/>
-            </w:pPr>
-            <w:r>
-              <w:t xml:space="preserve">Truck</w:t>
-            </w:r>
-          </w:p>
-        </w:tc>
-        <w:tc>
-          <w:p>
-            <w:pPr>
-              <w:pStyle w:val="Compact"/>
-              <w:jc w:val="right"/>
-            </w:pPr>
-            <w:r>
-              <w:t xml:space="preserve">-2.21</w:t>
-            </w:r>
-          </w:p>
-        </w:tc>
-        <w:tc>
-          <w:p>
-            <w:pPr>
-              <w:pStyle w:val="Compact"/>
-              <w:jc w:val="right"/>
-            </w:pPr>
-            <w:r>
-              <w:t xml:space="preserve">0.88</w:t>
-            </w:r>
-          </w:p>
-        </w:tc>
-        <w:tc>
-          <w:p>
-            <w:pPr>
-              <w:pStyle w:val="Compact"/>
-              <w:jc w:val="right"/>
-            </w:pPr>
-            <w:r>
-              <w:t xml:space="preserve">74</w:t>
+              <w:jc w:val="right"/>
+            </w:pPr>
+            <w:r>
+              <w:t xml:space="preserve">-1.36</w:t>
+            </w:r>
+          </w:p>
+        </w:tc>
+        <w:tc>
+          <w:p>
+            <w:pPr>
+              <w:pStyle w:val="Compact"/>
+              <w:jc w:val="right"/>
+            </w:pPr>
+            <w:r>
+              <w:t xml:space="preserve">1.64</w:t>
+            </w:r>
+          </w:p>
+        </w:tc>
+        <w:tc>
+          <w:p>
+            <w:pPr>
+              <w:pStyle w:val="Compact"/>
+              <w:jc w:val="right"/>
+            </w:pPr>
+            <w:r>
+              <w:t xml:space="preserve">287</w:t>
             </w:r>
           </w:p>
         </w:tc>
@@ -4472,7 +4080,7 @@
         <w:pStyle w:val="BodyText"/>
       </w:pPr>
       <w:r>
-        <w:t xml:space="preserve">The statistical analysis of hypothesis H1B, which takes into account the variation at each level of site, study, and publication, as well as different vehicle types and safety foci, shows a significant decrease in speeds of -3.42 mph at the location adjacent to the sign. Within passenger cars, this decrease is even more pronounced with an estiamted additional decrease of -0.55 mph. Thus, approximately 4 mph decrease is expected for passenger cars at DSFS locations.</w:t>
+        <w:t xml:space="preserve">The statistical analysis of hypothesis H1B, which takes into account the variation at each level of site, study, and publication, as well as different vehicle types and safety foci, shows a significant decrease in speeds of -3.45 mph at the location adjacent to the sign. This overall effect is calculated as the sum of the intercept across Within passenger cars, this decrease is even more pronounced with an estiamted additional decrease of -0.55 mph. Thus, approximately 4 mph decrease is expected for passenger cars at DSFS locations.</w:t>
       </w:r>
     </w:p>
     <w:p>
@@ -4799,7 +4407,7 @@
     </w:p>
     <w:p>
       <w:pPr>
-        <w:pStyle w:val="BodyText"/>
+        <w:pStyle w:val="FigureWithCaption"/>
       </w:pPr>
       <w:r>
         <w:drawing>
@@ -4843,59 +4451,406 @@
           </wp:inline>
         </w:drawing>
       </w:r>
+    </w:p>
+    <w:p>
+      <w:pPr>
+        <w:pStyle w:val="ImageCaption"/>
+      </w:pPr>
+      <w:r>
+        <w:t xml:space="preserve">Plot of effect sizes for hypothesis H1B, effect of DSFS adjacent to sign site.</w:t>
+      </w:r>
+    </w:p>
+    <w:p>
+      <w:pPr>
+        <w:pStyle w:val="Heading3"/>
+      </w:pPr>
+      <w:bookmarkStart w:id="33" w:name="h1c"/>
+      <w:bookmarkEnd w:id="33"/>
+      <w:r>
+        <w:t xml:space="preserve">H1C</w:t>
+      </w:r>
+    </w:p>
+    <w:p>
+      <w:pPr>
+        <w:pStyle w:val="FirstParagraph"/>
+      </w:pPr>
+      <w:r>
+        <w:t xml:space="preserve">The difference between speeds upstream and adjacent to DSFS were surprisingly large, with large decreases in speed detected in several studies which did not differentiate by vehicle type (Hallmark et al. 2007, Reddy et al. 2008, and Roberts et al. 2012). The mean upstream-adjacent effect size for DSFS activation across all studies was -2.73 mph.</w:t>
+      </w:r>
+    </w:p>
+    <w:p>
+      <w:pPr>
+        <w:pStyle w:val="TableCaption"/>
+      </w:pPr>
+      <w:r>
+        <w:t xml:space="preserve">Decreases in speed for Hypothesis H1C, activation effect of DSFS downstream, by vehicle type.</w:t>
+      </w:r>
+    </w:p>
+    <w:tbl>
+      <w:tblPr>
+        <w:tblStyle w:val="TableNormal"/>
+        <w:tblW w:type="pct" w:w="0.0"/>
+        <w:tblLook w:firstRow="1"/>
+        <w:tblCaption w:val="Decreases in speed for Hypothesis H1C, activation effect of DSFS downstream, by vehicle type."/>
+      </w:tblPr>
+      <w:tblGrid/>
+      <w:tr>
+        <w:trPr>
+          <w:cnfStyle w:firstRow="1"/>
+        </w:trPr>
+        <w:tc>
+          <w:tcPr>
+            <w:tcBorders>
+              <w:bottom w:val="single"/>
+            </w:tcBorders>
+            <w:vAlign w:val="bottom"/>
+          </w:tcPr>
+          <w:p>
+            <w:pPr>
+              <w:pStyle w:val="Compact"/>
+              <w:jc w:val="left"/>
+            </w:pPr>
+            <w:r>
+              <w:t xml:space="preserve">Vehicle Type</w:t>
+            </w:r>
+          </w:p>
+        </w:tc>
+        <w:tc>
+          <w:tcPr>
+            <w:tcBorders>
+              <w:bottom w:val="single"/>
+            </w:tcBorders>
+            <w:vAlign w:val="bottom"/>
+          </w:tcPr>
+          <w:p>
+            <w:pPr>
+              <w:pStyle w:val="Compact"/>
+              <w:jc w:val="right"/>
+            </w:pPr>
+            <w:r>
+              <w:t xml:space="preserve">Effect size yi</w:t>
+            </w:r>
+          </w:p>
+        </w:tc>
+        <w:tc>
+          <w:tcPr>
+            <w:tcBorders>
+              <w:bottom w:val="single"/>
+            </w:tcBorders>
+            <w:vAlign w:val="bottom"/>
+          </w:tcPr>
+          <w:p>
+            <w:pPr>
+              <w:pStyle w:val="Compact"/>
+              <w:jc w:val="right"/>
+            </w:pPr>
+            <w:r>
+              <w:t xml:space="preserve">Variance vi</w:t>
+            </w:r>
+          </w:p>
+        </w:tc>
+        <w:tc>
+          <w:tcPr>
+            <w:tcBorders>
+              <w:bottom w:val="single"/>
+            </w:tcBorders>
+            <w:vAlign w:val="bottom"/>
+          </w:tcPr>
+          <w:p>
+            <w:pPr>
+              <w:pStyle w:val="Compact"/>
+              <w:jc w:val="right"/>
+            </w:pPr>
+            <w:r>
+              <w:t xml:space="preserve">N</w:t>
+            </w:r>
+          </w:p>
+        </w:tc>
+      </w:tr>
+      <w:tr>
+        <w:tc>
+          <w:p>
+            <w:pPr>
+              <w:pStyle w:val="Compact"/>
+              <w:jc w:val="left"/>
+            </w:pPr>
+            <w:r>
+              <w:t xml:space="preserve">Unspecified</w:t>
+            </w:r>
+          </w:p>
+        </w:tc>
+        <w:tc>
+          <w:p>
+            <w:pPr>
+              <w:pStyle w:val="Compact"/>
+              <w:jc w:val="right"/>
+            </w:pPr>
+            <w:r>
+              <w:t xml:space="preserve">-11.128</w:t>
+            </w:r>
+          </w:p>
+        </w:tc>
+        <w:tc>
+          <w:p>
+            <w:pPr>
+              <w:pStyle w:val="Compact"/>
+              <w:jc w:val="right"/>
+            </w:pPr>
+            <w:r>
+              <w:t xml:space="preserve">0.070</w:t>
+            </w:r>
+          </w:p>
+        </w:tc>
+        <w:tc>
+          <w:p>
+            <w:pPr>
+              <w:pStyle w:val="Compact"/>
+              <w:jc w:val="right"/>
+            </w:pPr>
+            <w:r>
+              <w:t xml:space="preserve">31</w:t>
+            </w:r>
+          </w:p>
+        </w:tc>
+      </w:tr>
+      <w:tr>
+        <w:tc>
+          <w:p>
+            <w:pPr>
+              <w:pStyle w:val="Compact"/>
+              <w:jc w:val="left"/>
+            </w:pPr>
+            <w:r>
+              <w:t xml:space="preserve">Passenger</w:t>
+            </w:r>
+          </w:p>
+        </w:tc>
+        <w:tc>
+          <w:p>
+            <w:pPr>
+              <w:pStyle w:val="Compact"/>
+              <w:jc w:val="right"/>
+            </w:pPr>
+            <w:r>
+              <w:t xml:space="preserve">-1.704</w:t>
+            </w:r>
+          </w:p>
+        </w:tc>
+        <w:tc>
+          <w:p>
+            <w:pPr>
+              <w:pStyle w:val="Compact"/>
+              <w:jc w:val="right"/>
+            </w:pPr>
+            <w:r>
+              <w:t xml:space="preserve">1.585</w:t>
+            </w:r>
+          </w:p>
+        </w:tc>
+        <w:tc>
+          <w:p>
+            <w:pPr>
+              <w:pStyle w:val="Compact"/>
+              <w:jc w:val="right"/>
+            </w:pPr>
+            <w:r>
+              <w:t xml:space="preserve">16</w:t>
+            </w:r>
+          </w:p>
+        </w:tc>
+      </w:tr>
+      <w:tr>
+        <w:tc>
+          <w:p>
+            <w:pPr>
+              <w:pStyle w:val="Compact"/>
+              <w:jc w:val="left"/>
+            </w:pPr>
+            <w:r>
+              <w:t xml:space="preserve">Truck</w:t>
+            </w:r>
+          </w:p>
+        </w:tc>
+        <w:tc>
+          <w:p>
+            <w:pPr>
+              <w:pStyle w:val="Compact"/>
+              <w:jc w:val="right"/>
+            </w:pPr>
+            <w:r>
+              <w:t xml:space="preserve">-1.424</w:t>
+            </w:r>
+          </w:p>
+        </w:tc>
+        <w:tc>
+          <w:p>
+            <w:pPr>
+              <w:pStyle w:val="Compact"/>
+              <w:jc w:val="right"/>
+            </w:pPr>
+            <w:r>
+              <w:t xml:space="preserve">2.920</w:t>
+            </w:r>
+          </w:p>
+        </w:tc>
+        <w:tc>
+          <w:p>
+            <w:pPr>
+              <w:pStyle w:val="Compact"/>
+              <w:jc w:val="right"/>
+            </w:pPr>
+            <w:r>
+              <w:t xml:space="preserve">25</w:t>
+            </w:r>
+          </w:p>
+        </w:tc>
+      </w:tr>
+    </w:tbl>
+    <w:p>
+      <w:pPr>
+        <w:pStyle w:val="TableCaption"/>
+      </w:pPr>
+      <w:r>
+        <w:t xml:space="preserve">Summary of mixed effect model of hypothesis H1C, difference in speeds between DSFS upstream and adjacent to the sign.</w:t>
+      </w:r>
+    </w:p>
+    <w:tbl>
+      <w:tblPr>
+        <w:tblStyle w:val="TableNormal"/>
+        <w:tblW w:type="pct" w:w="0.0"/>
+        <w:tblLook w:firstRow="1"/>
+        <w:tblCaption w:val="Summary of mixed effect model of hypothesis H1C, difference in speeds between DSFS upstream and adjacent to the sign."/>
+      </w:tblPr>
+      <w:tblGrid/>
+      <w:tr>
+        <w:trPr>
+          <w:cnfStyle w:firstRow="1"/>
+        </w:trPr>
+        <w:tc>
+          <w:tcPr>
+            <w:tcBorders>
+              <w:bottom w:val="single"/>
+            </w:tcBorders>
+            <w:vAlign w:val="bottom"/>
+          </w:tcPr>
+          <w:p>
+            <w:pStyle w:val="Compact"/>
+          </w:p>
+        </w:tc>
+        <w:tc>
+          <w:tcPr>
+            <w:tcBorders>
+              <w:bottom w:val="single"/>
+            </w:tcBorders>
+            <w:vAlign w:val="bottom"/>
+          </w:tcPr>
+          <w:p>
+            <w:pPr>
+              <w:pStyle w:val="Compact"/>
+              <w:jc w:val="right"/>
+            </w:pPr>
+            <w:r>
+              <w:t xml:space="preserve">Estimate</w:t>
+            </w:r>
+          </w:p>
+        </w:tc>
+        <w:tc>
+          <w:tcPr>
+            <w:tcBorders>
+              <w:bottom w:val="single"/>
+            </w:tcBorders>
+            <w:vAlign w:val="bottom"/>
+          </w:tcPr>
+          <w:p>
+            <w:pPr>
+              <w:pStyle w:val="Compact"/>
+              <w:jc w:val="right"/>
+            </w:pPr>
+            <w:r>
+              <w:t xml:space="preserve">Std. Error</w:t>
+            </w:r>
+          </w:p>
+        </w:tc>
+        <w:tc>
+          <w:tcPr>
+            <w:tcBorders>
+              <w:bottom w:val="single"/>
+            </w:tcBorders>
+            <w:vAlign w:val="bottom"/>
+          </w:tcPr>
+          <w:p>
+            <w:pPr>
+              <w:pStyle w:val="Compact"/>
+              <w:jc w:val="right"/>
+            </w:pPr>
+            <w:r>
+              <w:t xml:space="preserve">t value</w:t>
+            </w:r>
+          </w:p>
+        </w:tc>
+      </w:tr>
+      <w:tr>
+        <w:tc>
+          <w:p>
+            <w:pPr>
+              <w:pStyle w:val="Compact"/>
+              <w:jc w:val="left"/>
+            </w:pPr>
+            <w:r>
+              <w:t xml:space="preserve">(Intercept)</w:t>
+            </w:r>
+          </w:p>
+        </w:tc>
+        <w:tc>
+          <w:p>
+            <w:pPr>
+              <w:pStyle w:val="Compact"/>
+              <w:jc w:val="right"/>
+            </w:pPr>
+            <w:r>
+              <w:t xml:space="preserve">-8.615</w:t>
+            </w:r>
+          </w:p>
+        </w:tc>
+        <w:tc>
+          <w:p>
+            <w:pPr>
+              <w:pStyle w:val="Compact"/>
+              <w:jc w:val="right"/>
+            </w:pPr>
+            <w:r>
+              <w:t xml:space="preserve">3.254</w:t>
+            </w:r>
+          </w:p>
+        </w:tc>
+        <w:tc>
+          <w:p>
+            <w:pPr>
+              <w:pStyle w:val="Compact"/>
+              <w:jc w:val="right"/>
+            </w:pPr>
+            <w:r>
+              <w:t xml:space="preserve">-2.647</w:t>
+            </w:r>
+          </w:p>
+        </w:tc>
+      </w:tr>
+    </w:tbl>
+    <w:p>
+      <w:pPr>
+        <w:pStyle w:val="BodyText"/>
+      </w:pPr>
       <w:r>
         <w:drawing>
           <wp:inline>
             <wp:extent cx="3696101" cy="2772075"/>
             <wp:effectExtent b="0" l="0" r="0" t="0"/>
-            <wp:docPr descr="Plot of effect sizes for hypothesis H1B, effect of DSFS adjacent to sign site." id="1" name="Picture"/>
+            <wp:docPr descr="" id="1" name="Picture"/>
             <a:graphic>
               <a:graphicData uri="http://schemas.openxmlformats.org/drawingml/2006/picture">
                 <pic:pic>
                   <pic:nvPicPr>
-                    <pic:cNvPr descr="MA_Report_files/figure-docx/unnamed-chunk-5-2.png" id="0" name="Picture"/>
-                    <pic:cNvPicPr>
-                      <a:picLocks noChangeArrowheads="1" noChangeAspect="1"/>
-                    </pic:cNvPicPr>
-                  </pic:nvPicPr>
-                  <pic:blipFill>
-                    <a:blip r:embed="rId33"/>
-                    <a:stretch>
-                      <a:fillRect/>
-                    </a:stretch>
-                  </pic:blipFill>
-                  <pic:spPr bwMode="auto">
-                    <a:xfrm>
-                      <a:off x="0" y="0"/>
-                      <a:ext cx="3696101" cy="2772075"/>
-                    </a:xfrm>
-                    <a:prstGeom prst="rect">
-                      <a:avLst/>
-                    </a:prstGeom>
-                    <a:noFill/>
-                    <a:ln w="9525">
-                      <a:noFill/>
-                      <a:headEnd/>
-                      <a:tailEnd/>
-                    </a:ln>
-                  </pic:spPr>
-                </pic:pic>
-              </a:graphicData>
-            </a:graphic>
-          </wp:inline>
-        </w:drawing>
-      </w:r>
-      <w:r>
-        <w:drawing>
-          <wp:inline>
-            <wp:extent cx="3696101" cy="2772075"/>
-            <wp:effectExtent b="0" l="0" r="0" t="0"/>
-            <wp:docPr descr="Plot of effect sizes for hypothesis H1B, effect of DSFS adjacent to sign site." id="1" name="Picture"/>
-            <a:graphic>
-              <a:graphicData uri="http://schemas.openxmlformats.org/drawingml/2006/picture">
-                <pic:pic>
-                  <pic:nvPicPr>
-                    <pic:cNvPr descr="MA_Report_files/figure-docx/unnamed-chunk-5-3.png" id="0" name="Picture"/>
+                    <pic:cNvPr descr="MA_Report_files/figure-docx/unnamed-chunk-7-1.png" id="0" name="Picture"/>
                     <pic:cNvPicPr>
                       <a:picLocks noChangeArrowheads="1" noChangeAspect="1"/>
                     </pic:cNvPicPr>
@@ -4927,524 +4882,6 @@
           </wp:inline>
         </w:drawing>
       </w:r>
-      <w:r>
-        <w:drawing>
-          <wp:inline>
-            <wp:extent cx="3696101" cy="2772075"/>
-            <wp:effectExtent b="0" l="0" r="0" t="0"/>
-            <wp:docPr descr="Plot of effect sizes for hypothesis H1B, effect of DSFS adjacent to sign site." id="1" name="Picture"/>
-            <a:graphic>
-              <a:graphicData uri="http://schemas.openxmlformats.org/drawingml/2006/picture">
-                <pic:pic>
-                  <pic:nvPicPr>
-                    <pic:cNvPr descr="MA_Report_files/figure-docx/unnamed-chunk-5-4.png" id="0" name="Picture"/>
-                    <pic:cNvPicPr>
-                      <a:picLocks noChangeArrowheads="1" noChangeAspect="1"/>
-                    </pic:cNvPicPr>
-                  </pic:nvPicPr>
-                  <pic:blipFill>
-                    <a:blip r:embed="rId35"/>
-                    <a:stretch>
-                      <a:fillRect/>
-                    </a:stretch>
-                  </pic:blipFill>
-                  <pic:spPr bwMode="auto">
-                    <a:xfrm>
-                      <a:off x="0" y="0"/>
-                      <a:ext cx="3696101" cy="2772075"/>
-                    </a:xfrm>
-                    <a:prstGeom prst="rect">
-                      <a:avLst/>
-                    </a:prstGeom>
-                    <a:noFill/>
-                    <a:ln w="9525">
-                      <a:noFill/>
-                      <a:headEnd/>
-                      <a:tailEnd/>
-                    </a:ln>
-                  </pic:spPr>
-                </pic:pic>
-              </a:graphicData>
-            </a:graphic>
-          </wp:inline>
-        </w:drawing>
-      </w:r>
-      <w:r>
-        <w:drawing>
-          <wp:inline>
-            <wp:extent cx="3696101" cy="2772075"/>
-            <wp:effectExtent b="0" l="0" r="0" t="0"/>
-            <wp:docPr descr="Plot of effect sizes for hypothesis H1B, effect of DSFS adjacent to sign site." id="1" name="Picture"/>
-            <a:graphic>
-              <a:graphicData uri="http://schemas.openxmlformats.org/drawingml/2006/picture">
-                <pic:pic>
-                  <pic:nvPicPr>
-                    <pic:cNvPr descr="MA_Report_files/figure-docx/unnamed-chunk-5-5.png" id="0" name="Picture"/>
-                    <pic:cNvPicPr>
-                      <a:picLocks noChangeArrowheads="1" noChangeAspect="1"/>
-                    </pic:cNvPicPr>
-                  </pic:nvPicPr>
-                  <pic:blipFill>
-                    <a:blip r:embed="rId36"/>
-                    <a:stretch>
-                      <a:fillRect/>
-                    </a:stretch>
-                  </pic:blipFill>
-                  <pic:spPr bwMode="auto">
-                    <a:xfrm>
-                      <a:off x="0" y="0"/>
-                      <a:ext cx="3696101" cy="2772075"/>
-                    </a:xfrm>
-                    <a:prstGeom prst="rect">
-                      <a:avLst/>
-                    </a:prstGeom>
-                    <a:noFill/>
-                    <a:ln w="9525">
-                      <a:noFill/>
-                      <a:headEnd/>
-                      <a:tailEnd/>
-                    </a:ln>
-                  </pic:spPr>
-                </pic:pic>
-              </a:graphicData>
-            </a:graphic>
-          </wp:inline>
-        </w:drawing>
-      </w:r>
-    </w:p>
-    <w:p>
-      <w:pPr>
-        <w:pStyle w:val="Heading2"/>
-      </w:pPr>
-      <w:bookmarkStart w:id="37" w:name="h1c"/>
-      <w:bookmarkEnd w:id="37"/>
-      <w:r>
-        <w:t xml:space="preserve">H1C</w:t>
-      </w:r>
-    </w:p>
-    <w:p>
-      <w:pPr>
-        <w:pStyle w:val="FirstParagraph"/>
-      </w:pPr>
-      <w:r>
-        <w:t xml:space="preserve">The difference between speeds upstream and adjacent to DSFS were surprisingly large, with large decreases in speed detected in several studies which did not differentiate by vehicle type (Hallmark et al. 2007, Reddy et al. 2008, and Roberts et al. 2012). The mean upstream-adjacent effect size for DSFS activation across all studies was -2.73 mph.</w:t>
-      </w:r>
-    </w:p>
-    <w:p>
-      <w:pPr>
-        <w:pStyle w:val="TableCaption"/>
-      </w:pPr>
-      <w:r>
-        <w:t xml:space="preserve">Decreases in speed for Hypothesis H1C, activation effect of DSFS downstream, by vehicle type.</w:t>
-      </w:r>
-    </w:p>
-    <w:tbl>
-      <w:tblPr>
-        <w:tblStyle w:val="TableNormal"/>
-        <w:tblW w:type="pct" w:w="0.0"/>
-        <w:tblLook w:firstRow="1"/>
-        <w:tblCaption w:val="Decreases in speed for Hypothesis H1C, activation effect of DSFS downstream, by vehicle type."/>
-      </w:tblPr>
-      <w:tblGrid/>
-      <w:tr>
-        <w:trPr>
-          <w:cnfStyle w:firstRow="1"/>
-        </w:trPr>
-        <w:tc>
-          <w:tcPr>
-            <w:tcBorders>
-              <w:bottom w:val="single"/>
-            </w:tcBorders>
-            <w:vAlign w:val="bottom"/>
-          </w:tcPr>
-          <w:p>
-            <w:pPr>
-              <w:pStyle w:val="Compact"/>
-              <w:jc w:val="left"/>
-            </w:pPr>
-            <w:r>
-              <w:t xml:space="preserve">Vehicle Type</w:t>
-            </w:r>
-          </w:p>
-        </w:tc>
-        <w:tc>
-          <w:tcPr>
-            <w:tcBorders>
-              <w:bottom w:val="single"/>
-            </w:tcBorders>
-            <w:vAlign w:val="bottom"/>
-          </w:tcPr>
-          <w:p>
-            <w:pPr>
-              <w:pStyle w:val="Compact"/>
-              <w:jc w:val="right"/>
-            </w:pPr>
-            <w:r>
-              <w:t xml:space="preserve">Effect size yi</w:t>
-            </w:r>
-          </w:p>
-        </w:tc>
-        <w:tc>
-          <w:tcPr>
-            <w:tcBorders>
-              <w:bottom w:val="single"/>
-            </w:tcBorders>
-            <w:vAlign w:val="bottom"/>
-          </w:tcPr>
-          <w:p>
-            <w:pPr>
-              <w:pStyle w:val="Compact"/>
-              <w:jc w:val="right"/>
-            </w:pPr>
-            <w:r>
-              <w:t xml:space="preserve">Variance vi</w:t>
-            </w:r>
-          </w:p>
-        </w:tc>
-        <w:tc>
-          <w:tcPr>
-            <w:tcBorders>
-              <w:bottom w:val="single"/>
-            </w:tcBorders>
-            <w:vAlign w:val="bottom"/>
-          </w:tcPr>
-          <w:p>
-            <w:pPr>
-              <w:pStyle w:val="Compact"/>
-              <w:jc w:val="right"/>
-            </w:pPr>
-            <w:r>
-              <w:t xml:space="preserve">N</w:t>
-            </w:r>
-          </w:p>
-        </w:tc>
-      </w:tr>
-      <w:tr>
-        <w:tc>
-          <w:p>
-            <w:pPr>
-              <w:pStyle w:val="Compact"/>
-              <w:jc w:val="left"/>
-            </w:pPr>
-            <w:r>
-              <w:t xml:space="preserve">Unspecified</w:t>
-            </w:r>
-          </w:p>
-        </w:tc>
-        <w:tc>
-          <w:p>
-            <w:pPr>
-              <w:pStyle w:val="Compact"/>
-              <w:jc w:val="right"/>
-            </w:pPr>
-            <w:r>
-              <w:t xml:space="preserve">-11.128</w:t>
-            </w:r>
-          </w:p>
-        </w:tc>
-        <w:tc>
-          <w:p>
-            <w:pPr>
-              <w:pStyle w:val="Compact"/>
-              <w:jc w:val="right"/>
-            </w:pPr>
-            <w:r>
-              <w:t xml:space="preserve">0.070</w:t>
-            </w:r>
-          </w:p>
-        </w:tc>
-        <w:tc>
-          <w:p>
-            <w:pPr>
-              <w:pStyle w:val="Compact"/>
-              <w:jc w:val="right"/>
-            </w:pPr>
-            <w:r>
-              <w:t xml:space="preserve">31</w:t>
-            </w:r>
-          </w:p>
-        </w:tc>
-      </w:tr>
-      <w:tr>
-        <w:tc>
-          <w:p>
-            <w:pPr>
-              <w:pStyle w:val="Compact"/>
-              <w:jc w:val="left"/>
-            </w:pPr>
-            <w:r>
-              <w:t xml:space="preserve">Passenger</w:t>
-            </w:r>
-          </w:p>
-        </w:tc>
-        <w:tc>
-          <w:p>
-            <w:pPr>
-              <w:pStyle w:val="Compact"/>
-              <w:jc w:val="right"/>
-            </w:pPr>
-            <w:r>
-              <w:t xml:space="preserve">-1.704</w:t>
-            </w:r>
-          </w:p>
-        </w:tc>
-        <w:tc>
-          <w:p>
-            <w:pPr>
-              <w:pStyle w:val="Compact"/>
-              <w:jc w:val="right"/>
-            </w:pPr>
-            <w:r>
-              <w:t xml:space="preserve">1.585</w:t>
-            </w:r>
-          </w:p>
-        </w:tc>
-        <w:tc>
-          <w:p>
-            <w:pPr>
-              <w:pStyle w:val="Compact"/>
-              <w:jc w:val="right"/>
-            </w:pPr>
-            <w:r>
-              <w:t xml:space="preserve">16</w:t>
-            </w:r>
-          </w:p>
-        </w:tc>
-      </w:tr>
-      <w:tr>
-        <w:tc>
-          <w:p>
-            <w:pPr>
-              <w:pStyle w:val="Compact"/>
-              <w:jc w:val="left"/>
-            </w:pPr>
-            <w:r>
-              <w:t xml:space="preserve">Truck</w:t>
-            </w:r>
-          </w:p>
-        </w:tc>
-        <w:tc>
-          <w:p>
-            <w:pPr>
-              <w:pStyle w:val="Compact"/>
-              <w:jc w:val="right"/>
-            </w:pPr>
-            <w:r>
-              <w:t xml:space="preserve">-1.424</w:t>
-            </w:r>
-          </w:p>
-        </w:tc>
-        <w:tc>
-          <w:p>
-            <w:pPr>
-              <w:pStyle w:val="Compact"/>
-              <w:jc w:val="right"/>
-            </w:pPr>
-            <w:r>
-              <w:t xml:space="preserve">2.920</w:t>
-            </w:r>
-          </w:p>
-        </w:tc>
-        <w:tc>
-          <w:p>
-            <w:pPr>
-              <w:pStyle w:val="Compact"/>
-              <w:jc w:val="right"/>
-            </w:pPr>
-            <w:r>
-              <w:t xml:space="preserve">25</w:t>
-            </w:r>
-          </w:p>
-        </w:tc>
-      </w:tr>
-    </w:tbl>
-    <w:p>
-      <w:pPr>
-        <w:pStyle w:val="TableCaption"/>
-      </w:pPr>
-      <w:r>
-        <w:t xml:space="preserve">Summary of mixed effect model of hypothesis H1C, difference in speeds between DSFS upstream and adjacent to the sign.</w:t>
-      </w:r>
-    </w:p>
-    <w:tbl>
-      <w:tblPr>
-        <w:tblStyle w:val="TableNormal"/>
-        <w:tblW w:type="pct" w:w="0.0"/>
-        <w:tblLook w:firstRow="1"/>
-        <w:tblCaption w:val="Summary of mixed effect model of hypothesis H1C, difference in speeds between DSFS upstream and adjacent to the sign."/>
-      </w:tblPr>
-      <w:tblGrid/>
-      <w:tr>
-        <w:trPr>
-          <w:cnfStyle w:firstRow="1"/>
-        </w:trPr>
-        <w:tc>
-          <w:tcPr>
-            <w:tcBorders>
-              <w:bottom w:val="single"/>
-            </w:tcBorders>
-            <w:vAlign w:val="bottom"/>
-          </w:tcPr>
-          <w:p>
-            <w:pStyle w:val="Compact"/>
-          </w:p>
-        </w:tc>
-        <w:tc>
-          <w:tcPr>
-            <w:tcBorders>
-              <w:bottom w:val="single"/>
-            </w:tcBorders>
-            <w:vAlign w:val="bottom"/>
-          </w:tcPr>
-          <w:p>
-            <w:pPr>
-              <w:pStyle w:val="Compact"/>
-              <w:jc w:val="right"/>
-            </w:pPr>
-            <w:r>
-              <w:t xml:space="preserve">Estimate</w:t>
-            </w:r>
-          </w:p>
-        </w:tc>
-        <w:tc>
-          <w:tcPr>
-            <w:tcBorders>
-              <w:bottom w:val="single"/>
-            </w:tcBorders>
-            <w:vAlign w:val="bottom"/>
-          </w:tcPr>
-          <w:p>
-            <w:pPr>
-              <w:pStyle w:val="Compact"/>
-              <w:jc w:val="right"/>
-            </w:pPr>
-            <w:r>
-              <w:t xml:space="preserve">Std. Error</w:t>
-            </w:r>
-          </w:p>
-        </w:tc>
-        <w:tc>
-          <w:tcPr>
-            <w:tcBorders>
-              <w:bottom w:val="single"/>
-            </w:tcBorders>
-            <w:vAlign w:val="bottom"/>
-          </w:tcPr>
-          <w:p>
-            <w:pPr>
-              <w:pStyle w:val="Compact"/>
-              <w:jc w:val="right"/>
-            </w:pPr>
-            <w:r>
-              <w:t xml:space="preserve">t value</w:t>
-            </w:r>
-          </w:p>
-        </w:tc>
-      </w:tr>
-      <w:tr>
-        <w:tc>
-          <w:p>
-            <w:pPr>
-              <w:pStyle w:val="Compact"/>
-              <w:jc w:val="left"/>
-            </w:pPr>
-            <w:r>
-              <w:t xml:space="preserve">(Intercept)</w:t>
-            </w:r>
-          </w:p>
-        </w:tc>
-        <w:tc>
-          <w:p>
-            <w:pPr>
-              <w:pStyle w:val="Compact"/>
-              <w:jc w:val="right"/>
-            </w:pPr>
-            <w:r>
-              <w:t xml:space="preserve">-8.615</w:t>
-            </w:r>
-          </w:p>
-        </w:tc>
-        <w:tc>
-          <w:p>
-            <w:pPr>
-              <w:pStyle w:val="Compact"/>
-              <w:jc w:val="right"/>
-            </w:pPr>
-            <w:r>
-              <w:t xml:space="preserve">3.254</w:t>
-            </w:r>
-          </w:p>
-        </w:tc>
-        <w:tc>
-          <w:p>
-            <w:pPr>
-              <w:pStyle w:val="Compact"/>
-              <w:jc w:val="right"/>
-            </w:pPr>
-            <w:r>
-              <w:t xml:space="preserve">-2.647</w:t>
-            </w:r>
-          </w:p>
-        </w:tc>
-      </w:tr>
-    </w:tbl>
-    <w:p>
-      <w:pPr>
-        <w:pStyle w:val="SourceCode"/>
-      </w:pPr>
-      <w:r>
-        <w:rPr>
-          <w:rStyle w:val="VerbatimChar"/>
-        </w:rPr>
-        <w:t xml:space="preserve">## Computing p-values via Kenward-Roger approximation. Use `p.kr = FALSE` if computation takes too long.</w:t>
-      </w:r>
-    </w:p>
-    <w:p>
-      <w:pPr>
-        <w:pStyle w:val="FirstParagraph"/>
-      </w:pPr>
-      <w:r>
-        <w:drawing>
-          <wp:inline>
-            <wp:extent cx="3696101" cy="2772075"/>
-            <wp:effectExtent b="0" l="0" r="0" t="0"/>
-            <wp:docPr descr="" id="1" name="Picture"/>
-            <a:graphic>
-              <a:graphicData uri="http://schemas.openxmlformats.org/drawingml/2006/picture">
-                <pic:pic>
-                  <pic:nvPicPr>
-                    <pic:cNvPr descr="MA_Report_files/figure-docx/unnamed-chunk-7-1.png" id="0" name="Picture"/>
-                    <pic:cNvPicPr>
-                      <a:picLocks noChangeArrowheads="1" noChangeAspect="1"/>
-                    </pic:cNvPicPr>
-                  </pic:nvPicPr>
-                  <pic:blipFill>
-                    <a:blip r:embed="rId38"/>
-                    <a:stretch>
-                      <a:fillRect/>
-                    </a:stretch>
-                  </pic:blipFill>
-                  <pic:spPr bwMode="auto">
-                    <a:xfrm>
-                      <a:off x="0" y="0"/>
-                      <a:ext cx="3696101" cy="2772075"/>
-                    </a:xfrm>
-                    <a:prstGeom prst="rect">
-                      <a:avLst/>
-                    </a:prstGeom>
-                    <a:noFill/>
-                    <a:ln w="9525">
-                      <a:noFill/>
-                      <a:headEnd/>
-                      <a:tailEnd/>
-                    </a:ln>
-                  </pic:spPr>
-                </pic:pic>
-              </a:graphicData>
-            </a:graphic>
-          </wp:inline>
-        </w:drawing>
-      </w:r>
     </w:p>
     <w:sectPr>
       <w:pgSz w:w="12240" w:h="15840"/>
@@ -6210,7 +5647,7 @@
     </w:lvl>
   </w:abstractNum>
   <w:abstractNum w:abstractNumId="990">
-    <w:nsid w:val="31abe380"/>
+    <w:nsid w:val="b46263c1"/>
     <w:multiLevelType w:val="multilevel"/>
     <w:lvl w:ilvl="0">
       <w:numFmt w:val="bullet"/>
@@ -6291,7 +5728,7 @@
     </w:lvl>
   </w:abstractNum>
   <w:abstractNum w:abstractNumId="99731">
-    <w:nsid w:val="cc3daf9b"/>
+    <w:nsid w:val="fdc6cbe8"/>
     <w:multiLevelType w:val="multilevel"/>
     <w:lvl w:ilvl="0">
       <w:start w:val="1"/>
@@ -6379,7 +5816,7 @@
     </w:lvl>
   </w:abstractNum>
   <w:abstractNum w:abstractNumId="99411">
-    <w:nsid w:val="cc62e4b7"/>
+    <w:nsid w:val="ee8c4de3"/>
     <w:multiLevelType w:val="multilevel"/>
     <w:lvl w:ilvl="0">
       <w:start w:val="1"/>
@@ -6467,7 +5904,7 @@
     </w:lvl>
   </w:abstractNum>
   <w:abstractNum w:abstractNumId="99711">
-    <w:nsid w:val="269ccee5"/>
+    <w:nsid w:val="848d0a1e"/>
     <w:multiLevelType w:val="multilevel"/>
     <w:lvl w:ilvl="0">
       <w:start w:val="1"/>

</xml_diff>

<commit_message>
Edited N counts, adding normal approx p-values
</commit_message>
<xml_diff>
--- a/MA_Report.docx
+++ b/MA_Report.docx
@@ -4765,7 +4765,7 @@
               <w:jc w:val="right"/>
             </w:pPr>
             <w:r>
-              <w:t xml:space="preserve">130</w:t>
+              <w:t xml:space="preserve">89</w:t>
             </w:r>
           </w:p>
         </w:tc>
@@ -4811,7 +4811,7 @@
               <w:jc w:val="right"/>
             </w:pPr>
             <w:r>
-              <w:t xml:space="preserve">97</w:t>
+              <w:t xml:space="preserve">69</w:t>
             </w:r>
           </w:p>
         </w:tc>
@@ -4857,7 +4857,7 @@
               <w:jc w:val="right"/>
             </w:pPr>
             <w:r>
-              <w:t xml:space="preserve">121</w:t>
+              <w:t xml:space="preserve">91</w:t>
             </w:r>
           </w:p>
         </w:tc>
@@ -5384,7 +5384,7 @@
               <w:jc w:val="right"/>
             </w:pPr>
             <w:r>
-              <w:t xml:space="preserve">31</w:t>
+              <w:t xml:space="preserve">6</w:t>
             </w:r>
           </w:p>
         </w:tc>
@@ -5430,7 +5430,7 @@
               <w:jc w:val="right"/>
             </w:pPr>
             <w:r>
-              <w:t xml:space="preserve">16</w:t>
+              <w:t xml:space="preserve">21</w:t>
             </w:r>
           </w:p>
         </w:tc>
@@ -5476,7 +5476,7 @@
               <w:jc w:val="right"/>
             </w:pPr>
             <w:r>
-              <w:t xml:space="preserve">25</w:t>
+              <w:t xml:space="preserve">22</w:t>
             </w:r>
           </w:p>
         </w:tc>
@@ -6552,7 +6552,7 @@
               <w:jc w:val="right"/>
             </w:pPr>
             <w:r>
-              <w:t xml:space="preserve">72</w:t>
+              <w:t xml:space="preserve">66</w:t>
             </w:r>
           </w:p>
         </w:tc>
@@ -6598,7 +6598,7 @@
               <w:jc w:val="right"/>
             </w:pPr>
             <w:r>
-              <w:t xml:space="preserve">74</w:t>
+              <w:t xml:space="preserve">68</w:t>
             </w:r>
           </w:p>
         </w:tc>
@@ -8336,29 +8336,29 @@
               <w:jc w:val="right"/>
             </w:pPr>
             <w:r>
-              <w:t xml:space="preserve">-0.335</w:t>
-            </w:r>
-          </w:p>
-        </w:tc>
-        <w:tc>
-          <w:p>
-            <w:pPr>
-              <w:pStyle w:val="Compact"/>
-              <w:jc w:val="right"/>
-            </w:pPr>
-            <w:r>
-              <w:t xml:space="preserve">0.084</w:t>
-            </w:r>
-          </w:p>
-        </w:tc>
-        <w:tc>
-          <w:p>
-            <w:pPr>
-              <w:pStyle w:val="Compact"/>
-              <w:jc w:val="right"/>
-            </w:pPr>
-            <w:r>
-              <w:t xml:space="preserve">210</w:t>
+              <w:t xml:space="preserve">-0.006</w:t>
+            </w:r>
+          </w:p>
+        </w:tc>
+        <w:tc>
+          <w:p>
+            <w:pPr>
+              <w:pStyle w:val="Compact"/>
+              <w:jc w:val="right"/>
+            </w:pPr>
+            <w:r>
+              <w:t xml:space="preserve">0.050</w:t>
+            </w:r>
+          </w:p>
+        </w:tc>
+        <w:tc>
+          <w:p>
+            <w:pPr>
+              <w:pStyle w:val="Compact"/>
+              <w:jc w:val="right"/>
+            </w:pPr>
+            <w:r>
+              <w:t xml:space="preserve">16</w:t>
             </w:r>
           </w:p>
         </w:tc>
@@ -8382,29 +8382,29 @@
               <w:jc w:val="right"/>
             </w:pPr>
             <w:r>
-              <w:t xml:space="preserve">-1.826</w:t>
-            </w:r>
-          </w:p>
-        </w:tc>
-        <w:tc>
-          <w:p>
-            <w:pPr>
-              <w:pStyle w:val="Compact"/>
-              <w:jc w:val="right"/>
-            </w:pPr>
-            <w:r>
-              <w:t xml:space="preserve">0.245</w:t>
-            </w:r>
-          </w:p>
-        </w:tc>
-        <w:tc>
-          <w:p>
-            <w:pPr>
-              <w:pStyle w:val="Compact"/>
-              <w:jc w:val="right"/>
-            </w:pPr>
-            <w:r>
-              <w:t xml:space="preserve">228</w:t>
+              <w:t xml:space="preserve">-1.100</w:t>
+            </w:r>
+          </w:p>
+        </w:tc>
+        <w:tc>
+          <w:p>
+            <w:pPr>
+              <w:pStyle w:val="Compact"/>
+              <w:jc w:val="right"/>
+            </w:pPr>
+            <w:r>
+              <w:t xml:space="preserve">0.082</w:t>
+            </w:r>
+          </w:p>
+        </w:tc>
+        <w:tc>
+          <w:p>
+            <w:pPr>
+              <w:pStyle w:val="Compact"/>
+              <w:jc w:val="right"/>
+            </w:pPr>
+            <w:r>
+              <w:t xml:space="preserve">2</w:t>
             </w:r>
           </w:p>
         </w:tc>
@@ -8428,29 +8428,29 @@
               <w:jc w:val="right"/>
             </w:pPr>
             <w:r>
-              <w:t xml:space="preserve">-1.750</w:t>
-            </w:r>
-          </w:p>
-        </w:tc>
-        <w:tc>
-          <w:p>
-            <w:pPr>
-              <w:pStyle w:val="Compact"/>
-              <w:jc w:val="right"/>
-            </w:pPr>
-            <w:r>
-              <w:t xml:space="preserve">0.596</w:t>
-            </w:r>
-          </w:p>
-        </w:tc>
-        <w:tc>
-          <w:p>
-            <w:pPr>
-              <w:pStyle w:val="Compact"/>
-              <w:jc w:val="right"/>
-            </w:pPr>
-            <w:r>
-              <w:t xml:space="preserve">287</w:t>
+              <w:t xml:space="preserve">-5.700</w:t>
+            </w:r>
+          </w:p>
+        </w:tc>
+        <w:tc>
+          <w:p>
+            <w:pPr>
+              <w:pStyle w:val="Compact"/>
+              <w:jc w:val="right"/>
+            </w:pPr>
+            <w:r>
+              <w:t xml:space="preserve">2.262</w:t>
+            </w:r>
+          </w:p>
+        </w:tc>
+        <w:tc>
+          <w:p>
+            <w:pPr>
+              <w:pStyle w:val="Compact"/>
+              <w:jc w:val="right"/>
+            </w:pPr>
+            <w:r>
+              <w:t xml:space="preserve">2</w:t>
             </w:r>
           </w:p>
         </w:tc>
@@ -8558,42 +8558,42 @@
               <w:jc w:val="left"/>
             </w:pPr>
             <w:r>
-              <w:t xml:space="preserve">-1.382</w:t>
-            </w:r>
-          </w:p>
-        </w:tc>
-        <w:tc>
-          <w:p>
-            <w:pPr>
-              <w:pStyle w:val="Compact"/>
-              <w:jc w:val="left"/>
-            </w:pPr>
-            <w:r>
-              <w:t xml:space="preserve">0.801</w:t>
-            </w:r>
-          </w:p>
-        </w:tc>
-        <w:tc>
-          <w:p>
-            <w:pPr>
-              <w:pStyle w:val="Compact"/>
-              <w:jc w:val="left"/>
-            </w:pPr>
-            <w:r>
-              <w:t xml:space="preserve">-1.725</w:t>
-            </w:r>
-          </w:p>
-        </w:tc>
-      </w:tr>
-      <w:tr>
-        <w:tc>
-          <w:p>
-            <w:pPr>
-              <w:pStyle w:val="Compact"/>
-              <w:jc w:val="left"/>
-            </w:pPr>
-            <w:r>
-              <w:t xml:space="preserve">Safety Focuse Effects:</w:t>
+              <w:t xml:space="preserve">-2.077</w:t>
+            </w:r>
+          </w:p>
+        </w:tc>
+        <w:tc>
+          <w:p>
+            <w:pPr>
+              <w:pStyle w:val="Compact"/>
+              <w:jc w:val="left"/>
+            </w:pPr>
+            <w:r>
+              <w:t xml:space="preserve">1.895</w:t>
+            </w:r>
+          </w:p>
+        </w:tc>
+        <w:tc>
+          <w:p>
+            <w:pPr>
+              <w:pStyle w:val="Compact"/>
+              <w:jc w:val="left"/>
+            </w:pPr>
+            <w:r>
+              <w:t xml:space="preserve">-1.096</w:t>
+            </w:r>
+          </w:p>
+        </w:tc>
+      </w:tr>
+      <w:tr>
+        <w:tc>
+          <w:p>
+            <w:pPr>
+              <w:pStyle w:val="Compact"/>
+              <w:jc w:val="left"/>
+            </w:pPr>
+            <w:r>
+              <w:t xml:space="preserve">Safety Focus Effects:</w:t>
             </w:r>
           </w:p>
         </w:tc>
@@ -8626,7 +8626,7 @@
               <w:jc w:val="left"/>
             </w:pPr>
             <w:r>
-              <w:t xml:space="preserve">-0.08</w:t>
+              <w:t xml:space="preserve">-1.89</w:t>
             </w:r>
           </w:p>
         </w:tc>
@@ -8660,7 +8660,7 @@
               <w:jc w:val="left"/>
             </w:pPr>
             <w:r>
-              <w:t xml:space="preserve">-2.52</w:t>
+              <w:t xml:space="preserve">-2.12</w:t>
             </w:r>
           </w:p>
         </w:tc>
@@ -8694,7 +8694,7 @@
               <w:jc w:val="left"/>
             </w:pPr>
             <w:r>
-              <w:t xml:space="preserve">-1.08</w:t>
+              <w:t xml:space="preserve">-2.12</w:t>
             </w:r>
           </w:p>
         </w:tc>
@@ -8728,7 +8728,7 @@
               <w:jc w:val="left"/>
             </w:pPr>
             <w:r>
-              <w:t xml:space="preserve">-1.84</w:t>
+              <w:t xml:space="preserve">-2.18</w:t>
             </w:r>
           </w:p>
         </w:tc>
@@ -8744,6 +8744,116 @@
         </w:tc>
       </w:tr>
     </w:tbl>
+    <w:p>
+      <w:pPr>
+        <w:pStyle w:val="SourceCode"/>
+      </w:pPr>
+      <w:r>
+        <w:rPr>
+          <w:rStyle w:val="VerbatimChar"/>
+        </w:rPr>
+        <w:t xml:space="preserve">##     addison13    bellevue09   benekohal10     bertini06       bowie03 </w:t>
+      </w:r>
+      <w:r>
+        <w:br w:type="textWrapping"/>
+      </w:r>
+      <w:r>
+        <w:rPr>
+          <w:rStyle w:val="VerbatimChar"/>
+        </w:rPr>
+        <w:t xml:space="preserve">##            NA            NA            NA            NA            NA </w:t>
+      </w:r>
+      <w:r>
+        <w:br w:type="textWrapping"/>
+      </w:r>
+      <w:r>
+        <w:rPr>
+          <w:rStyle w:val="VerbatimChar"/>
+        </w:rPr>
+        <w:t xml:space="preserve">##       chang04     cruzado09 drakopoulos03   englewood16    fontaine01 </w:t>
+      </w:r>
+      <w:r>
+        <w:br w:type="textWrapping"/>
+      </w:r>
+      <w:r>
+        <w:rPr>
+          <w:rStyle w:val="VerbatimChar"/>
+        </w:rPr>
+        <w:t xml:space="preserve">##            NA            36            NA            NA            NA </w:t>
+      </w:r>
+      <w:r>
+        <w:br w:type="textWrapping"/>
+      </w:r>
+      <w:r>
+        <w:rPr>
+          <w:rStyle w:val="VerbatimChar"/>
+        </w:rPr>
+        <w:t xml:space="preserve">##   gambatese14   gambatese15   hajbabaie11    hallmark07     jeihani12 </w:t>
+      </w:r>
+      <w:r>
+        <w:br w:type="textWrapping"/>
+      </w:r>
+      <w:r>
+        <w:rPr>
+          <w:rStyle w:val="VerbatimChar"/>
+        </w:rPr>
+        <w:t xml:space="preserve">##            NA            NA            NA             6            NA </w:t>
+      </w:r>
+      <w:r>
+        <w:br w:type="textWrapping"/>
+      </w:r>
+      <w:r>
+        <w:rPr>
+          <w:rStyle w:val="VerbatimChar"/>
+        </w:rPr>
+        <w:t xml:space="preserve">##      kamyab02       knapp12       mccoy01       mccoy95      medina09 </w:t>
+      </w:r>
+      <w:r>
+        <w:br w:type="textWrapping"/>
+      </w:r>
+      <w:r>
+        <w:rPr>
+          <w:rStyle w:val="VerbatimChar"/>
+        </w:rPr>
+        <w:t xml:space="preserve">##             4            NA            NA            NA            NA </w:t>
+      </w:r>
+      <w:r>
+        <w:br w:type="textWrapping"/>
+      </w:r>
+      <w:r>
+        <w:rPr>
+          <w:rStyle w:val="VerbatimChar"/>
+        </w:rPr>
+        <w:t xml:space="preserve">##       meyer00      obrien12       pesti11       reddy08     roberts12 </w:t>
+      </w:r>
+      <w:r>
+        <w:br w:type="textWrapping"/>
+      </w:r>
+      <w:r>
+        <w:rPr>
+          <w:rStyle w:val="VerbatimChar"/>
+        </w:rPr>
+        <w:t xml:space="preserve">##            NA            NA            30            NA             6 </w:t>
+      </w:r>
+      <w:r>
+        <w:br w:type="textWrapping"/>
+      </w:r>
+      <w:r>
+        <w:rPr>
+          <w:rStyle w:val="VerbatimChar"/>
+        </w:rPr>
+        <w:t xml:space="preserve">##       saito05 schoenecker12    tribbett00      ullman05   westernwy03 </w:t>
+      </w:r>
+      <w:r>
+        <w:br w:type="textWrapping"/>
+      </w:r>
+      <w:r>
+        <w:rPr>
+          <w:rStyle w:val="VerbatimChar"/>
+        </w:rPr>
+        <w:t xml:space="preserve">##            NA            NA            NA            NA            NA</w:t>
+      </w:r>
+    </w:p>
     <w:p>
       <w:pPr>
         <w:pStyle w:val="Heading3"/>
@@ -10612,7 +10722,7 @@
     </w:lvl>
   </w:abstractNum>
   <w:abstractNum w:abstractNumId="990">
-    <w:nsid w:val="c0327628"/>
+    <w:nsid w:val="7a39f807"/>
     <w:multiLevelType w:val="multilevel"/>
     <w:lvl w:ilvl="0">
       <w:numFmt w:val="bullet"/>
@@ -10693,7 +10803,7 @@
     </w:lvl>
   </w:abstractNum>
   <w:abstractNum w:abstractNumId="99731">
-    <w:nsid w:val="9bb035a2"/>
+    <w:nsid w:val="2e12de5b"/>
     <w:multiLevelType w:val="multilevel"/>
     <w:lvl w:ilvl="0">
       <w:start w:val="1"/>
@@ -10781,7 +10891,7 @@
     </w:lvl>
   </w:abstractNum>
   <w:abstractNum w:abstractNumId="99411">
-    <w:nsid w:val="618c4056"/>
+    <w:nsid w:val="e5b732b9"/>
     <w:multiLevelType w:val="multilevel"/>
     <w:lvl w:ilvl="0">
       <w:start w:val="1"/>
@@ -10869,7 +10979,7 @@
     </w:lvl>
   </w:abstractNum>
   <w:abstractNum w:abstractNumId="99811">
-    <w:nsid w:val="3ebd2ff7"/>
+    <w:nsid w:val="6748aa5e"/>
     <w:multiLevelType w:val="multilevel"/>
     <w:lvl w:ilvl="0">
       <w:start w:val="1"/>

</xml_diff>